<commit_message>
Matching formats across all tabes
</commit_message>
<xml_diff>
--- a/Output/Table 5 Regression Models.docx
+++ b/Output/Table 5 Regression Models.docx
@@ -72,19 +72,19 @@
               <w:rPr>
                 <w:rFonts w:ascii="Helvetica" w:hAnsi="Helvetica" w:eastAsia="Helvetica" w:cs="Helvetica"/>
                 <w:i w:val="false"/>
-                <w:b w:val="false"/>
-                <w:u w:val="none"/>
-                <w:strike w:val="false"/>
-                <w:sz w:val="22"/>
-                <w:szCs w:val="22"/>
-                <w:color w:val="000000"/>
-              </w:rPr>
-            </w:pPr>
-            <w:r>
-              <w:rPr>
-                <w:rFonts w:ascii="Helvetica" w:hAnsi="Helvetica" w:eastAsia="Helvetica" w:cs="Helvetica"/>
-                <w:i w:val="false"/>
-                <w:b w:val="false"/>
+                <w:b w:val="true"/>
+                <w:u w:val="none"/>
+                <w:strike w:val="false"/>
+                <w:sz w:val="22"/>
+                <w:szCs w:val="22"/>
+                <w:color w:val="000000"/>
+              </w:rPr>
+            </w:pPr>
+            <w:r>
+              <w:rPr>
+                <w:rFonts w:ascii="Helvetica" w:hAnsi="Helvetica" w:eastAsia="Helvetica" w:cs="Helvetica"/>
+                <w:i w:val="false"/>
+                <w:b w:val="true"/>
                 <w:u w:val="none"/>
                 <w:strike w:val="false"/>
                 <w:sz w:val="22"/>
@@ -127,19 +127,19 @@
               <w:rPr>
                 <w:rFonts w:ascii="Helvetica" w:hAnsi="Helvetica" w:eastAsia="Helvetica" w:cs="Helvetica"/>
                 <w:i w:val="false"/>
-                <w:b w:val="false"/>
-                <w:u w:val="none"/>
-                <w:strike w:val="false"/>
-                <w:sz w:val="22"/>
-                <w:szCs w:val="22"/>
-                <w:color w:val="000000"/>
-              </w:rPr>
-            </w:pPr>
-            <w:r>
-              <w:rPr>
-                <w:rFonts w:ascii="Helvetica" w:hAnsi="Helvetica" w:eastAsia="Helvetica" w:cs="Helvetica"/>
-                <w:i w:val="false"/>
-                <w:b w:val="false"/>
+                <w:b w:val="true"/>
+                <w:u w:val="none"/>
+                <w:strike w:val="false"/>
+                <w:sz w:val="22"/>
+                <w:szCs w:val="22"/>
+                <w:color w:val="000000"/>
+              </w:rPr>
+            </w:pPr>
+            <w:r>
+              <w:rPr>
+                <w:rFonts w:ascii="Helvetica" w:hAnsi="Helvetica" w:eastAsia="Helvetica" w:cs="Helvetica"/>
+                <w:i w:val="false"/>
+                <w:b w:val="true"/>
                 <w:u w:val="none"/>
                 <w:strike w:val="false"/>
                 <w:sz w:val="22"/>
@@ -182,19 +182,19 @@
               <w:rPr>
                 <w:rFonts w:ascii="Helvetica" w:hAnsi="Helvetica" w:eastAsia="Helvetica" w:cs="Helvetica"/>
                 <w:i w:val="false"/>
-                <w:b w:val="false"/>
-                <w:u w:val="none"/>
-                <w:strike w:val="false"/>
-                <w:sz w:val="22"/>
-                <w:szCs w:val="22"/>
-                <w:color w:val="000000"/>
-              </w:rPr>
-            </w:pPr>
-            <w:r>
-              <w:rPr>
-                <w:rFonts w:ascii="Helvetica" w:hAnsi="Helvetica" w:eastAsia="Helvetica" w:cs="Helvetica"/>
-                <w:i w:val="false"/>
-                <w:b w:val="false"/>
+                <w:b w:val="true"/>
+                <w:u w:val="none"/>
+                <w:strike w:val="false"/>
+                <w:sz w:val="22"/>
+                <w:szCs w:val="22"/>
+                <w:color w:val="000000"/>
+              </w:rPr>
+            </w:pPr>
+            <w:r>
+              <w:rPr>
+                <w:rFonts w:ascii="Helvetica" w:hAnsi="Helvetica" w:eastAsia="Helvetica" w:cs="Helvetica"/>
+                <w:i w:val="false"/>
+                <w:b w:val="true"/>
                 <w:u w:val="none"/>
                 <w:strike w:val="false"/>
                 <w:sz w:val="22"/>
@@ -237,19 +237,19 @@
               <w:rPr>
                 <w:rFonts w:ascii="Helvetica" w:hAnsi="Helvetica" w:eastAsia="Helvetica" w:cs="Helvetica"/>
                 <w:i w:val="false"/>
-                <w:b w:val="false"/>
-                <w:u w:val="none"/>
-                <w:strike w:val="false"/>
-                <w:sz w:val="22"/>
-                <w:szCs w:val="22"/>
-                <w:color w:val="000000"/>
-              </w:rPr>
-            </w:pPr>
-            <w:r>
-              <w:rPr>
-                <w:rFonts w:ascii="Helvetica" w:hAnsi="Helvetica" w:eastAsia="Helvetica" w:cs="Helvetica"/>
-                <w:i w:val="false"/>
-                <w:b w:val="false"/>
+                <w:b w:val="true"/>
+                <w:u w:val="none"/>
+                <w:strike w:val="false"/>
+                <w:sz w:val="22"/>
+                <w:szCs w:val="22"/>
+                <w:color w:val="000000"/>
+              </w:rPr>
+            </w:pPr>
+            <w:r>
+              <w:rPr>
+                <w:rFonts w:ascii="Helvetica" w:hAnsi="Helvetica" w:eastAsia="Helvetica" w:cs="Helvetica"/>
+                <w:i w:val="false"/>
+                <w:b w:val="true"/>
                 <w:u w:val="none"/>
                 <w:strike w:val="false"/>
                 <w:sz w:val="22"/>
@@ -292,19 +292,19 @@
               <w:rPr>
                 <w:rFonts w:ascii="Helvetica" w:hAnsi="Helvetica" w:eastAsia="Helvetica" w:cs="Helvetica"/>
                 <w:i w:val="false"/>
-                <w:b w:val="false"/>
-                <w:u w:val="none"/>
-                <w:strike w:val="false"/>
-                <w:sz w:val="22"/>
-                <w:szCs w:val="22"/>
-                <w:color w:val="000000"/>
-              </w:rPr>
-            </w:pPr>
-            <w:r>
-              <w:rPr>
-                <w:rFonts w:ascii="Helvetica" w:hAnsi="Helvetica" w:eastAsia="Helvetica" w:cs="Helvetica"/>
-                <w:i w:val="false"/>
-                <w:b w:val="false"/>
+                <w:b w:val="true"/>
+                <w:u w:val="none"/>
+                <w:strike w:val="false"/>
+                <w:sz w:val="22"/>
+                <w:szCs w:val="22"/>
+                <w:color w:val="000000"/>
+              </w:rPr>
+            </w:pPr>
+            <w:r>
+              <w:rPr>
+                <w:rFonts w:ascii="Helvetica" w:hAnsi="Helvetica" w:eastAsia="Helvetica" w:cs="Helvetica"/>
+                <w:i w:val="false"/>
+                <w:b w:val="true"/>
                 <w:u w:val="none"/>
                 <w:strike w:val="false"/>
                 <w:sz w:val="22"/>
@@ -347,19 +347,19 @@
               <w:rPr>
                 <w:rFonts w:ascii="Helvetica" w:hAnsi="Helvetica" w:eastAsia="Helvetica" w:cs="Helvetica"/>
                 <w:i w:val="false"/>
-                <w:b w:val="false"/>
-                <w:u w:val="none"/>
-                <w:strike w:val="false"/>
-                <w:sz w:val="22"/>
-                <w:szCs w:val="22"/>
-                <w:color w:val="000000"/>
-              </w:rPr>
-            </w:pPr>
-            <w:r>
-              <w:rPr>
-                <w:rFonts w:ascii="Helvetica" w:hAnsi="Helvetica" w:eastAsia="Helvetica" w:cs="Helvetica"/>
-                <w:i w:val="false"/>
-                <w:b w:val="false"/>
+                <w:b w:val="true"/>
+                <w:u w:val="none"/>
+                <w:strike w:val="false"/>
+                <w:sz w:val="22"/>
+                <w:szCs w:val="22"/>
+                <w:color w:val="000000"/>
+              </w:rPr>
+            </w:pPr>
+            <w:r>
+              <w:rPr>
+                <w:rFonts w:ascii="Helvetica" w:hAnsi="Helvetica" w:eastAsia="Helvetica" w:cs="Helvetica"/>
+                <w:i w:val="false"/>
+                <w:b w:val="true"/>
                 <w:u w:val="none"/>
                 <w:strike w:val="false"/>
                 <w:sz w:val="22"/>
@@ -402,19 +402,19 @@
               <w:rPr>
                 <w:rFonts w:ascii="Helvetica" w:hAnsi="Helvetica" w:eastAsia="Helvetica" w:cs="Helvetica"/>
                 <w:i w:val="false"/>
-                <w:b w:val="false"/>
-                <w:u w:val="none"/>
-                <w:strike w:val="false"/>
-                <w:sz w:val="22"/>
-                <w:szCs w:val="22"/>
-                <w:color w:val="000000"/>
-              </w:rPr>
-            </w:pPr>
-            <w:r>
-              <w:rPr>
-                <w:rFonts w:ascii="Helvetica" w:hAnsi="Helvetica" w:eastAsia="Helvetica" w:cs="Helvetica"/>
-                <w:i w:val="false"/>
-                <w:b w:val="false"/>
+                <w:b w:val="true"/>
+                <w:u w:val="none"/>
+                <w:strike w:val="false"/>
+                <w:sz w:val="22"/>
+                <w:szCs w:val="22"/>
+                <w:color w:val="000000"/>
+              </w:rPr>
+            </w:pPr>
+            <w:r>
+              <w:rPr>
+                <w:rFonts w:ascii="Helvetica" w:hAnsi="Helvetica" w:eastAsia="Helvetica" w:cs="Helvetica"/>
+                <w:i w:val="false"/>
+                <w:b w:val="true"/>
                 <w:u w:val="none"/>
                 <w:strike w:val="false"/>
                 <w:sz w:val="22"/>
@@ -463,19 +463,19 @@
               <w:rPr>
                 <w:rFonts w:ascii="Helvetica" w:hAnsi="Helvetica" w:eastAsia="Helvetica" w:cs="Helvetica"/>
                 <w:i w:val="false"/>
-                <w:b w:val="false"/>
-                <w:u w:val="none"/>
-                <w:strike w:val="false"/>
-                <w:sz w:val="22"/>
-                <w:szCs w:val="22"/>
-                <w:color w:val="000000"/>
-              </w:rPr>
-            </w:pPr>
-            <w:r>
-              <w:rPr>
-                <w:rFonts w:ascii="Helvetica" w:hAnsi="Helvetica" w:eastAsia="Helvetica" w:cs="Helvetica"/>
-                <w:i w:val="false"/>
-                <w:b w:val="false"/>
+                <w:b w:val="true"/>
+                <w:u w:val="none"/>
+                <w:strike w:val="false"/>
+                <w:sz w:val="22"/>
+                <w:szCs w:val="22"/>
+                <w:color w:val="000000"/>
+              </w:rPr>
+            </w:pPr>
+            <w:r>
+              <w:rPr>
+                <w:rFonts w:ascii="Helvetica" w:hAnsi="Helvetica" w:eastAsia="Helvetica" w:cs="Helvetica"/>
+                <w:i w:val="false"/>
+                <w:b w:val="true"/>
                 <w:u w:val="none"/>
                 <w:strike w:val="false"/>
                 <w:sz w:val="22"/>
@@ -984,7 +984,7 @@
               <w:rPr>
                 <w:rFonts w:ascii="Helvetica" w:hAnsi="Helvetica" w:eastAsia="Helvetica" w:cs="Helvetica"/>
                 <w:i w:val="false"/>
-                <w:b w:val="false"/>
+                <w:b w:val="true"/>
                 <w:u w:val="none"/>
                 <w:strike w:val="false"/>
                 <w:sz w:val="22"/>
@@ -1492,7 +1492,7 @@
               <w:rPr>
                 <w:rFonts w:ascii="Helvetica" w:hAnsi="Helvetica" w:eastAsia="Helvetica" w:cs="Helvetica"/>
                 <w:i w:val="false"/>
-                <w:b w:val="false"/>
+                <w:b w:val="true"/>
                 <w:u w:val="none"/>
                 <w:strike w:val="false"/>
                 <w:sz w:val="22"/>
@@ -2000,7 +2000,7 @@
               <w:rPr>
                 <w:rFonts w:ascii="Helvetica" w:hAnsi="Helvetica" w:eastAsia="Helvetica" w:cs="Helvetica"/>
                 <w:i w:val="false"/>
-                <w:b w:val="false"/>
+                <w:b w:val="true"/>
                 <w:u w:val="none"/>
                 <w:strike w:val="false"/>
                 <w:sz w:val="22"/>
@@ -2508,19 +2508,19 @@
               <w:rPr>
                 <w:rFonts w:ascii="Helvetica" w:hAnsi="Helvetica" w:eastAsia="Helvetica" w:cs="Helvetica"/>
                 <w:i w:val="false"/>
-                <w:b w:val="false"/>
-                <w:u w:val="none"/>
-                <w:strike w:val="false"/>
-                <w:sz w:val="22"/>
-                <w:szCs w:val="22"/>
-                <w:color w:val="000000"/>
-              </w:rPr>
-            </w:pPr>
-            <w:r>
-              <w:rPr>
-                <w:rFonts w:ascii="Helvetica" w:hAnsi="Helvetica" w:eastAsia="Helvetica" w:cs="Helvetica"/>
-                <w:i w:val="false"/>
-                <w:b w:val="false"/>
+                <w:b w:val="true"/>
+                <w:u w:val="none"/>
+                <w:strike w:val="false"/>
+                <w:sz w:val="22"/>
+                <w:szCs w:val="22"/>
+                <w:color w:val="000000"/>
+              </w:rPr>
+            </w:pPr>
+            <w:r>
+              <w:rPr>
+                <w:rFonts w:ascii="Helvetica" w:hAnsi="Helvetica" w:eastAsia="Helvetica" w:cs="Helvetica"/>
+                <w:i w:val="false"/>
+                <w:b w:val="true"/>
                 <w:u w:val="none"/>
                 <w:strike w:val="false"/>
                 <w:sz w:val="22"/>
@@ -3029,7 +3029,7 @@
               <w:rPr>
                 <w:rFonts w:ascii="Helvetica" w:hAnsi="Helvetica" w:eastAsia="Helvetica" w:cs="Helvetica"/>
                 <w:i w:val="false"/>
-                <w:b w:val="false"/>
+                <w:b w:val="true"/>
                 <w:u w:val="none"/>
                 <w:strike w:val="false"/>
                 <w:sz w:val="22"/>
@@ -3537,7 +3537,7 @@
               <w:rPr>
                 <w:rFonts w:ascii="Helvetica" w:hAnsi="Helvetica" w:eastAsia="Helvetica" w:cs="Helvetica"/>
                 <w:i w:val="false"/>
-                <w:b w:val="false"/>
+                <w:b w:val="true"/>
                 <w:u w:val="none"/>
                 <w:strike w:val="false"/>
                 <w:sz w:val="22"/>
@@ -4045,7 +4045,7 @@
               <w:rPr>
                 <w:rFonts w:ascii="Helvetica" w:hAnsi="Helvetica" w:eastAsia="Helvetica" w:cs="Helvetica"/>
                 <w:i w:val="false"/>
-                <w:b w:val="false"/>
+                <w:b w:val="true"/>
                 <w:u w:val="none"/>
                 <w:strike w:val="false"/>
                 <w:sz w:val="22"/>

</xml_diff>

<commit_message>
added stylistic changes to main file table 5
</commit_message>
<xml_diff>
--- a/Output/Table 5 Regression Models.docx
+++ b/Output/Table 5 Regression Models.docx
@@ -91,7 +91,7 @@
                 <w:szCs w:val="22"/>
                 <w:color w:val="000000"/>
               </w:rPr>
-              <w:t xml:space="preserve">Outcome Metric</w:t>
+              <w:t xml:space="preserve"/>
             </w:r>
           </w:p>
         </w:tc>
@@ -146,12 +146,13 @@
                 <w:szCs w:val="22"/>
                 <w:color w:val="000000"/>
               </w:rPr>
-              <w:t xml:space="preserve">Predictor</w:t>
-            </w:r>
-          </w:p>
-        </w:tc>
-        <w:tc>
-          <w:tcPr>
+              <w:t xml:space="preserve"/>
+            </w:r>
+          </w:p>
+        </w:tc>
+        <w:tc>
+          <w:tcPr>
+            <w:gridSpan w:val="2"/>
             <w:tcBorders>
               <w:bottom w:val="single" w:sz="12" w:space="0" w:color="666666"/>
               <w:top w:val="single" w:sz="12" w:space="0" w:color="666666"/>
@@ -201,12 +202,13 @@
                 <w:szCs w:val="22"/>
                 <w:color w:val="000000"/>
               </w:rPr>
-              <w:t xml:space="preserve">M1</w:t>
-            </w:r>
-          </w:p>
-        </w:tc>
-        <w:tc>
-          <w:tcPr>
+              <w:t xml:space="preserve">Model 1</w:t>
+            </w:r>
+          </w:p>
+        </w:tc>
+        <w:tc>
+          <w:tcPr>
+            <w:gridSpan w:val="2"/>
             <w:tcBorders>
               <w:bottom w:val="single" w:sz="12" w:space="0" w:color="666666"/>
               <w:top w:val="single" w:sz="12" w:space="0" w:color="666666"/>
@@ -256,12 +258,13 @@
                 <w:szCs w:val="22"/>
                 <w:color w:val="000000"/>
               </w:rPr>
-              <w:t xml:space="preserve">M2</w:t>
-            </w:r>
-          </w:p>
-        </w:tc>
-        <w:tc>
-          <w:tcPr>
+              <w:t xml:space="preserve">Model 2</w:t>
+            </w:r>
+          </w:p>
+        </w:tc>
+        <w:tc>
+          <w:tcPr>
+            <w:gridSpan w:val="2"/>
             <w:tcBorders>
               <w:bottom w:val="single" w:sz="12" w:space="0" w:color="666666"/>
               <w:top w:val="single" w:sz="12" w:space="0" w:color="666666"/>
@@ -311,12 +314,13 @@
                 <w:szCs w:val="22"/>
                 <w:color w:val="000000"/>
               </w:rPr>
-              <w:t xml:space="preserve">M3</w:t>
-            </w:r>
-          </w:p>
-        </w:tc>
-        <w:tc>
-          <w:tcPr>
+              <w:t xml:space="preserve">Model 3</w:t>
+            </w:r>
+          </w:p>
+        </w:tc>
+        <w:tc>
+          <w:tcPr>
+            <w:gridSpan w:val="2"/>
             <w:tcBorders>
               <w:bottom w:val="single" w:sz="12" w:space="0" w:color="666666"/>
               <w:top w:val="single" w:sz="12" w:space="0" w:color="666666"/>
@@ -366,12 +370,13 @@
                 <w:szCs w:val="22"/>
                 <w:color w:val="000000"/>
               </w:rPr>
-              <w:t xml:space="preserve">M4</w:t>
-            </w:r>
-          </w:p>
-        </w:tc>
-        <w:tc>
-          <w:tcPr>
+              <w:t xml:space="preserve">Model 4</w:t>
+            </w:r>
+          </w:p>
+        </w:tc>
+        <w:tc>
+          <w:tcPr>
+            <w:gridSpan w:val="2"/>
             <w:tcBorders>
               <w:bottom w:val="single" w:sz="12" w:space="0" w:color="666666"/>
               <w:top w:val="single" w:sz="12" w:space="0" w:color="666666"/>
@@ -421,7 +426,673 @@
                 <w:szCs w:val="22"/>
                 <w:color w:val="000000"/>
               </w:rPr>
-              <w:t xml:space="preserve">M5</w:t>
+              <w:t xml:space="preserve">Model 5</w:t>
+            </w:r>
+          </w:p>
+        </w:tc>
+      </w:tr>
+      <w:tr>
+        <w:trPr>
+          <w:trHeight w:val="360" w:hRule="auto"/>
+          <w:tblHeader/>
+        </w:trPr>
+        <w:tc>
+          <w:tcPr>
+            <w:tcBorders>
+              <w:bottom w:val="single" w:sz="12" w:space="0" w:color="666666"/>
+              <w:top w:val="single" w:sz="12" w:space="0" w:color="666666"/>
+              <w:left w:val="none" w:sz="0" w:space="0" w:color="000000"/>
+              <w:right w:val="none" w:sz="0" w:space="0" w:color="000000"/>
+            </w:tcBorders>
+            <w:shd w:val="clear" w:color="auto" w:fill="FFFFFF"/>
+            <w:tcMar>
+              <w:top w:w="0" w:type="dxa"/>
+              <w:bottom w:w="0" w:type="dxa"/>
+              <w:left w:w="0" w:type="dxa"/>
+              <w:right w:w="0" w:type="dxa"/>
+            </w:tcMar>
+            <w:vAlign w:val="center"/>
+          </w:tcPr>
+          <w:p>
+            <w:pPr>
+              <w:pStyle w:val="Normal"/>
+              <w:jc w:val="left"/>
+              <w:pBdr>
+                <w:bottom w:val="none" w:sz="0" w:space="0" w:color="000000"/>
+                <w:top w:val="none" w:sz="0" w:space="0" w:color="000000"/>
+                <w:left w:val="none" w:sz="0" w:space="0" w:color="000000"/>
+                <w:right w:val="none" w:sz="0" w:space="0" w:color="000000"/>
+              </w:pBdr>
+              <w:spacing w:after="100" w:before="100" w:line="240"/>
+              <w:ind w:left="100" w:right="100" w:firstLine="0" w:firstLineChars="0"/>
+              <w:rPr>
+                <w:rFonts w:ascii="Helvetica" w:hAnsi="Helvetica" w:eastAsia="Helvetica" w:cs="Helvetica"/>
+                <w:i w:val="false"/>
+                <w:b w:val="true"/>
+                <w:u w:val="none"/>
+                <w:strike w:val="false"/>
+                <w:sz w:val="22"/>
+                <w:szCs w:val="22"/>
+                <w:color w:val="000000"/>
+              </w:rPr>
+            </w:pPr>
+            <w:r>
+              <w:rPr>
+                <w:rFonts w:ascii="Helvetica" w:hAnsi="Helvetica" w:eastAsia="Helvetica" w:cs="Helvetica"/>
+                <w:i w:val="false"/>
+                <w:b w:val="true"/>
+                <w:u w:val="none"/>
+                <w:strike w:val="false"/>
+                <w:sz w:val="22"/>
+                <w:szCs w:val="22"/>
+                <w:color w:val="000000"/>
+              </w:rPr>
+              <w:t xml:space="preserve">Epigenetic Clock</w:t>
+            </w:r>
+          </w:p>
+        </w:tc>
+        <w:tc>
+          <w:tcPr>
+            <w:tcBorders>
+              <w:bottom w:val="single" w:sz="12" w:space="0" w:color="666666"/>
+              <w:top w:val="single" w:sz="12" w:space="0" w:color="666666"/>
+              <w:left w:val="none" w:sz="0" w:space="0" w:color="000000"/>
+              <w:right w:val="none" w:sz="0" w:space="0" w:color="000000"/>
+            </w:tcBorders>
+            <w:shd w:val="clear" w:color="auto" w:fill="FFFFFF"/>
+            <w:tcMar>
+              <w:top w:w="0" w:type="dxa"/>
+              <w:bottom w:w="0" w:type="dxa"/>
+              <w:left w:w="0" w:type="dxa"/>
+              <w:right w:w="0" w:type="dxa"/>
+            </w:tcMar>
+            <w:vAlign w:val="center"/>
+          </w:tcPr>
+          <w:p>
+            <w:pPr>
+              <w:pStyle w:val="Normal"/>
+              <w:jc w:val="left"/>
+              <w:pBdr>
+                <w:bottom w:val="none" w:sz="0" w:space="0" w:color="000000"/>
+                <w:top w:val="none" w:sz="0" w:space="0" w:color="000000"/>
+                <w:left w:val="none" w:sz="0" w:space="0" w:color="000000"/>
+                <w:right w:val="none" w:sz="0" w:space="0" w:color="000000"/>
+              </w:pBdr>
+              <w:spacing w:after="100" w:before="100" w:line="240"/>
+              <w:ind w:left="100" w:right="100" w:firstLine="0" w:firstLineChars="0"/>
+              <w:rPr>
+                <w:rFonts w:ascii="Helvetica" w:hAnsi="Helvetica" w:eastAsia="Helvetica" w:cs="Helvetica"/>
+                <w:i w:val="false"/>
+                <w:b w:val="true"/>
+                <w:u w:val="none"/>
+                <w:strike w:val="false"/>
+                <w:sz w:val="22"/>
+                <w:szCs w:val="22"/>
+                <w:color w:val="000000"/>
+              </w:rPr>
+            </w:pPr>
+            <w:r>
+              <w:rPr>
+                <w:rFonts w:ascii="Helvetica" w:hAnsi="Helvetica" w:eastAsia="Helvetica" w:cs="Helvetica"/>
+                <w:i w:val="false"/>
+                <w:b w:val="true"/>
+                <w:u w:val="none"/>
+                <w:strike w:val="false"/>
+                <w:sz w:val="22"/>
+                <w:szCs w:val="22"/>
+                <w:color w:val="000000"/>
+              </w:rPr>
+              <w:t xml:space="preserve">Characteristic</w:t>
+            </w:r>
+          </w:p>
+        </w:tc>
+        <w:tc>
+          <w:tcPr>
+            <w:tcBorders>
+              <w:bottom w:val="single" w:sz="12" w:space="0" w:color="666666"/>
+              <w:top w:val="single" w:sz="12" w:space="0" w:color="666666"/>
+              <w:left w:val="none" w:sz="0" w:space="0" w:color="000000"/>
+              <w:right w:val="none" w:sz="0" w:space="0" w:color="000000"/>
+            </w:tcBorders>
+            <w:shd w:val="clear" w:color="auto" w:fill="FFFFFF"/>
+            <w:tcMar>
+              <w:top w:w="0" w:type="dxa"/>
+              <w:bottom w:w="0" w:type="dxa"/>
+              <w:left w:w="0" w:type="dxa"/>
+              <w:right w:w="0" w:type="dxa"/>
+            </w:tcMar>
+            <w:vAlign w:val="center"/>
+          </w:tcPr>
+          <w:p>
+            <w:pPr>
+              <w:pStyle w:val="Normal"/>
+              <w:jc w:val="left"/>
+              <w:pBdr>
+                <w:bottom w:val="none" w:sz="0" w:space="0" w:color="000000"/>
+                <w:top w:val="none" w:sz="0" w:space="0" w:color="000000"/>
+                <w:left w:val="none" w:sz="0" w:space="0" w:color="000000"/>
+                <w:right w:val="none" w:sz="0" w:space="0" w:color="000000"/>
+              </w:pBdr>
+              <w:spacing w:after="100" w:before="100" w:line="240"/>
+              <w:ind w:left="100" w:right="100" w:firstLine="0" w:firstLineChars="0"/>
+              <w:rPr>
+                <w:rFonts w:ascii="Helvetica" w:hAnsi="Helvetica" w:eastAsia="Helvetica" w:cs="Helvetica"/>
+                <w:i w:val="false"/>
+                <w:b w:val="true"/>
+                <w:u w:val="none"/>
+                <w:strike w:val="false"/>
+                <w:sz w:val="22"/>
+                <w:szCs w:val="22"/>
+                <w:color w:val="000000"/>
+              </w:rPr>
+            </w:pPr>
+            <w:r>
+              <w:rPr>
+                <w:rFonts w:ascii="Helvetica" w:hAnsi="Helvetica" w:eastAsia="Helvetica" w:cs="Helvetica"/>
+                <w:i w:val="false"/>
+                <w:b w:val="true"/>
+                <w:u w:val="none"/>
+                <w:strike w:val="false"/>
+                <w:sz w:val="22"/>
+                <w:szCs w:val="22"/>
+                <w:color w:val="000000"/>
+              </w:rPr>
+              <w:t xml:space="preserve">Beta</w:t>
+            </w:r>
+          </w:p>
+        </w:tc>
+        <w:tc>
+          <w:tcPr>
+            <w:tcBorders>
+              <w:bottom w:val="single" w:sz="12" w:space="0" w:color="666666"/>
+              <w:top w:val="single" w:sz="12" w:space="0" w:color="666666"/>
+              <w:left w:val="none" w:sz="0" w:space="0" w:color="000000"/>
+              <w:right w:val="none" w:sz="0" w:space="0" w:color="000000"/>
+            </w:tcBorders>
+            <w:shd w:val="clear" w:color="auto" w:fill="FFFFFF"/>
+            <w:tcMar>
+              <w:top w:w="0" w:type="dxa"/>
+              <w:bottom w:w="0" w:type="dxa"/>
+              <w:left w:w="0" w:type="dxa"/>
+              <w:right w:w="0" w:type="dxa"/>
+            </w:tcMar>
+            <w:vAlign w:val="center"/>
+          </w:tcPr>
+          <w:p>
+            <w:pPr>
+              <w:pStyle w:val="Normal"/>
+              <w:jc w:val="left"/>
+              <w:pBdr>
+                <w:bottom w:val="none" w:sz="0" w:space="0" w:color="000000"/>
+                <w:top w:val="none" w:sz="0" w:space="0" w:color="000000"/>
+                <w:left w:val="none" w:sz="0" w:space="0" w:color="000000"/>
+                <w:right w:val="none" w:sz="0" w:space="0" w:color="000000"/>
+              </w:pBdr>
+              <w:spacing w:after="100" w:before="100" w:line="240"/>
+              <w:ind w:left="100" w:right="100" w:firstLine="0" w:firstLineChars="0"/>
+              <w:rPr>
+                <w:rFonts w:ascii="Helvetica" w:hAnsi="Helvetica" w:eastAsia="Helvetica" w:cs="Helvetica"/>
+                <w:i w:val="false"/>
+                <w:b w:val="true"/>
+                <w:u w:val="none"/>
+                <w:strike w:val="false"/>
+                <w:sz w:val="22"/>
+                <w:szCs w:val="22"/>
+                <w:color w:val="000000"/>
+              </w:rPr>
+            </w:pPr>
+            <w:r>
+              <w:rPr>
+                <w:rFonts w:ascii="Helvetica" w:hAnsi="Helvetica" w:eastAsia="Helvetica" w:cs="Helvetica"/>
+                <w:i w:val="false"/>
+                <w:b w:val="true"/>
+                <w:u w:val="none"/>
+                <w:strike w:val="false"/>
+                <w:sz w:val="22"/>
+                <w:szCs w:val="22"/>
+                <w:color w:val="000000"/>
+              </w:rPr>
+              <w:t xml:space="preserve">95% CI</w:t>
+            </w:r>
+          </w:p>
+        </w:tc>
+        <w:tc>
+          <w:tcPr>
+            <w:tcBorders>
+              <w:bottom w:val="single" w:sz="12" w:space="0" w:color="666666"/>
+              <w:top w:val="single" w:sz="12" w:space="0" w:color="666666"/>
+              <w:left w:val="none" w:sz="0" w:space="0" w:color="000000"/>
+              <w:right w:val="none" w:sz="0" w:space="0" w:color="000000"/>
+            </w:tcBorders>
+            <w:shd w:val="clear" w:color="auto" w:fill="FFFFFF"/>
+            <w:tcMar>
+              <w:top w:w="0" w:type="dxa"/>
+              <w:bottom w:w="0" w:type="dxa"/>
+              <w:left w:w="0" w:type="dxa"/>
+              <w:right w:w="0" w:type="dxa"/>
+            </w:tcMar>
+            <w:vAlign w:val="center"/>
+          </w:tcPr>
+          <w:p>
+            <w:pPr>
+              <w:pStyle w:val="Normal"/>
+              <w:jc w:val="left"/>
+              <w:pBdr>
+                <w:bottom w:val="none" w:sz="0" w:space="0" w:color="000000"/>
+                <w:top w:val="none" w:sz="0" w:space="0" w:color="000000"/>
+                <w:left w:val="none" w:sz="0" w:space="0" w:color="000000"/>
+                <w:right w:val="none" w:sz="0" w:space="0" w:color="000000"/>
+              </w:pBdr>
+              <w:spacing w:after="100" w:before="100" w:line="240"/>
+              <w:ind w:left="100" w:right="100" w:firstLine="0" w:firstLineChars="0"/>
+              <w:rPr>
+                <w:rFonts w:ascii="Helvetica" w:hAnsi="Helvetica" w:eastAsia="Helvetica" w:cs="Helvetica"/>
+                <w:i w:val="false"/>
+                <w:b w:val="true"/>
+                <w:u w:val="none"/>
+                <w:strike w:val="false"/>
+                <w:sz w:val="22"/>
+                <w:szCs w:val="22"/>
+                <w:color w:val="000000"/>
+              </w:rPr>
+            </w:pPr>
+            <w:r>
+              <w:rPr>
+                <w:rFonts w:ascii="Helvetica" w:hAnsi="Helvetica" w:eastAsia="Helvetica" w:cs="Helvetica"/>
+                <w:i w:val="false"/>
+                <w:b w:val="true"/>
+                <w:u w:val="none"/>
+                <w:strike w:val="false"/>
+                <w:sz w:val="22"/>
+                <w:szCs w:val="22"/>
+                <w:color w:val="000000"/>
+              </w:rPr>
+              <w:t xml:space="preserve">Beta</w:t>
+            </w:r>
+          </w:p>
+        </w:tc>
+        <w:tc>
+          <w:tcPr>
+            <w:tcBorders>
+              <w:bottom w:val="single" w:sz="12" w:space="0" w:color="666666"/>
+              <w:top w:val="single" w:sz="12" w:space="0" w:color="666666"/>
+              <w:left w:val="none" w:sz="0" w:space="0" w:color="000000"/>
+              <w:right w:val="none" w:sz="0" w:space="0" w:color="000000"/>
+            </w:tcBorders>
+            <w:shd w:val="clear" w:color="auto" w:fill="FFFFFF"/>
+            <w:tcMar>
+              <w:top w:w="0" w:type="dxa"/>
+              <w:bottom w:w="0" w:type="dxa"/>
+              <w:left w:w="0" w:type="dxa"/>
+              <w:right w:w="0" w:type="dxa"/>
+            </w:tcMar>
+            <w:vAlign w:val="center"/>
+          </w:tcPr>
+          <w:p>
+            <w:pPr>
+              <w:pStyle w:val="Normal"/>
+              <w:jc w:val="left"/>
+              <w:pBdr>
+                <w:bottom w:val="none" w:sz="0" w:space="0" w:color="000000"/>
+                <w:top w:val="none" w:sz="0" w:space="0" w:color="000000"/>
+                <w:left w:val="none" w:sz="0" w:space="0" w:color="000000"/>
+                <w:right w:val="none" w:sz="0" w:space="0" w:color="000000"/>
+              </w:pBdr>
+              <w:spacing w:after="100" w:before="100" w:line="240"/>
+              <w:ind w:left="100" w:right="100" w:firstLine="0" w:firstLineChars="0"/>
+              <w:rPr>
+                <w:rFonts w:ascii="Helvetica" w:hAnsi="Helvetica" w:eastAsia="Helvetica" w:cs="Helvetica"/>
+                <w:i w:val="false"/>
+                <w:b w:val="true"/>
+                <w:u w:val="none"/>
+                <w:strike w:val="false"/>
+                <w:sz w:val="22"/>
+                <w:szCs w:val="22"/>
+                <w:color w:val="000000"/>
+              </w:rPr>
+            </w:pPr>
+            <w:r>
+              <w:rPr>
+                <w:rFonts w:ascii="Helvetica" w:hAnsi="Helvetica" w:eastAsia="Helvetica" w:cs="Helvetica"/>
+                <w:i w:val="false"/>
+                <w:b w:val="true"/>
+                <w:u w:val="none"/>
+                <w:strike w:val="false"/>
+                <w:sz w:val="22"/>
+                <w:szCs w:val="22"/>
+                <w:color w:val="000000"/>
+              </w:rPr>
+              <w:t xml:space="preserve">95% CI</w:t>
+            </w:r>
+          </w:p>
+        </w:tc>
+        <w:tc>
+          <w:tcPr>
+            <w:tcBorders>
+              <w:bottom w:val="single" w:sz="12" w:space="0" w:color="666666"/>
+              <w:top w:val="single" w:sz="12" w:space="0" w:color="666666"/>
+              <w:left w:val="none" w:sz="0" w:space="0" w:color="000000"/>
+              <w:right w:val="none" w:sz="0" w:space="0" w:color="000000"/>
+            </w:tcBorders>
+            <w:shd w:val="clear" w:color="auto" w:fill="FFFFFF"/>
+            <w:tcMar>
+              <w:top w:w="0" w:type="dxa"/>
+              <w:bottom w:w="0" w:type="dxa"/>
+              <w:left w:w="0" w:type="dxa"/>
+              <w:right w:w="0" w:type="dxa"/>
+            </w:tcMar>
+            <w:vAlign w:val="center"/>
+          </w:tcPr>
+          <w:p>
+            <w:pPr>
+              <w:pStyle w:val="Normal"/>
+              <w:jc w:val="left"/>
+              <w:pBdr>
+                <w:bottom w:val="none" w:sz="0" w:space="0" w:color="000000"/>
+                <w:top w:val="none" w:sz="0" w:space="0" w:color="000000"/>
+                <w:left w:val="none" w:sz="0" w:space="0" w:color="000000"/>
+                <w:right w:val="none" w:sz="0" w:space="0" w:color="000000"/>
+              </w:pBdr>
+              <w:spacing w:after="100" w:before="100" w:line="240"/>
+              <w:ind w:left="100" w:right="100" w:firstLine="0" w:firstLineChars="0"/>
+              <w:rPr>
+                <w:rFonts w:ascii="Helvetica" w:hAnsi="Helvetica" w:eastAsia="Helvetica" w:cs="Helvetica"/>
+                <w:i w:val="false"/>
+                <w:b w:val="true"/>
+                <w:u w:val="none"/>
+                <w:strike w:val="false"/>
+                <w:sz w:val="22"/>
+                <w:szCs w:val="22"/>
+                <w:color w:val="000000"/>
+              </w:rPr>
+            </w:pPr>
+            <w:r>
+              <w:rPr>
+                <w:rFonts w:ascii="Helvetica" w:hAnsi="Helvetica" w:eastAsia="Helvetica" w:cs="Helvetica"/>
+                <w:i w:val="false"/>
+                <w:b w:val="true"/>
+                <w:u w:val="none"/>
+                <w:strike w:val="false"/>
+                <w:sz w:val="22"/>
+                <w:szCs w:val="22"/>
+                <w:color w:val="000000"/>
+              </w:rPr>
+              <w:t xml:space="preserve">Beta</w:t>
+            </w:r>
+          </w:p>
+        </w:tc>
+        <w:tc>
+          <w:tcPr>
+            <w:tcBorders>
+              <w:bottom w:val="single" w:sz="12" w:space="0" w:color="666666"/>
+              <w:top w:val="single" w:sz="12" w:space="0" w:color="666666"/>
+              <w:left w:val="none" w:sz="0" w:space="0" w:color="000000"/>
+              <w:right w:val="none" w:sz="0" w:space="0" w:color="000000"/>
+            </w:tcBorders>
+            <w:shd w:val="clear" w:color="auto" w:fill="FFFFFF"/>
+            <w:tcMar>
+              <w:top w:w="0" w:type="dxa"/>
+              <w:bottom w:w="0" w:type="dxa"/>
+              <w:left w:w="0" w:type="dxa"/>
+              <w:right w:w="0" w:type="dxa"/>
+            </w:tcMar>
+            <w:vAlign w:val="center"/>
+          </w:tcPr>
+          <w:p>
+            <w:pPr>
+              <w:pStyle w:val="Normal"/>
+              <w:jc w:val="left"/>
+              <w:pBdr>
+                <w:bottom w:val="none" w:sz="0" w:space="0" w:color="000000"/>
+                <w:top w:val="none" w:sz="0" w:space="0" w:color="000000"/>
+                <w:left w:val="none" w:sz="0" w:space="0" w:color="000000"/>
+                <w:right w:val="none" w:sz="0" w:space="0" w:color="000000"/>
+              </w:pBdr>
+              <w:spacing w:after="100" w:before="100" w:line="240"/>
+              <w:ind w:left="100" w:right="100" w:firstLine="0" w:firstLineChars="0"/>
+              <w:rPr>
+                <w:rFonts w:ascii="Helvetica" w:hAnsi="Helvetica" w:eastAsia="Helvetica" w:cs="Helvetica"/>
+                <w:i w:val="false"/>
+                <w:b w:val="true"/>
+                <w:u w:val="none"/>
+                <w:strike w:val="false"/>
+                <w:sz w:val="22"/>
+                <w:szCs w:val="22"/>
+                <w:color w:val="000000"/>
+              </w:rPr>
+            </w:pPr>
+            <w:r>
+              <w:rPr>
+                <w:rFonts w:ascii="Helvetica" w:hAnsi="Helvetica" w:eastAsia="Helvetica" w:cs="Helvetica"/>
+                <w:i w:val="false"/>
+                <w:b w:val="true"/>
+                <w:u w:val="none"/>
+                <w:strike w:val="false"/>
+                <w:sz w:val="22"/>
+                <w:szCs w:val="22"/>
+                <w:color w:val="000000"/>
+              </w:rPr>
+              <w:t xml:space="preserve">95% CI</w:t>
+            </w:r>
+          </w:p>
+        </w:tc>
+        <w:tc>
+          <w:tcPr>
+            <w:tcBorders>
+              <w:bottom w:val="single" w:sz="12" w:space="0" w:color="666666"/>
+              <w:top w:val="single" w:sz="12" w:space="0" w:color="666666"/>
+              <w:left w:val="none" w:sz="0" w:space="0" w:color="000000"/>
+              <w:right w:val="none" w:sz="0" w:space="0" w:color="000000"/>
+            </w:tcBorders>
+            <w:shd w:val="clear" w:color="auto" w:fill="FFFFFF"/>
+            <w:tcMar>
+              <w:top w:w="0" w:type="dxa"/>
+              <w:bottom w:w="0" w:type="dxa"/>
+              <w:left w:w="0" w:type="dxa"/>
+              <w:right w:w="0" w:type="dxa"/>
+            </w:tcMar>
+            <w:vAlign w:val="center"/>
+          </w:tcPr>
+          <w:p>
+            <w:pPr>
+              <w:pStyle w:val="Normal"/>
+              <w:jc w:val="left"/>
+              <w:pBdr>
+                <w:bottom w:val="none" w:sz="0" w:space="0" w:color="000000"/>
+                <w:top w:val="none" w:sz="0" w:space="0" w:color="000000"/>
+                <w:left w:val="none" w:sz="0" w:space="0" w:color="000000"/>
+                <w:right w:val="none" w:sz="0" w:space="0" w:color="000000"/>
+              </w:pBdr>
+              <w:spacing w:after="100" w:before="100" w:line="240"/>
+              <w:ind w:left="100" w:right="100" w:firstLine="0" w:firstLineChars="0"/>
+              <w:rPr>
+                <w:rFonts w:ascii="Helvetica" w:hAnsi="Helvetica" w:eastAsia="Helvetica" w:cs="Helvetica"/>
+                <w:i w:val="false"/>
+                <w:b w:val="true"/>
+                <w:u w:val="none"/>
+                <w:strike w:val="false"/>
+                <w:sz w:val="22"/>
+                <w:szCs w:val="22"/>
+                <w:color w:val="000000"/>
+              </w:rPr>
+            </w:pPr>
+            <w:r>
+              <w:rPr>
+                <w:rFonts w:ascii="Helvetica" w:hAnsi="Helvetica" w:eastAsia="Helvetica" w:cs="Helvetica"/>
+                <w:i w:val="false"/>
+                <w:b w:val="true"/>
+                <w:u w:val="none"/>
+                <w:strike w:val="false"/>
+                <w:sz w:val="22"/>
+                <w:szCs w:val="22"/>
+                <w:color w:val="000000"/>
+              </w:rPr>
+              <w:t xml:space="preserve">Beta</w:t>
+            </w:r>
+          </w:p>
+        </w:tc>
+        <w:tc>
+          <w:tcPr>
+            <w:tcBorders>
+              <w:bottom w:val="single" w:sz="12" w:space="0" w:color="666666"/>
+              <w:top w:val="single" w:sz="12" w:space="0" w:color="666666"/>
+              <w:left w:val="none" w:sz="0" w:space="0" w:color="000000"/>
+              <w:right w:val="none" w:sz="0" w:space="0" w:color="000000"/>
+            </w:tcBorders>
+            <w:shd w:val="clear" w:color="auto" w:fill="FFFFFF"/>
+            <w:tcMar>
+              <w:top w:w="0" w:type="dxa"/>
+              <w:bottom w:w="0" w:type="dxa"/>
+              <w:left w:w="0" w:type="dxa"/>
+              <w:right w:w="0" w:type="dxa"/>
+            </w:tcMar>
+            <w:vAlign w:val="center"/>
+          </w:tcPr>
+          <w:p>
+            <w:pPr>
+              <w:pStyle w:val="Normal"/>
+              <w:jc w:val="left"/>
+              <w:pBdr>
+                <w:bottom w:val="none" w:sz="0" w:space="0" w:color="000000"/>
+                <w:top w:val="none" w:sz="0" w:space="0" w:color="000000"/>
+                <w:left w:val="none" w:sz="0" w:space="0" w:color="000000"/>
+                <w:right w:val="none" w:sz="0" w:space="0" w:color="000000"/>
+              </w:pBdr>
+              <w:spacing w:after="100" w:before="100" w:line="240"/>
+              <w:ind w:left="100" w:right="100" w:firstLine="0" w:firstLineChars="0"/>
+              <w:rPr>
+                <w:rFonts w:ascii="Helvetica" w:hAnsi="Helvetica" w:eastAsia="Helvetica" w:cs="Helvetica"/>
+                <w:i w:val="false"/>
+                <w:b w:val="true"/>
+                <w:u w:val="none"/>
+                <w:strike w:val="false"/>
+                <w:sz w:val="22"/>
+                <w:szCs w:val="22"/>
+                <w:color w:val="000000"/>
+              </w:rPr>
+            </w:pPr>
+            <w:r>
+              <w:rPr>
+                <w:rFonts w:ascii="Helvetica" w:hAnsi="Helvetica" w:eastAsia="Helvetica" w:cs="Helvetica"/>
+                <w:i w:val="false"/>
+                <w:b w:val="true"/>
+                <w:u w:val="none"/>
+                <w:strike w:val="false"/>
+                <w:sz w:val="22"/>
+                <w:szCs w:val="22"/>
+                <w:color w:val="000000"/>
+              </w:rPr>
+              <w:t xml:space="preserve">95% CI</w:t>
+            </w:r>
+          </w:p>
+        </w:tc>
+        <w:tc>
+          <w:tcPr>
+            <w:tcBorders>
+              <w:bottom w:val="single" w:sz="12" w:space="0" w:color="666666"/>
+              <w:top w:val="single" w:sz="12" w:space="0" w:color="666666"/>
+              <w:left w:val="none" w:sz="0" w:space="0" w:color="000000"/>
+              <w:right w:val="none" w:sz="0" w:space="0" w:color="000000"/>
+            </w:tcBorders>
+            <w:shd w:val="clear" w:color="auto" w:fill="FFFFFF"/>
+            <w:tcMar>
+              <w:top w:w="0" w:type="dxa"/>
+              <w:bottom w:w="0" w:type="dxa"/>
+              <w:left w:w="0" w:type="dxa"/>
+              <w:right w:w="0" w:type="dxa"/>
+            </w:tcMar>
+            <w:vAlign w:val="center"/>
+          </w:tcPr>
+          <w:p>
+            <w:pPr>
+              <w:pStyle w:val="Normal"/>
+              <w:jc w:val="left"/>
+              <w:pBdr>
+                <w:bottom w:val="none" w:sz="0" w:space="0" w:color="000000"/>
+                <w:top w:val="none" w:sz="0" w:space="0" w:color="000000"/>
+                <w:left w:val="none" w:sz="0" w:space="0" w:color="000000"/>
+                <w:right w:val="none" w:sz="0" w:space="0" w:color="000000"/>
+              </w:pBdr>
+              <w:spacing w:after="100" w:before="100" w:line="240"/>
+              <w:ind w:left="100" w:right="100" w:firstLine="0" w:firstLineChars="0"/>
+              <w:rPr>
+                <w:rFonts w:ascii="Helvetica" w:hAnsi="Helvetica" w:eastAsia="Helvetica" w:cs="Helvetica"/>
+                <w:i w:val="false"/>
+                <w:b w:val="true"/>
+                <w:u w:val="none"/>
+                <w:strike w:val="false"/>
+                <w:sz w:val="22"/>
+                <w:szCs w:val="22"/>
+                <w:color w:val="000000"/>
+              </w:rPr>
+            </w:pPr>
+            <w:r>
+              <w:rPr>
+                <w:rFonts w:ascii="Helvetica" w:hAnsi="Helvetica" w:eastAsia="Helvetica" w:cs="Helvetica"/>
+                <w:i w:val="false"/>
+                <w:b w:val="true"/>
+                <w:u w:val="none"/>
+                <w:strike w:val="false"/>
+                <w:sz w:val="22"/>
+                <w:szCs w:val="22"/>
+                <w:color w:val="000000"/>
+              </w:rPr>
+              <w:t xml:space="preserve">Beta</w:t>
+            </w:r>
+          </w:p>
+        </w:tc>
+        <w:tc>
+          <w:tcPr>
+            <w:tcBorders>
+              <w:bottom w:val="single" w:sz="12" w:space="0" w:color="666666"/>
+              <w:top w:val="single" w:sz="12" w:space="0" w:color="666666"/>
+              <w:left w:val="none" w:sz="0" w:space="0" w:color="000000"/>
+              <w:right w:val="none" w:sz="0" w:space="0" w:color="000000"/>
+            </w:tcBorders>
+            <w:shd w:val="clear" w:color="auto" w:fill="FFFFFF"/>
+            <w:tcMar>
+              <w:top w:w="0" w:type="dxa"/>
+              <w:bottom w:w="0" w:type="dxa"/>
+              <w:left w:w="0" w:type="dxa"/>
+              <w:right w:w="0" w:type="dxa"/>
+            </w:tcMar>
+            <w:vAlign w:val="center"/>
+          </w:tcPr>
+          <w:p>
+            <w:pPr>
+              <w:pStyle w:val="Normal"/>
+              <w:jc w:val="left"/>
+              <w:pBdr>
+                <w:bottom w:val="none" w:sz="0" w:space="0" w:color="000000"/>
+                <w:top w:val="none" w:sz="0" w:space="0" w:color="000000"/>
+                <w:left w:val="none" w:sz="0" w:space="0" w:color="000000"/>
+                <w:right w:val="none" w:sz="0" w:space="0" w:color="000000"/>
+              </w:pBdr>
+              <w:spacing w:after="100" w:before="100" w:line="240"/>
+              <w:ind w:left="100" w:right="100" w:firstLine="0" w:firstLineChars="0"/>
+              <w:rPr>
+                <w:rFonts w:ascii="Helvetica" w:hAnsi="Helvetica" w:eastAsia="Helvetica" w:cs="Helvetica"/>
+                <w:i w:val="false"/>
+                <w:b w:val="true"/>
+                <w:u w:val="none"/>
+                <w:strike w:val="false"/>
+                <w:sz w:val="22"/>
+                <w:szCs w:val="22"/>
+                <w:color w:val="000000"/>
+              </w:rPr>
+            </w:pPr>
+            <w:r>
+              <w:rPr>
+                <w:rFonts w:ascii="Helvetica" w:hAnsi="Helvetica" w:eastAsia="Helvetica" w:cs="Helvetica"/>
+                <w:i w:val="false"/>
+                <w:b w:val="true"/>
+                <w:u w:val="none"/>
+                <w:strike w:val="false"/>
+                <w:sz w:val="22"/>
+                <w:szCs w:val="22"/>
+                <w:color w:val="000000"/>
+              </w:rPr>
+              <w:t xml:space="preserve">95% CI</w:t>
             </w:r>
           </w:p>
         </w:tc>
@@ -594,32 +1265,6 @@
               </w:rPr>
               <w:t xml:space="preserve">0.07***</w:t>
             </w:r>
-            <w:r>
-              <w:rPr>
-                <w:rFonts w:ascii="Helvetica" w:hAnsi="Helvetica" w:eastAsia="Helvetica" w:cs="Helvetica"/>
-                <w:i w:val="false"/>
-                <w:b w:val="false"/>
-                <w:u w:val="none"/>
-                <w:strike w:val="false"/>
-                <w:sz w:val="22"/>
-                <w:szCs w:val="22"/>
-                <w:color w:val="000000"/>
-              </w:rPr>
-              <w:br/>
-            </w:r>
-            <w:r>
-              <w:rPr>
-                <w:rFonts w:ascii="Helvetica" w:hAnsi="Helvetica" w:eastAsia="Helvetica" w:cs="Helvetica"/>
-                <w:i w:val="false"/>
-                <w:b w:val="false"/>
-                <w:u w:val="none"/>
-                <w:strike w:val="false"/>
-                <w:sz w:val="22"/>
-                <w:szCs w:val="22"/>
-                <w:color w:val="000000"/>
-              </w:rPr>
-              <w:t xml:space="preserve">[0.04, 0.11]</w:t>
-            </w:r>
           </w:p>
         </w:tc>
         <w:tc>
@@ -673,34 +1318,63 @@
                 <w:szCs w:val="22"/>
                 <w:color w:val="000000"/>
               </w:rPr>
+              <w:t xml:space="preserve">(0.04, 0.11)</w:t>
+            </w:r>
+          </w:p>
+        </w:tc>
+        <w:tc>
+          <w:tcPr>
+            <w:tcBorders>
+              <w:bottom w:val="none" w:sz="0" w:space="0" w:color="000000"/>
+              <w:top w:val="single" w:sz="12" w:space="0" w:color="666666"/>
+              <w:left w:val="none" w:sz="0" w:space="0" w:color="000000"/>
+              <w:right w:val="none" w:sz="0" w:space="0" w:color="000000"/>
+            </w:tcBorders>
+            <w:shd w:val="clear" w:color="auto" w:fill="FFFFFF"/>
+            <w:tcMar>
+              <w:top w:w="0" w:type="dxa"/>
+              <w:bottom w:w="0" w:type="dxa"/>
+              <w:left w:w="0" w:type="dxa"/>
+              <w:right w:w="0" w:type="dxa"/>
+            </w:tcMar>
+            <w:vAlign w:val="center"/>
+          </w:tcPr>
+          <w:p>
+            <w:pPr>
+              <w:pStyle w:val="Normal"/>
+              <w:jc w:val="left"/>
+              <w:pBdr>
+                <w:bottom w:val="none" w:sz="0" w:space="0" w:color="000000"/>
+                <w:top w:val="none" w:sz="0" w:space="0" w:color="000000"/>
+                <w:left w:val="none" w:sz="0" w:space="0" w:color="000000"/>
+                <w:right w:val="none" w:sz="0" w:space="0" w:color="000000"/>
+              </w:pBdr>
+              <w:spacing w:after="100" w:before="100" w:line="240"/>
+              <w:ind w:left="100" w:right="100" w:firstLine="0" w:firstLineChars="0"/>
+              <w:rPr>
+                <w:rFonts w:ascii="Helvetica" w:hAnsi="Helvetica" w:eastAsia="Helvetica" w:cs="Helvetica"/>
+                <w:i w:val="false"/>
+                <w:b w:val="false"/>
+                <w:u w:val="none"/>
+                <w:strike w:val="false"/>
+                <w:sz w:val="22"/>
+                <w:szCs w:val="22"/>
+                <w:color w:val="000000"/>
+              </w:rPr>
+            </w:pPr>
+            <w:r>
+              <w:rPr>
+                <w:rFonts w:ascii="Helvetica" w:hAnsi="Helvetica" w:eastAsia="Helvetica" w:cs="Helvetica"/>
+                <w:i w:val="false"/>
+                <w:b w:val="false"/>
+                <w:u w:val="none"/>
+                <w:strike w:val="false"/>
+                <w:sz w:val="22"/>
+                <w:szCs w:val="22"/>
+                <w:color w:val="000000"/>
+              </w:rPr>
               <w:t xml:space="preserve">0.06***</w:t>
             </w:r>
-            <w:r>
-              <w:rPr>
-                <w:rFonts w:ascii="Helvetica" w:hAnsi="Helvetica" w:eastAsia="Helvetica" w:cs="Helvetica"/>
-                <w:i w:val="false"/>
-                <w:b w:val="false"/>
-                <w:u w:val="none"/>
-                <w:strike w:val="false"/>
-                <w:sz w:val="22"/>
-                <w:szCs w:val="22"/>
-                <w:color w:val="000000"/>
-              </w:rPr>
-              <w:br/>
-            </w:r>
-            <w:r>
-              <w:rPr>
-                <w:rFonts w:ascii="Helvetica" w:hAnsi="Helvetica" w:eastAsia="Helvetica" w:cs="Helvetica"/>
-                <w:i w:val="false"/>
-                <w:b w:val="false"/>
-                <w:u w:val="none"/>
-                <w:strike w:val="false"/>
-                <w:sz w:val="22"/>
-                <w:szCs w:val="22"/>
-                <w:color w:val="000000"/>
-              </w:rPr>
-              <w:t xml:space="preserve">[0.03, 0.09]</w:t>
-            </w:r>
           </w:p>
         </w:tc>
         <w:tc>
@@ -754,34 +1428,63 @@
                 <w:szCs w:val="22"/>
                 <w:color w:val="000000"/>
               </w:rPr>
+              <w:t xml:space="preserve">(0.03, 0.09)</w:t>
+            </w:r>
+          </w:p>
+        </w:tc>
+        <w:tc>
+          <w:tcPr>
+            <w:tcBorders>
+              <w:bottom w:val="none" w:sz="0" w:space="0" w:color="000000"/>
+              <w:top w:val="single" w:sz="12" w:space="0" w:color="666666"/>
+              <w:left w:val="none" w:sz="0" w:space="0" w:color="000000"/>
+              <w:right w:val="none" w:sz="0" w:space="0" w:color="000000"/>
+            </w:tcBorders>
+            <w:shd w:val="clear" w:color="auto" w:fill="FFFFFF"/>
+            <w:tcMar>
+              <w:top w:w="0" w:type="dxa"/>
+              <w:bottom w:w="0" w:type="dxa"/>
+              <w:left w:w="0" w:type="dxa"/>
+              <w:right w:w="0" w:type="dxa"/>
+            </w:tcMar>
+            <w:vAlign w:val="center"/>
+          </w:tcPr>
+          <w:p>
+            <w:pPr>
+              <w:pStyle w:val="Normal"/>
+              <w:jc w:val="left"/>
+              <w:pBdr>
+                <w:bottom w:val="none" w:sz="0" w:space="0" w:color="000000"/>
+                <w:top w:val="none" w:sz="0" w:space="0" w:color="000000"/>
+                <w:left w:val="none" w:sz="0" w:space="0" w:color="000000"/>
+                <w:right w:val="none" w:sz="0" w:space="0" w:color="000000"/>
+              </w:pBdr>
+              <w:spacing w:after="100" w:before="100" w:line="240"/>
+              <w:ind w:left="100" w:right="100" w:firstLine="0" w:firstLineChars="0"/>
+              <w:rPr>
+                <w:rFonts w:ascii="Helvetica" w:hAnsi="Helvetica" w:eastAsia="Helvetica" w:cs="Helvetica"/>
+                <w:i w:val="false"/>
+                <w:b w:val="false"/>
+                <w:u w:val="none"/>
+                <w:strike w:val="false"/>
+                <w:sz w:val="22"/>
+                <w:szCs w:val="22"/>
+                <w:color w:val="000000"/>
+              </w:rPr>
+            </w:pPr>
+            <w:r>
+              <w:rPr>
+                <w:rFonts w:ascii="Helvetica" w:hAnsi="Helvetica" w:eastAsia="Helvetica" w:cs="Helvetica"/>
+                <w:i w:val="false"/>
+                <w:b w:val="false"/>
+                <w:u w:val="none"/>
+                <w:strike w:val="false"/>
+                <w:sz w:val="22"/>
+                <w:szCs w:val="22"/>
+                <w:color w:val="000000"/>
+              </w:rPr>
               <w:t xml:space="preserve">0.07***</w:t>
             </w:r>
-            <w:r>
-              <w:rPr>
-                <w:rFonts w:ascii="Helvetica" w:hAnsi="Helvetica" w:eastAsia="Helvetica" w:cs="Helvetica"/>
-                <w:i w:val="false"/>
-                <w:b w:val="false"/>
-                <w:u w:val="none"/>
-                <w:strike w:val="false"/>
-                <w:sz w:val="22"/>
-                <w:szCs w:val="22"/>
-                <w:color w:val="000000"/>
-              </w:rPr>
-              <w:br/>
-            </w:r>
-            <w:r>
-              <w:rPr>
-                <w:rFonts w:ascii="Helvetica" w:hAnsi="Helvetica" w:eastAsia="Helvetica" w:cs="Helvetica"/>
-                <w:i w:val="false"/>
-                <w:b w:val="false"/>
-                <w:u w:val="none"/>
-                <w:strike w:val="false"/>
-                <w:sz w:val="22"/>
-                <w:szCs w:val="22"/>
-                <w:color w:val="000000"/>
-              </w:rPr>
-              <w:t xml:space="preserve">[0.03, 0.10]</w:t>
-            </w:r>
           </w:p>
         </w:tc>
         <w:tc>
@@ -835,34 +1538,63 @@
                 <w:szCs w:val="22"/>
                 <w:color w:val="000000"/>
               </w:rPr>
+              <w:t xml:space="preserve">(0.03, 0.10)</w:t>
+            </w:r>
+          </w:p>
+        </w:tc>
+        <w:tc>
+          <w:tcPr>
+            <w:tcBorders>
+              <w:bottom w:val="none" w:sz="0" w:space="0" w:color="000000"/>
+              <w:top w:val="single" w:sz="12" w:space="0" w:color="666666"/>
+              <w:left w:val="none" w:sz="0" w:space="0" w:color="000000"/>
+              <w:right w:val="none" w:sz="0" w:space="0" w:color="000000"/>
+            </w:tcBorders>
+            <w:shd w:val="clear" w:color="auto" w:fill="FFFFFF"/>
+            <w:tcMar>
+              <w:top w:w="0" w:type="dxa"/>
+              <w:bottom w:w="0" w:type="dxa"/>
+              <w:left w:w="0" w:type="dxa"/>
+              <w:right w:w="0" w:type="dxa"/>
+            </w:tcMar>
+            <w:vAlign w:val="center"/>
+          </w:tcPr>
+          <w:p>
+            <w:pPr>
+              <w:pStyle w:val="Normal"/>
+              <w:jc w:val="left"/>
+              <w:pBdr>
+                <w:bottom w:val="none" w:sz="0" w:space="0" w:color="000000"/>
+                <w:top w:val="none" w:sz="0" w:space="0" w:color="000000"/>
+                <w:left w:val="none" w:sz="0" w:space="0" w:color="000000"/>
+                <w:right w:val="none" w:sz="0" w:space="0" w:color="000000"/>
+              </w:pBdr>
+              <w:spacing w:after="100" w:before="100" w:line="240"/>
+              <w:ind w:left="100" w:right="100" w:firstLine="0" w:firstLineChars="0"/>
+              <w:rPr>
+                <w:rFonts w:ascii="Helvetica" w:hAnsi="Helvetica" w:eastAsia="Helvetica" w:cs="Helvetica"/>
+                <w:i w:val="false"/>
+                <w:b w:val="false"/>
+                <w:u w:val="none"/>
+                <w:strike w:val="false"/>
+                <w:sz w:val="22"/>
+                <w:szCs w:val="22"/>
+                <w:color w:val="000000"/>
+              </w:rPr>
+            </w:pPr>
+            <w:r>
+              <w:rPr>
+                <w:rFonts w:ascii="Helvetica" w:hAnsi="Helvetica" w:eastAsia="Helvetica" w:cs="Helvetica"/>
+                <w:i w:val="false"/>
+                <w:b w:val="false"/>
+                <w:u w:val="none"/>
+                <w:strike w:val="false"/>
+                <w:sz w:val="22"/>
+                <w:szCs w:val="22"/>
+                <w:color w:val="000000"/>
+              </w:rPr>
               <w:t xml:space="preserve">0.07***</w:t>
             </w:r>
-            <w:r>
-              <w:rPr>
-                <w:rFonts w:ascii="Helvetica" w:hAnsi="Helvetica" w:eastAsia="Helvetica" w:cs="Helvetica"/>
-                <w:i w:val="false"/>
-                <w:b w:val="false"/>
-                <w:u w:val="none"/>
-                <w:strike w:val="false"/>
-                <w:sz w:val="22"/>
-                <w:szCs w:val="22"/>
-                <w:color w:val="000000"/>
-              </w:rPr>
-              <w:br/>
-            </w:r>
-            <w:r>
-              <w:rPr>
-                <w:rFonts w:ascii="Helvetica" w:hAnsi="Helvetica" w:eastAsia="Helvetica" w:cs="Helvetica"/>
-                <w:i w:val="false"/>
-                <w:b w:val="false"/>
-                <w:u w:val="none"/>
-                <w:strike w:val="false"/>
-                <w:sz w:val="22"/>
-                <w:szCs w:val="22"/>
-                <w:color w:val="000000"/>
-              </w:rPr>
-              <w:t xml:space="preserve">[0.03, 0.10]</w:t>
-            </w:r>
           </w:p>
         </w:tc>
         <w:tc>
@@ -916,33 +1648,117 @@
                 <w:szCs w:val="22"/>
                 <w:color w:val="000000"/>
               </w:rPr>
+              <w:t xml:space="preserve">(0.03, 0.10)</w:t>
+            </w:r>
+          </w:p>
+        </w:tc>
+        <w:tc>
+          <w:tcPr>
+            <w:tcBorders>
+              <w:bottom w:val="none" w:sz="0" w:space="0" w:color="000000"/>
+              <w:top w:val="single" w:sz="12" w:space="0" w:color="666666"/>
+              <w:left w:val="none" w:sz="0" w:space="0" w:color="000000"/>
+              <w:right w:val="none" w:sz="0" w:space="0" w:color="000000"/>
+            </w:tcBorders>
+            <w:shd w:val="clear" w:color="auto" w:fill="FFFFFF"/>
+            <w:tcMar>
+              <w:top w:w="0" w:type="dxa"/>
+              <w:bottom w:w="0" w:type="dxa"/>
+              <w:left w:w="0" w:type="dxa"/>
+              <w:right w:w="0" w:type="dxa"/>
+            </w:tcMar>
+            <w:vAlign w:val="center"/>
+          </w:tcPr>
+          <w:p>
+            <w:pPr>
+              <w:pStyle w:val="Normal"/>
+              <w:jc w:val="left"/>
+              <w:pBdr>
+                <w:bottom w:val="none" w:sz="0" w:space="0" w:color="000000"/>
+                <w:top w:val="none" w:sz="0" w:space="0" w:color="000000"/>
+                <w:left w:val="none" w:sz="0" w:space="0" w:color="000000"/>
+                <w:right w:val="none" w:sz="0" w:space="0" w:color="000000"/>
+              </w:pBdr>
+              <w:spacing w:after="100" w:before="100" w:line="240"/>
+              <w:ind w:left="100" w:right="100" w:firstLine="0" w:firstLineChars="0"/>
+              <w:rPr>
+                <w:rFonts w:ascii="Helvetica" w:hAnsi="Helvetica" w:eastAsia="Helvetica" w:cs="Helvetica"/>
+                <w:i w:val="false"/>
+                <w:b w:val="false"/>
+                <w:u w:val="none"/>
+                <w:strike w:val="false"/>
+                <w:sz w:val="22"/>
+                <w:szCs w:val="22"/>
+                <w:color w:val="000000"/>
+              </w:rPr>
+            </w:pPr>
+            <w:r>
+              <w:rPr>
+                <w:rFonts w:ascii="Helvetica" w:hAnsi="Helvetica" w:eastAsia="Helvetica" w:cs="Helvetica"/>
+                <w:i w:val="false"/>
+                <w:b w:val="false"/>
+                <w:u w:val="none"/>
+                <w:strike w:val="false"/>
+                <w:sz w:val="22"/>
+                <w:szCs w:val="22"/>
+                <w:color w:val="000000"/>
+              </w:rPr>
               <w:t xml:space="preserve">0.02</w:t>
             </w:r>
-            <w:r>
-              <w:rPr>
-                <w:rFonts w:ascii="Helvetica" w:hAnsi="Helvetica" w:eastAsia="Helvetica" w:cs="Helvetica"/>
-                <w:i w:val="false"/>
-                <w:b w:val="false"/>
-                <w:u w:val="none"/>
-                <w:strike w:val="false"/>
-                <w:sz w:val="22"/>
-                <w:szCs w:val="22"/>
-                <w:color w:val="000000"/>
-              </w:rPr>
-              <w:br/>
-            </w:r>
-            <w:r>
-              <w:rPr>
-                <w:rFonts w:ascii="Helvetica" w:hAnsi="Helvetica" w:eastAsia="Helvetica" w:cs="Helvetica"/>
-                <w:i w:val="false"/>
-                <w:b w:val="false"/>
-                <w:u w:val="none"/>
-                <w:strike w:val="false"/>
-                <w:sz w:val="22"/>
-                <w:szCs w:val="22"/>
-                <w:color w:val="000000"/>
-              </w:rPr>
-              <w:t xml:space="preserve">[-0.01, 0.05]</w:t>
+          </w:p>
+        </w:tc>
+        <w:tc>
+          <w:tcPr>
+            <w:tcBorders>
+              <w:bottom w:val="none" w:sz="0" w:space="0" w:color="000000"/>
+              <w:top w:val="single" w:sz="12" w:space="0" w:color="666666"/>
+              <w:left w:val="none" w:sz="0" w:space="0" w:color="000000"/>
+              <w:right w:val="none" w:sz="0" w:space="0" w:color="000000"/>
+            </w:tcBorders>
+            <w:shd w:val="clear" w:color="auto" w:fill="FFFFFF"/>
+            <w:tcMar>
+              <w:top w:w="0" w:type="dxa"/>
+              <w:bottom w:w="0" w:type="dxa"/>
+              <w:left w:w="0" w:type="dxa"/>
+              <w:right w:w="0" w:type="dxa"/>
+            </w:tcMar>
+            <w:vAlign w:val="center"/>
+          </w:tcPr>
+          <w:p>
+            <w:pPr>
+              <w:pStyle w:val="Normal"/>
+              <w:jc w:val="left"/>
+              <w:pBdr>
+                <w:bottom w:val="none" w:sz="0" w:space="0" w:color="000000"/>
+                <w:top w:val="none" w:sz="0" w:space="0" w:color="000000"/>
+                <w:left w:val="none" w:sz="0" w:space="0" w:color="000000"/>
+                <w:right w:val="none" w:sz="0" w:space="0" w:color="000000"/>
+              </w:pBdr>
+              <w:spacing w:after="100" w:before="100" w:line="240"/>
+              <w:ind w:left="100" w:right="100" w:firstLine="0" w:firstLineChars="0"/>
+              <w:rPr>
+                <w:rFonts w:ascii="Helvetica" w:hAnsi="Helvetica" w:eastAsia="Helvetica" w:cs="Helvetica"/>
+                <w:i w:val="false"/>
+                <w:b w:val="false"/>
+                <w:u w:val="none"/>
+                <w:strike w:val="false"/>
+                <w:sz w:val="22"/>
+                <w:szCs w:val="22"/>
+                <w:color w:val="000000"/>
+              </w:rPr>
+            </w:pPr>
+            <w:r>
+              <w:rPr>
+                <w:rFonts w:ascii="Helvetica" w:hAnsi="Helvetica" w:eastAsia="Helvetica" w:cs="Helvetica"/>
+                <w:i w:val="false"/>
+                <w:b w:val="false"/>
+                <w:u w:val="none"/>
+                <w:strike w:val="false"/>
+                <w:sz w:val="22"/>
+                <w:szCs w:val="22"/>
+                <w:color w:val="000000"/>
+              </w:rPr>
+              <w:t xml:space="preserve">(-0.01, 0.05)</w:t>
             </w:r>
           </w:p>
         </w:tc>
@@ -1102,31 +1918,60 @@
               </w:rPr>
               <w:t xml:space="preserve">0.10**</w:t>
             </w:r>
-            <w:r>
-              <w:rPr>
-                <w:rFonts w:ascii="Helvetica" w:hAnsi="Helvetica" w:eastAsia="Helvetica" w:cs="Helvetica"/>
-                <w:i w:val="false"/>
-                <w:b w:val="false"/>
-                <w:u w:val="none"/>
-                <w:strike w:val="false"/>
-                <w:sz w:val="22"/>
-                <w:szCs w:val="22"/>
-                <w:color w:val="000000"/>
-              </w:rPr>
-              <w:br/>
-            </w:r>
-            <w:r>
-              <w:rPr>
-                <w:rFonts w:ascii="Helvetica" w:hAnsi="Helvetica" w:eastAsia="Helvetica" w:cs="Helvetica"/>
-                <w:i w:val="false"/>
-                <w:b w:val="false"/>
-                <w:u w:val="none"/>
-                <w:strike w:val="false"/>
-                <w:sz w:val="22"/>
-                <w:szCs w:val="22"/>
-                <w:color w:val="000000"/>
-              </w:rPr>
-              <w:t xml:space="preserve">[0.04, 0.16]</w:t>
+          </w:p>
+        </w:tc>
+        <w:tc>
+          <w:tcPr>
+            <w:tcBorders>
+              <w:bottom w:val="none" w:sz="0" w:space="0" w:color="000000"/>
+              <w:top w:val="none" w:sz="0" w:space="0" w:color="000000"/>
+              <w:left w:val="none" w:sz="0" w:space="0" w:color="000000"/>
+              <w:right w:val="none" w:sz="0" w:space="0" w:color="000000"/>
+            </w:tcBorders>
+            <w:shd w:val="clear" w:color="auto" w:fill="FFFFFF"/>
+            <w:tcMar>
+              <w:top w:w="0" w:type="dxa"/>
+              <w:bottom w:w="0" w:type="dxa"/>
+              <w:left w:w="0" w:type="dxa"/>
+              <w:right w:w="0" w:type="dxa"/>
+            </w:tcMar>
+            <w:vAlign w:val="center"/>
+          </w:tcPr>
+          <w:p>
+            <w:pPr>
+              <w:pStyle w:val="Normal"/>
+              <w:jc w:val="left"/>
+              <w:pBdr>
+                <w:bottom w:val="none" w:sz="0" w:space="0" w:color="000000"/>
+                <w:top w:val="none" w:sz="0" w:space="0" w:color="000000"/>
+                <w:left w:val="none" w:sz="0" w:space="0" w:color="000000"/>
+                <w:right w:val="none" w:sz="0" w:space="0" w:color="000000"/>
+              </w:pBdr>
+              <w:spacing w:after="100" w:before="100" w:line="240"/>
+              <w:ind w:left="100" w:right="100" w:firstLine="0" w:firstLineChars="0"/>
+              <w:rPr>
+                <w:rFonts w:ascii="Helvetica" w:hAnsi="Helvetica" w:eastAsia="Helvetica" w:cs="Helvetica"/>
+                <w:i w:val="false"/>
+                <w:b w:val="false"/>
+                <w:u w:val="none"/>
+                <w:strike w:val="false"/>
+                <w:sz w:val="22"/>
+                <w:szCs w:val="22"/>
+                <w:color w:val="000000"/>
+              </w:rPr>
+            </w:pPr>
+            <w:r>
+              <w:rPr>
+                <w:rFonts w:ascii="Helvetica" w:hAnsi="Helvetica" w:eastAsia="Helvetica" w:cs="Helvetica"/>
+                <w:i w:val="false"/>
+                <w:b w:val="false"/>
+                <w:u w:val="none"/>
+                <w:strike w:val="false"/>
+                <w:sz w:val="22"/>
+                <w:szCs w:val="22"/>
+                <w:color w:val="000000"/>
+              </w:rPr>
+              <w:t xml:space="preserve">(0.04, 0.16)</w:t>
             </w:r>
           </w:p>
         </w:tc>
@@ -1183,31 +2028,60 @@
               </w:rPr>
               <w:t xml:space="preserve">0.09**</w:t>
             </w:r>
-            <w:r>
-              <w:rPr>
-                <w:rFonts w:ascii="Helvetica" w:hAnsi="Helvetica" w:eastAsia="Helvetica" w:cs="Helvetica"/>
-                <w:i w:val="false"/>
-                <w:b w:val="false"/>
-                <w:u w:val="none"/>
-                <w:strike w:val="false"/>
-                <w:sz w:val="22"/>
-                <w:szCs w:val="22"/>
-                <w:color w:val="000000"/>
-              </w:rPr>
-              <w:br/>
-            </w:r>
-            <w:r>
-              <w:rPr>
-                <w:rFonts w:ascii="Helvetica" w:hAnsi="Helvetica" w:eastAsia="Helvetica" w:cs="Helvetica"/>
-                <w:i w:val="false"/>
-                <w:b w:val="false"/>
-                <w:u w:val="none"/>
-                <w:strike w:val="false"/>
-                <w:sz w:val="22"/>
-                <w:szCs w:val="22"/>
-                <w:color w:val="000000"/>
-              </w:rPr>
-              <w:t xml:space="preserve">[0.03, 0.15]</w:t>
+          </w:p>
+        </w:tc>
+        <w:tc>
+          <w:tcPr>
+            <w:tcBorders>
+              <w:bottom w:val="none" w:sz="0" w:space="0" w:color="000000"/>
+              <w:top w:val="none" w:sz="0" w:space="0" w:color="000000"/>
+              <w:left w:val="none" w:sz="0" w:space="0" w:color="000000"/>
+              <w:right w:val="none" w:sz="0" w:space="0" w:color="000000"/>
+            </w:tcBorders>
+            <w:shd w:val="clear" w:color="auto" w:fill="FFFFFF"/>
+            <w:tcMar>
+              <w:top w:w="0" w:type="dxa"/>
+              <w:bottom w:w="0" w:type="dxa"/>
+              <w:left w:w="0" w:type="dxa"/>
+              <w:right w:w="0" w:type="dxa"/>
+            </w:tcMar>
+            <w:vAlign w:val="center"/>
+          </w:tcPr>
+          <w:p>
+            <w:pPr>
+              <w:pStyle w:val="Normal"/>
+              <w:jc w:val="left"/>
+              <w:pBdr>
+                <w:bottom w:val="none" w:sz="0" w:space="0" w:color="000000"/>
+                <w:top w:val="none" w:sz="0" w:space="0" w:color="000000"/>
+                <w:left w:val="none" w:sz="0" w:space="0" w:color="000000"/>
+                <w:right w:val="none" w:sz="0" w:space="0" w:color="000000"/>
+              </w:pBdr>
+              <w:spacing w:after="100" w:before="100" w:line="240"/>
+              <w:ind w:left="100" w:right="100" w:firstLine="0" w:firstLineChars="0"/>
+              <w:rPr>
+                <w:rFonts w:ascii="Helvetica" w:hAnsi="Helvetica" w:eastAsia="Helvetica" w:cs="Helvetica"/>
+                <w:i w:val="false"/>
+                <w:b w:val="false"/>
+                <w:u w:val="none"/>
+                <w:strike w:val="false"/>
+                <w:sz w:val="22"/>
+                <w:szCs w:val="22"/>
+                <w:color w:val="000000"/>
+              </w:rPr>
+            </w:pPr>
+            <w:r>
+              <w:rPr>
+                <w:rFonts w:ascii="Helvetica" w:hAnsi="Helvetica" w:eastAsia="Helvetica" w:cs="Helvetica"/>
+                <w:i w:val="false"/>
+                <w:b w:val="false"/>
+                <w:u w:val="none"/>
+                <w:strike w:val="false"/>
+                <w:sz w:val="22"/>
+                <w:szCs w:val="22"/>
+                <w:color w:val="000000"/>
+              </w:rPr>
+              <w:t xml:space="preserve">(0.03, 0.15)</w:t>
             </w:r>
           </w:p>
         </w:tc>
@@ -1264,31 +2138,60 @@
               </w:rPr>
               <w:t xml:space="preserve">0.09**</w:t>
             </w:r>
-            <w:r>
-              <w:rPr>
-                <w:rFonts w:ascii="Helvetica" w:hAnsi="Helvetica" w:eastAsia="Helvetica" w:cs="Helvetica"/>
-                <w:i w:val="false"/>
-                <w:b w:val="false"/>
-                <w:u w:val="none"/>
-                <w:strike w:val="false"/>
-                <w:sz w:val="22"/>
-                <w:szCs w:val="22"/>
-                <w:color w:val="000000"/>
-              </w:rPr>
-              <w:br/>
-            </w:r>
-            <w:r>
-              <w:rPr>
-                <w:rFonts w:ascii="Helvetica" w:hAnsi="Helvetica" w:eastAsia="Helvetica" w:cs="Helvetica"/>
-                <w:i w:val="false"/>
-                <w:b w:val="false"/>
-                <w:u w:val="none"/>
-                <w:strike w:val="false"/>
-                <w:sz w:val="22"/>
-                <w:szCs w:val="22"/>
-                <w:color w:val="000000"/>
-              </w:rPr>
-              <w:t xml:space="preserve">[0.03, 0.14]</w:t>
+          </w:p>
+        </w:tc>
+        <w:tc>
+          <w:tcPr>
+            <w:tcBorders>
+              <w:bottom w:val="none" w:sz="0" w:space="0" w:color="000000"/>
+              <w:top w:val="none" w:sz="0" w:space="0" w:color="000000"/>
+              <w:left w:val="none" w:sz="0" w:space="0" w:color="000000"/>
+              <w:right w:val="none" w:sz="0" w:space="0" w:color="000000"/>
+            </w:tcBorders>
+            <w:shd w:val="clear" w:color="auto" w:fill="FFFFFF"/>
+            <w:tcMar>
+              <w:top w:w="0" w:type="dxa"/>
+              <w:bottom w:w="0" w:type="dxa"/>
+              <w:left w:w="0" w:type="dxa"/>
+              <w:right w:w="0" w:type="dxa"/>
+            </w:tcMar>
+            <w:vAlign w:val="center"/>
+          </w:tcPr>
+          <w:p>
+            <w:pPr>
+              <w:pStyle w:val="Normal"/>
+              <w:jc w:val="left"/>
+              <w:pBdr>
+                <w:bottom w:val="none" w:sz="0" w:space="0" w:color="000000"/>
+                <w:top w:val="none" w:sz="0" w:space="0" w:color="000000"/>
+                <w:left w:val="none" w:sz="0" w:space="0" w:color="000000"/>
+                <w:right w:val="none" w:sz="0" w:space="0" w:color="000000"/>
+              </w:pBdr>
+              <w:spacing w:after="100" w:before="100" w:line="240"/>
+              <w:ind w:left="100" w:right="100" w:firstLine="0" w:firstLineChars="0"/>
+              <w:rPr>
+                <w:rFonts w:ascii="Helvetica" w:hAnsi="Helvetica" w:eastAsia="Helvetica" w:cs="Helvetica"/>
+                <w:i w:val="false"/>
+                <w:b w:val="false"/>
+                <w:u w:val="none"/>
+                <w:strike w:val="false"/>
+                <w:sz w:val="22"/>
+                <w:szCs w:val="22"/>
+                <w:color w:val="000000"/>
+              </w:rPr>
+            </w:pPr>
+            <w:r>
+              <w:rPr>
+                <w:rFonts w:ascii="Helvetica" w:hAnsi="Helvetica" w:eastAsia="Helvetica" w:cs="Helvetica"/>
+                <w:i w:val="false"/>
+                <w:b w:val="false"/>
+                <w:u w:val="none"/>
+                <w:strike w:val="false"/>
+                <w:sz w:val="22"/>
+                <w:szCs w:val="22"/>
+                <w:color w:val="000000"/>
+              </w:rPr>
+              <w:t xml:space="preserve">(0.03, 0.14)</w:t>
             </w:r>
           </w:p>
         </w:tc>
@@ -1345,31 +2248,60 @@
               </w:rPr>
               <w:t xml:space="preserve">0.09**</w:t>
             </w:r>
-            <w:r>
-              <w:rPr>
-                <w:rFonts w:ascii="Helvetica" w:hAnsi="Helvetica" w:eastAsia="Helvetica" w:cs="Helvetica"/>
-                <w:i w:val="false"/>
-                <w:b w:val="false"/>
-                <w:u w:val="none"/>
-                <w:strike w:val="false"/>
-                <w:sz w:val="22"/>
-                <w:szCs w:val="22"/>
-                <w:color w:val="000000"/>
-              </w:rPr>
-              <w:br/>
-            </w:r>
-            <w:r>
-              <w:rPr>
-                <w:rFonts w:ascii="Helvetica" w:hAnsi="Helvetica" w:eastAsia="Helvetica" w:cs="Helvetica"/>
-                <w:i w:val="false"/>
-                <w:b w:val="false"/>
-                <w:u w:val="none"/>
-                <w:strike w:val="false"/>
-                <w:sz w:val="22"/>
-                <w:szCs w:val="22"/>
-                <w:color w:val="000000"/>
-              </w:rPr>
-              <w:t xml:space="preserve">[0.03, 0.15]</w:t>
+          </w:p>
+        </w:tc>
+        <w:tc>
+          <w:tcPr>
+            <w:tcBorders>
+              <w:bottom w:val="none" w:sz="0" w:space="0" w:color="000000"/>
+              <w:top w:val="none" w:sz="0" w:space="0" w:color="000000"/>
+              <w:left w:val="none" w:sz="0" w:space="0" w:color="000000"/>
+              <w:right w:val="none" w:sz="0" w:space="0" w:color="000000"/>
+            </w:tcBorders>
+            <w:shd w:val="clear" w:color="auto" w:fill="FFFFFF"/>
+            <w:tcMar>
+              <w:top w:w="0" w:type="dxa"/>
+              <w:bottom w:w="0" w:type="dxa"/>
+              <w:left w:w="0" w:type="dxa"/>
+              <w:right w:w="0" w:type="dxa"/>
+            </w:tcMar>
+            <w:vAlign w:val="center"/>
+          </w:tcPr>
+          <w:p>
+            <w:pPr>
+              <w:pStyle w:val="Normal"/>
+              <w:jc w:val="left"/>
+              <w:pBdr>
+                <w:bottom w:val="none" w:sz="0" w:space="0" w:color="000000"/>
+                <w:top w:val="none" w:sz="0" w:space="0" w:color="000000"/>
+                <w:left w:val="none" w:sz="0" w:space="0" w:color="000000"/>
+                <w:right w:val="none" w:sz="0" w:space="0" w:color="000000"/>
+              </w:pBdr>
+              <w:spacing w:after="100" w:before="100" w:line="240"/>
+              <w:ind w:left="100" w:right="100" w:firstLine="0" w:firstLineChars="0"/>
+              <w:rPr>
+                <w:rFonts w:ascii="Helvetica" w:hAnsi="Helvetica" w:eastAsia="Helvetica" w:cs="Helvetica"/>
+                <w:i w:val="false"/>
+                <w:b w:val="false"/>
+                <w:u w:val="none"/>
+                <w:strike w:val="false"/>
+                <w:sz w:val="22"/>
+                <w:szCs w:val="22"/>
+                <w:color w:val="000000"/>
+              </w:rPr>
+            </w:pPr>
+            <w:r>
+              <w:rPr>
+                <w:rFonts w:ascii="Helvetica" w:hAnsi="Helvetica" w:eastAsia="Helvetica" w:cs="Helvetica"/>
+                <w:i w:val="false"/>
+                <w:b w:val="false"/>
+                <w:u w:val="none"/>
+                <w:strike w:val="false"/>
+                <w:sz w:val="22"/>
+                <w:szCs w:val="22"/>
+                <w:color w:val="000000"/>
+              </w:rPr>
+              <w:t xml:space="preserve">(0.03, 0.15)</w:t>
             </w:r>
           </w:p>
         </w:tc>
@@ -1426,31 +2358,60 @@
               </w:rPr>
               <w:t xml:space="preserve">0.03</w:t>
             </w:r>
-            <w:r>
-              <w:rPr>
-                <w:rFonts w:ascii="Helvetica" w:hAnsi="Helvetica" w:eastAsia="Helvetica" w:cs="Helvetica"/>
-                <w:i w:val="false"/>
-                <w:b w:val="false"/>
-                <w:u w:val="none"/>
-                <w:strike w:val="false"/>
-                <w:sz w:val="22"/>
-                <w:szCs w:val="22"/>
-                <w:color w:val="000000"/>
-              </w:rPr>
-              <w:br/>
-            </w:r>
-            <w:r>
-              <w:rPr>
-                <w:rFonts w:ascii="Helvetica" w:hAnsi="Helvetica" w:eastAsia="Helvetica" w:cs="Helvetica"/>
-                <w:i w:val="false"/>
-                <w:b w:val="false"/>
-                <w:u w:val="none"/>
-                <w:strike w:val="false"/>
-                <w:sz w:val="22"/>
-                <w:szCs w:val="22"/>
-                <w:color w:val="000000"/>
-              </w:rPr>
-              <w:t xml:space="preserve">[-0.02, 0.08]</w:t>
+          </w:p>
+        </w:tc>
+        <w:tc>
+          <w:tcPr>
+            <w:tcBorders>
+              <w:bottom w:val="none" w:sz="0" w:space="0" w:color="000000"/>
+              <w:top w:val="none" w:sz="0" w:space="0" w:color="000000"/>
+              <w:left w:val="none" w:sz="0" w:space="0" w:color="000000"/>
+              <w:right w:val="none" w:sz="0" w:space="0" w:color="000000"/>
+            </w:tcBorders>
+            <w:shd w:val="clear" w:color="auto" w:fill="FFFFFF"/>
+            <w:tcMar>
+              <w:top w:w="0" w:type="dxa"/>
+              <w:bottom w:w="0" w:type="dxa"/>
+              <w:left w:w="0" w:type="dxa"/>
+              <w:right w:w="0" w:type="dxa"/>
+            </w:tcMar>
+            <w:vAlign w:val="center"/>
+          </w:tcPr>
+          <w:p>
+            <w:pPr>
+              <w:pStyle w:val="Normal"/>
+              <w:jc w:val="left"/>
+              <w:pBdr>
+                <w:bottom w:val="none" w:sz="0" w:space="0" w:color="000000"/>
+                <w:top w:val="none" w:sz="0" w:space="0" w:color="000000"/>
+                <w:left w:val="none" w:sz="0" w:space="0" w:color="000000"/>
+                <w:right w:val="none" w:sz="0" w:space="0" w:color="000000"/>
+              </w:pBdr>
+              <w:spacing w:after="100" w:before="100" w:line="240"/>
+              <w:ind w:left="100" w:right="100" w:firstLine="0" w:firstLineChars="0"/>
+              <w:rPr>
+                <w:rFonts w:ascii="Helvetica" w:hAnsi="Helvetica" w:eastAsia="Helvetica" w:cs="Helvetica"/>
+                <w:i w:val="false"/>
+                <w:b w:val="false"/>
+                <w:u w:val="none"/>
+                <w:strike w:val="false"/>
+                <w:sz w:val="22"/>
+                <w:szCs w:val="22"/>
+                <w:color w:val="000000"/>
+              </w:rPr>
+            </w:pPr>
+            <w:r>
+              <w:rPr>
+                <w:rFonts w:ascii="Helvetica" w:hAnsi="Helvetica" w:eastAsia="Helvetica" w:cs="Helvetica"/>
+                <w:i w:val="false"/>
+                <w:b w:val="false"/>
+                <w:u w:val="none"/>
+                <w:strike w:val="false"/>
+                <w:sz w:val="22"/>
+                <w:szCs w:val="22"/>
+                <w:color w:val="000000"/>
+              </w:rPr>
+              <w:t xml:space="preserve">(-0.02, 0.08)</w:t>
             </w:r>
           </w:p>
         </w:tc>
@@ -1610,31 +2571,60 @@
               </w:rPr>
               <w:t xml:space="preserve">0.01</w:t>
             </w:r>
-            <w:r>
-              <w:rPr>
-                <w:rFonts w:ascii="Helvetica" w:hAnsi="Helvetica" w:eastAsia="Helvetica" w:cs="Helvetica"/>
-                <w:i w:val="false"/>
-                <w:b w:val="false"/>
-                <w:u w:val="none"/>
-                <w:strike w:val="false"/>
-                <w:sz w:val="22"/>
-                <w:szCs w:val="22"/>
-                <w:color w:val="000000"/>
-              </w:rPr>
-              <w:br/>
-            </w:r>
-            <w:r>
-              <w:rPr>
-                <w:rFonts w:ascii="Helvetica" w:hAnsi="Helvetica" w:eastAsia="Helvetica" w:cs="Helvetica"/>
-                <w:i w:val="false"/>
-                <w:b w:val="false"/>
-                <w:u w:val="none"/>
-                <w:strike w:val="false"/>
-                <w:sz w:val="22"/>
-                <w:szCs w:val="22"/>
-                <w:color w:val="000000"/>
-              </w:rPr>
-              <w:t xml:space="preserve">[-0.17, 0.19]</w:t>
+          </w:p>
+        </w:tc>
+        <w:tc>
+          <w:tcPr>
+            <w:tcBorders>
+              <w:bottom w:val="none" w:sz="0" w:space="0" w:color="000000"/>
+              <w:top w:val="none" w:sz="0" w:space="0" w:color="000000"/>
+              <w:left w:val="none" w:sz="0" w:space="0" w:color="000000"/>
+              <w:right w:val="none" w:sz="0" w:space="0" w:color="000000"/>
+            </w:tcBorders>
+            <w:shd w:val="clear" w:color="auto" w:fill="FFFFFF"/>
+            <w:tcMar>
+              <w:top w:w="0" w:type="dxa"/>
+              <w:bottom w:w="0" w:type="dxa"/>
+              <w:left w:w="0" w:type="dxa"/>
+              <w:right w:w="0" w:type="dxa"/>
+            </w:tcMar>
+            <w:vAlign w:val="center"/>
+          </w:tcPr>
+          <w:p>
+            <w:pPr>
+              <w:pStyle w:val="Normal"/>
+              <w:jc w:val="left"/>
+              <w:pBdr>
+                <w:bottom w:val="none" w:sz="0" w:space="0" w:color="000000"/>
+                <w:top w:val="none" w:sz="0" w:space="0" w:color="000000"/>
+                <w:left w:val="none" w:sz="0" w:space="0" w:color="000000"/>
+                <w:right w:val="none" w:sz="0" w:space="0" w:color="000000"/>
+              </w:pBdr>
+              <w:spacing w:after="100" w:before="100" w:line="240"/>
+              <w:ind w:left="100" w:right="100" w:firstLine="0" w:firstLineChars="0"/>
+              <w:rPr>
+                <w:rFonts w:ascii="Helvetica" w:hAnsi="Helvetica" w:eastAsia="Helvetica" w:cs="Helvetica"/>
+                <w:i w:val="false"/>
+                <w:b w:val="false"/>
+                <w:u w:val="none"/>
+                <w:strike w:val="false"/>
+                <w:sz w:val="22"/>
+                <w:szCs w:val="22"/>
+                <w:color w:val="000000"/>
+              </w:rPr>
+            </w:pPr>
+            <w:r>
+              <w:rPr>
+                <w:rFonts w:ascii="Helvetica" w:hAnsi="Helvetica" w:eastAsia="Helvetica" w:cs="Helvetica"/>
+                <w:i w:val="false"/>
+                <w:b w:val="false"/>
+                <w:u w:val="none"/>
+                <w:strike w:val="false"/>
+                <w:sz w:val="22"/>
+                <w:szCs w:val="22"/>
+                <w:color w:val="000000"/>
+              </w:rPr>
+              <w:t xml:space="preserve">(-0.17, 0.19)</w:t>
             </w:r>
           </w:p>
         </w:tc>
@@ -1691,31 +2681,60 @@
               </w:rPr>
               <w:t xml:space="preserve">-0.02</w:t>
             </w:r>
-            <w:r>
-              <w:rPr>
-                <w:rFonts w:ascii="Helvetica" w:hAnsi="Helvetica" w:eastAsia="Helvetica" w:cs="Helvetica"/>
-                <w:i w:val="false"/>
-                <w:b w:val="false"/>
-                <w:u w:val="none"/>
-                <w:strike w:val="false"/>
-                <w:sz w:val="22"/>
-                <w:szCs w:val="22"/>
-                <w:color w:val="000000"/>
-              </w:rPr>
-              <w:br/>
-            </w:r>
-            <w:r>
-              <w:rPr>
-                <w:rFonts w:ascii="Helvetica" w:hAnsi="Helvetica" w:eastAsia="Helvetica" w:cs="Helvetica"/>
-                <w:i w:val="false"/>
-                <w:b w:val="false"/>
-                <w:u w:val="none"/>
-                <w:strike w:val="false"/>
-                <w:sz w:val="22"/>
-                <w:szCs w:val="22"/>
-                <w:color w:val="000000"/>
-              </w:rPr>
-              <w:t xml:space="preserve">[-0.19, 0.15]</w:t>
+          </w:p>
+        </w:tc>
+        <w:tc>
+          <w:tcPr>
+            <w:tcBorders>
+              <w:bottom w:val="none" w:sz="0" w:space="0" w:color="000000"/>
+              <w:top w:val="none" w:sz="0" w:space="0" w:color="000000"/>
+              <w:left w:val="none" w:sz="0" w:space="0" w:color="000000"/>
+              <w:right w:val="none" w:sz="0" w:space="0" w:color="000000"/>
+            </w:tcBorders>
+            <w:shd w:val="clear" w:color="auto" w:fill="FFFFFF"/>
+            <w:tcMar>
+              <w:top w:w="0" w:type="dxa"/>
+              <w:bottom w:w="0" w:type="dxa"/>
+              <w:left w:w="0" w:type="dxa"/>
+              <w:right w:w="0" w:type="dxa"/>
+            </w:tcMar>
+            <w:vAlign w:val="center"/>
+          </w:tcPr>
+          <w:p>
+            <w:pPr>
+              <w:pStyle w:val="Normal"/>
+              <w:jc w:val="left"/>
+              <w:pBdr>
+                <w:bottom w:val="none" w:sz="0" w:space="0" w:color="000000"/>
+                <w:top w:val="none" w:sz="0" w:space="0" w:color="000000"/>
+                <w:left w:val="none" w:sz="0" w:space="0" w:color="000000"/>
+                <w:right w:val="none" w:sz="0" w:space="0" w:color="000000"/>
+              </w:pBdr>
+              <w:spacing w:after="100" w:before="100" w:line="240"/>
+              <w:ind w:left="100" w:right="100" w:firstLine="0" w:firstLineChars="0"/>
+              <w:rPr>
+                <w:rFonts w:ascii="Helvetica" w:hAnsi="Helvetica" w:eastAsia="Helvetica" w:cs="Helvetica"/>
+                <w:i w:val="false"/>
+                <w:b w:val="false"/>
+                <w:u w:val="none"/>
+                <w:strike w:val="false"/>
+                <w:sz w:val="22"/>
+                <w:szCs w:val="22"/>
+                <w:color w:val="000000"/>
+              </w:rPr>
+            </w:pPr>
+            <w:r>
+              <w:rPr>
+                <w:rFonts w:ascii="Helvetica" w:hAnsi="Helvetica" w:eastAsia="Helvetica" w:cs="Helvetica"/>
+                <w:i w:val="false"/>
+                <w:b w:val="false"/>
+                <w:u w:val="none"/>
+                <w:strike w:val="false"/>
+                <w:sz w:val="22"/>
+                <w:szCs w:val="22"/>
+                <w:color w:val="000000"/>
+              </w:rPr>
+              <w:t xml:space="preserve">(-0.19, 0.15)</w:t>
             </w:r>
           </w:p>
         </w:tc>
@@ -1772,31 +2791,60 @@
               </w:rPr>
               <w:t xml:space="preserve">-0.02</w:t>
             </w:r>
-            <w:r>
-              <w:rPr>
-                <w:rFonts w:ascii="Helvetica" w:hAnsi="Helvetica" w:eastAsia="Helvetica" w:cs="Helvetica"/>
-                <w:i w:val="false"/>
-                <w:b w:val="false"/>
-                <w:u w:val="none"/>
-                <w:strike w:val="false"/>
-                <w:sz w:val="22"/>
-                <w:szCs w:val="22"/>
-                <w:color w:val="000000"/>
-              </w:rPr>
-              <w:br/>
-            </w:r>
-            <w:r>
-              <w:rPr>
-                <w:rFonts w:ascii="Helvetica" w:hAnsi="Helvetica" w:eastAsia="Helvetica" w:cs="Helvetica"/>
-                <w:i w:val="false"/>
-                <w:b w:val="false"/>
-                <w:u w:val="none"/>
-                <w:strike w:val="false"/>
-                <w:sz w:val="22"/>
-                <w:szCs w:val="22"/>
-                <w:color w:val="000000"/>
-              </w:rPr>
-              <w:t xml:space="preserve">[-0.20, 0.15]</w:t>
+          </w:p>
+        </w:tc>
+        <w:tc>
+          <w:tcPr>
+            <w:tcBorders>
+              <w:bottom w:val="none" w:sz="0" w:space="0" w:color="000000"/>
+              <w:top w:val="none" w:sz="0" w:space="0" w:color="000000"/>
+              <w:left w:val="none" w:sz="0" w:space="0" w:color="000000"/>
+              <w:right w:val="none" w:sz="0" w:space="0" w:color="000000"/>
+            </w:tcBorders>
+            <w:shd w:val="clear" w:color="auto" w:fill="FFFFFF"/>
+            <w:tcMar>
+              <w:top w:w="0" w:type="dxa"/>
+              <w:bottom w:w="0" w:type="dxa"/>
+              <w:left w:w="0" w:type="dxa"/>
+              <w:right w:w="0" w:type="dxa"/>
+            </w:tcMar>
+            <w:vAlign w:val="center"/>
+          </w:tcPr>
+          <w:p>
+            <w:pPr>
+              <w:pStyle w:val="Normal"/>
+              <w:jc w:val="left"/>
+              <w:pBdr>
+                <w:bottom w:val="none" w:sz="0" w:space="0" w:color="000000"/>
+                <w:top w:val="none" w:sz="0" w:space="0" w:color="000000"/>
+                <w:left w:val="none" w:sz="0" w:space="0" w:color="000000"/>
+                <w:right w:val="none" w:sz="0" w:space="0" w:color="000000"/>
+              </w:pBdr>
+              <w:spacing w:after="100" w:before="100" w:line="240"/>
+              <w:ind w:left="100" w:right="100" w:firstLine="0" w:firstLineChars="0"/>
+              <w:rPr>
+                <w:rFonts w:ascii="Helvetica" w:hAnsi="Helvetica" w:eastAsia="Helvetica" w:cs="Helvetica"/>
+                <w:i w:val="false"/>
+                <w:b w:val="false"/>
+                <w:u w:val="none"/>
+                <w:strike w:val="false"/>
+                <w:sz w:val="22"/>
+                <w:szCs w:val="22"/>
+                <w:color w:val="000000"/>
+              </w:rPr>
+            </w:pPr>
+            <w:r>
+              <w:rPr>
+                <w:rFonts w:ascii="Helvetica" w:hAnsi="Helvetica" w:eastAsia="Helvetica" w:cs="Helvetica"/>
+                <w:i w:val="false"/>
+                <w:b w:val="false"/>
+                <w:u w:val="none"/>
+                <w:strike w:val="false"/>
+                <w:sz w:val="22"/>
+                <w:szCs w:val="22"/>
+                <w:color w:val="000000"/>
+              </w:rPr>
+              <w:t xml:space="preserve">(-0.20, 0.15)</w:t>
             </w:r>
           </w:p>
         </w:tc>
@@ -1853,31 +2901,60 @@
               </w:rPr>
               <w:t xml:space="preserve">-0.02</w:t>
             </w:r>
-            <w:r>
-              <w:rPr>
-                <w:rFonts w:ascii="Helvetica" w:hAnsi="Helvetica" w:eastAsia="Helvetica" w:cs="Helvetica"/>
-                <w:i w:val="false"/>
-                <w:b w:val="false"/>
-                <w:u w:val="none"/>
-                <w:strike w:val="false"/>
-                <w:sz w:val="22"/>
-                <w:szCs w:val="22"/>
-                <w:color w:val="000000"/>
-              </w:rPr>
-              <w:br/>
-            </w:r>
-            <w:r>
-              <w:rPr>
-                <w:rFonts w:ascii="Helvetica" w:hAnsi="Helvetica" w:eastAsia="Helvetica" w:cs="Helvetica"/>
-                <w:i w:val="false"/>
-                <w:b w:val="false"/>
-                <w:u w:val="none"/>
-                <w:strike w:val="false"/>
-                <w:sz w:val="22"/>
-                <w:szCs w:val="22"/>
-                <w:color w:val="000000"/>
-              </w:rPr>
-              <w:t xml:space="preserve">[-0.20, 0.15]</w:t>
+          </w:p>
+        </w:tc>
+        <w:tc>
+          <w:tcPr>
+            <w:tcBorders>
+              <w:bottom w:val="none" w:sz="0" w:space="0" w:color="000000"/>
+              <w:top w:val="none" w:sz="0" w:space="0" w:color="000000"/>
+              <w:left w:val="none" w:sz="0" w:space="0" w:color="000000"/>
+              <w:right w:val="none" w:sz="0" w:space="0" w:color="000000"/>
+            </w:tcBorders>
+            <w:shd w:val="clear" w:color="auto" w:fill="FFFFFF"/>
+            <w:tcMar>
+              <w:top w:w="0" w:type="dxa"/>
+              <w:bottom w:w="0" w:type="dxa"/>
+              <w:left w:w="0" w:type="dxa"/>
+              <w:right w:w="0" w:type="dxa"/>
+            </w:tcMar>
+            <w:vAlign w:val="center"/>
+          </w:tcPr>
+          <w:p>
+            <w:pPr>
+              <w:pStyle w:val="Normal"/>
+              <w:jc w:val="left"/>
+              <w:pBdr>
+                <w:bottom w:val="none" w:sz="0" w:space="0" w:color="000000"/>
+                <w:top w:val="none" w:sz="0" w:space="0" w:color="000000"/>
+                <w:left w:val="none" w:sz="0" w:space="0" w:color="000000"/>
+                <w:right w:val="none" w:sz="0" w:space="0" w:color="000000"/>
+              </w:pBdr>
+              <w:spacing w:after="100" w:before="100" w:line="240"/>
+              <w:ind w:left="100" w:right="100" w:firstLine="0" w:firstLineChars="0"/>
+              <w:rPr>
+                <w:rFonts w:ascii="Helvetica" w:hAnsi="Helvetica" w:eastAsia="Helvetica" w:cs="Helvetica"/>
+                <w:i w:val="false"/>
+                <w:b w:val="false"/>
+                <w:u w:val="none"/>
+                <w:strike w:val="false"/>
+                <w:sz w:val="22"/>
+                <w:szCs w:val="22"/>
+                <w:color w:val="000000"/>
+              </w:rPr>
+            </w:pPr>
+            <w:r>
+              <w:rPr>
+                <w:rFonts w:ascii="Helvetica" w:hAnsi="Helvetica" w:eastAsia="Helvetica" w:cs="Helvetica"/>
+                <w:i w:val="false"/>
+                <w:b w:val="false"/>
+                <w:u w:val="none"/>
+                <w:strike w:val="false"/>
+                <w:sz w:val="22"/>
+                <w:szCs w:val="22"/>
+                <w:color w:val="000000"/>
+              </w:rPr>
+              <w:t xml:space="preserve">(-0.20, 0.15)</w:t>
             </w:r>
           </w:p>
         </w:tc>
@@ -1934,31 +3011,60 @@
               </w:rPr>
               <w:t xml:space="preserve">-0.02</w:t>
             </w:r>
-            <w:r>
-              <w:rPr>
-                <w:rFonts w:ascii="Helvetica" w:hAnsi="Helvetica" w:eastAsia="Helvetica" w:cs="Helvetica"/>
-                <w:i w:val="false"/>
-                <w:b w:val="false"/>
-                <w:u w:val="none"/>
-                <w:strike w:val="false"/>
-                <w:sz w:val="22"/>
-                <w:szCs w:val="22"/>
-                <w:color w:val="000000"/>
-              </w:rPr>
-              <w:br/>
-            </w:r>
-            <w:r>
-              <w:rPr>
-                <w:rFonts w:ascii="Helvetica" w:hAnsi="Helvetica" w:eastAsia="Helvetica" w:cs="Helvetica"/>
-                <w:i w:val="false"/>
-                <w:b w:val="false"/>
-                <w:u w:val="none"/>
-                <w:strike w:val="false"/>
-                <w:sz w:val="22"/>
-                <w:szCs w:val="22"/>
-                <w:color w:val="000000"/>
-              </w:rPr>
-              <w:t xml:space="preserve">[-0.17, 0.13]</w:t>
+          </w:p>
+        </w:tc>
+        <w:tc>
+          <w:tcPr>
+            <w:tcBorders>
+              <w:bottom w:val="none" w:sz="0" w:space="0" w:color="000000"/>
+              <w:top w:val="none" w:sz="0" w:space="0" w:color="000000"/>
+              <w:left w:val="none" w:sz="0" w:space="0" w:color="000000"/>
+              <w:right w:val="none" w:sz="0" w:space="0" w:color="000000"/>
+            </w:tcBorders>
+            <w:shd w:val="clear" w:color="auto" w:fill="FFFFFF"/>
+            <w:tcMar>
+              <w:top w:w="0" w:type="dxa"/>
+              <w:bottom w:w="0" w:type="dxa"/>
+              <w:left w:w="0" w:type="dxa"/>
+              <w:right w:w="0" w:type="dxa"/>
+            </w:tcMar>
+            <w:vAlign w:val="center"/>
+          </w:tcPr>
+          <w:p>
+            <w:pPr>
+              <w:pStyle w:val="Normal"/>
+              <w:jc w:val="left"/>
+              <w:pBdr>
+                <w:bottom w:val="none" w:sz="0" w:space="0" w:color="000000"/>
+                <w:top w:val="none" w:sz="0" w:space="0" w:color="000000"/>
+                <w:left w:val="none" w:sz="0" w:space="0" w:color="000000"/>
+                <w:right w:val="none" w:sz="0" w:space="0" w:color="000000"/>
+              </w:pBdr>
+              <w:spacing w:after="100" w:before="100" w:line="240"/>
+              <w:ind w:left="100" w:right="100" w:firstLine="0" w:firstLineChars="0"/>
+              <w:rPr>
+                <w:rFonts w:ascii="Helvetica" w:hAnsi="Helvetica" w:eastAsia="Helvetica" w:cs="Helvetica"/>
+                <w:i w:val="false"/>
+                <w:b w:val="false"/>
+                <w:u w:val="none"/>
+                <w:strike w:val="false"/>
+                <w:sz w:val="22"/>
+                <w:szCs w:val="22"/>
+                <w:color w:val="000000"/>
+              </w:rPr>
+            </w:pPr>
+            <w:r>
+              <w:rPr>
+                <w:rFonts w:ascii="Helvetica" w:hAnsi="Helvetica" w:eastAsia="Helvetica" w:cs="Helvetica"/>
+                <w:i w:val="false"/>
+                <w:b w:val="false"/>
+                <w:u w:val="none"/>
+                <w:strike w:val="false"/>
+                <w:sz w:val="22"/>
+                <w:szCs w:val="22"/>
+                <w:color w:val="000000"/>
+              </w:rPr>
+              <w:t xml:space="preserve">(-0.17, 0.13)</w:t>
             </w:r>
           </w:p>
         </w:tc>
@@ -2118,31 +3224,60 @@
               </w:rPr>
               <w:t xml:space="preserve">0.01</w:t>
             </w:r>
-            <w:r>
-              <w:rPr>
-                <w:rFonts w:ascii="Helvetica" w:hAnsi="Helvetica" w:eastAsia="Helvetica" w:cs="Helvetica"/>
-                <w:i w:val="false"/>
-                <w:b w:val="false"/>
-                <w:u w:val="none"/>
-                <w:strike w:val="false"/>
-                <w:sz w:val="22"/>
-                <w:szCs w:val="22"/>
-                <w:color w:val="000000"/>
-              </w:rPr>
-              <w:br/>
-            </w:r>
-            <w:r>
-              <w:rPr>
-                <w:rFonts w:ascii="Helvetica" w:hAnsi="Helvetica" w:eastAsia="Helvetica" w:cs="Helvetica"/>
-                <w:i w:val="false"/>
-                <w:b w:val="false"/>
-                <w:u w:val="none"/>
-                <w:strike w:val="false"/>
-                <w:sz w:val="22"/>
-                <w:szCs w:val="22"/>
-                <w:color w:val="000000"/>
-              </w:rPr>
-              <w:t xml:space="preserve">[-0.11, 0.12]</w:t>
+          </w:p>
+        </w:tc>
+        <w:tc>
+          <w:tcPr>
+            <w:tcBorders>
+              <w:bottom w:val="none" w:sz="0" w:space="0" w:color="000000"/>
+              <w:top w:val="none" w:sz="0" w:space="0" w:color="000000"/>
+              <w:left w:val="none" w:sz="0" w:space="0" w:color="000000"/>
+              <w:right w:val="none" w:sz="0" w:space="0" w:color="000000"/>
+            </w:tcBorders>
+            <w:shd w:val="clear" w:color="auto" w:fill="FFFFFF"/>
+            <w:tcMar>
+              <w:top w:w="0" w:type="dxa"/>
+              <w:bottom w:w="0" w:type="dxa"/>
+              <w:left w:w="0" w:type="dxa"/>
+              <w:right w:w="0" w:type="dxa"/>
+            </w:tcMar>
+            <w:vAlign w:val="center"/>
+          </w:tcPr>
+          <w:p>
+            <w:pPr>
+              <w:pStyle w:val="Normal"/>
+              <w:jc w:val="left"/>
+              <w:pBdr>
+                <w:bottom w:val="none" w:sz="0" w:space="0" w:color="000000"/>
+                <w:top w:val="none" w:sz="0" w:space="0" w:color="000000"/>
+                <w:left w:val="none" w:sz="0" w:space="0" w:color="000000"/>
+                <w:right w:val="none" w:sz="0" w:space="0" w:color="000000"/>
+              </w:pBdr>
+              <w:spacing w:after="100" w:before="100" w:line="240"/>
+              <w:ind w:left="100" w:right="100" w:firstLine="0" w:firstLineChars="0"/>
+              <w:rPr>
+                <w:rFonts w:ascii="Helvetica" w:hAnsi="Helvetica" w:eastAsia="Helvetica" w:cs="Helvetica"/>
+                <w:i w:val="false"/>
+                <w:b w:val="false"/>
+                <w:u w:val="none"/>
+                <w:strike w:val="false"/>
+                <w:sz w:val="22"/>
+                <w:szCs w:val="22"/>
+                <w:color w:val="000000"/>
+              </w:rPr>
+            </w:pPr>
+            <w:r>
+              <w:rPr>
+                <w:rFonts w:ascii="Helvetica" w:hAnsi="Helvetica" w:eastAsia="Helvetica" w:cs="Helvetica"/>
+                <w:i w:val="false"/>
+                <w:b w:val="false"/>
+                <w:u w:val="none"/>
+                <w:strike w:val="false"/>
+                <w:sz w:val="22"/>
+                <w:szCs w:val="22"/>
+                <w:color w:val="000000"/>
+              </w:rPr>
+              <w:t xml:space="preserve">(-0.11, 0.12)</w:t>
             </w:r>
           </w:p>
         </w:tc>
@@ -2199,31 +3334,280 @@
               </w:rPr>
               <w:t xml:space="preserve">-0.01</w:t>
             </w:r>
-            <w:r>
-              <w:rPr>
-                <w:rFonts w:ascii="Helvetica" w:hAnsi="Helvetica" w:eastAsia="Helvetica" w:cs="Helvetica"/>
-                <w:i w:val="false"/>
-                <w:b w:val="false"/>
-                <w:u w:val="none"/>
-                <w:strike w:val="false"/>
-                <w:sz w:val="22"/>
-                <w:szCs w:val="22"/>
-                <w:color w:val="000000"/>
-              </w:rPr>
-              <w:br/>
-            </w:r>
-            <w:r>
-              <w:rPr>
-                <w:rFonts w:ascii="Helvetica" w:hAnsi="Helvetica" w:eastAsia="Helvetica" w:cs="Helvetica"/>
-                <w:i w:val="false"/>
-                <w:b w:val="false"/>
-                <w:u w:val="none"/>
-                <w:strike w:val="false"/>
-                <w:sz w:val="22"/>
-                <w:szCs w:val="22"/>
-                <w:color w:val="000000"/>
-              </w:rPr>
-              <w:t xml:space="preserve">[-0.12, 0.09]</w:t>
+          </w:p>
+        </w:tc>
+        <w:tc>
+          <w:tcPr>
+            <w:tcBorders>
+              <w:bottom w:val="none" w:sz="0" w:space="0" w:color="000000"/>
+              <w:top w:val="none" w:sz="0" w:space="0" w:color="000000"/>
+              <w:left w:val="none" w:sz="0" w:space="0" w:color="000000"/>
+              <w:right w:val="none" w:sz="0" w:space="0" w:color="000000"/>
+            </w:tcBorders>
+            <w:shd w:val="clear" w:color="auto" w:fill="FFFFFF"/>
+            <w:tcMar>
+              <w:top w:w="0" w:type="dxa"/>
+              <w:bottom w:w="0" w:type="dxa"/>
+              <w:left w:w="0" w:type="dxa"/>
+              <w:right w:w="0" w:type="dxa"/>
+            </w:tcMar>
+            <w:vAlign w:val="center"/>
+          </w:tcPr>
+          <w:p>
+            <w:pPr>
+              <w:pStyle w:val="Normal"/>
+              <w:jc w:val="left"/>
+              <w:pBdr>
+                <w:bottom w:val="none" w:sz="0" w:space="0" w:color="000000"/>
+                <w:top w:val="none" w:sz="0" w:space="0" w:color="000000"/>
+                <w:left w:val="none" w:sz="0" w:space="0" w:color="000000"/>
+                <w:right w:val="none" w:sz="0" w:space="0" w:color="000000"/>
+              </w:pBdr>
+              <w:spacing w:after="100" w:before="100" w:line="240"/>
+              <w:ind w:left="100" w:right="100" w:firstLine="0" w:firstLineChars="0"/>
+              <w:rPr>
+                <w:rFonts w:ascii="Helvetica" w:hAnsi="Helvetica" w:eastAsia="Helvetica" w:cs="Helvetica"/>
+                <w:i w:val="false"/>
+                <w:b w:val="false"/>
+                <w:u w:val="none"/>
+                <w:strike w:val="false"/>
+                <w:sz w:val="22"/>
+                <w:szCs w:val="22"/>
+                <w:color w:val="000000"/>
+              </w:rPr>
+            </w:pPr>
+            <w:r>
+              <w:rPr>
+                <w:rFonts w:ascii="Helvetica" w:hAnsi="Helvetica" w:eastAsia="Helvetica" w:cs="Helvetica"/>
+                <w:i w:val="false"/>
+                <w:b w:val="false"/>
+                <w:u w:val="none"/>
+                <w:strike w:val="false"/>
+                <w:sz w:val="22"/>
+                <w:szCs w:val="22"/>
+                <w:color w:val="000000"/>
+              </w:rPr>
+              <w:t xml:space="preserve">(-0.12, 0.09)</w:t>
+            </w:r>
+          </w:p>
+        </w:tc>
+        <w:tc>
+          <w:tcPr>
+            <w:tcBorders>
+              <w:bottom w:val="none" w:sz="0" w:space="0" w:color="000000"/>
+              <w:top w:val="none" w:sz="0" w:space="0" w:color="000000"/>
+              <w:left w:val="none" w:sz="0" w:space="0" w:color="000000"/>
+              <w:right w:val="none" w:sz="0" w:space="0" w:color="000000"/>
+            </w:tcBorders>
+            <w:shd w:val="clear" w:color="auto" w:fill="FFFFFF"/>
+            <w:tcMar>
+              <w:top w:w="0" w:type="dxa"/>
+              <w:bottom w:w="0" w:type="dxa"/>
+              <w:left w:w="0" w:type="dxa"/>
+              <w:right w:w="0" w:type="dxa"/>
+            </w:tcMar>
+            <w:vAlign w:val="center"/>
+          </w:tcPr>
+          <w:p>
+            <w:pPr>
+              <w:pStyle w:val="Normal"/>
+              <w:jc w:val="left"/>
+              <w:pBdr>
+                <w:bottom w:val="none" w:sz="0" w:space="0" w:color="000000"/>
+                <w:top w:val="none" w:sz="0" w:space="0" w:color="000000"/>
+                <w:left w:val="none" w:sz="0" w:space="0" w:color="000000"/>
+                <w:right w:val="none" w:sz="0" w:space="0" w:color="000000"/>
+              </w:pBdr>
+              <w:spacing w:after="100" w:before="100" w:line="240"/>
+              <w:ind w:left="100" w:right="100" w:firstLine="0" w:firstLineChars="0"/>
+              <w:rPr>
+                <w:rFonts w:ascii="Helvetica" w:hAnsi="Helvetica" w:eastAsia="Helvetica" w:cs="Helvetica"/>
+                <w:i w:val="false"/>
+                <w:b w:val="false"/>
+                <w:u w:val="none"/>
+                <w:strike w:val="false"/>
+                <w:sz w:val="22"/>
+                <w:szCs w:val="22"/>
+                <w:color w:val="000000"/>
+              </w:rPr>
+            </w:pPr>
+            <w:r>
+              <w:rPr>
+                <w:rFonts w:ascii="Helvetica" w:hAnsi="Helvetica" w:eastAsia="Helvetica" w:cs="Helvetica"/>
+                <w:i w:val="false"/>
+                <w:b w:val="false"/>
+                <w:u w:val="none"/>
+                <w:strike w:val="false"/>
+                <w:sz w:val="22"/>
+                <w:szCs w:val="22"/>
+                <w:color w:val="000000"/>
+              </w:rPr>
+              <w:t xml:space="preserve">-0.01</w:t>
+            </w:r>
+          </w:p>
+        </w:tc>
+        <w:tc>
+          <w:tcPr>
+            <w:tcBorders>
+              <w:bottom w:val="none" w:sz="0" w:space="0" w:color="000000"/>
+              <w:top w:val="none" w:sz="0" w:space="0" w:color="000000"/>
+              <w:left w:val="none" w:sz="0" w:space="0" w:color="000000"/>
+              <w:right w:val="none" w:sz="0" w:space="0" w:color="000000"/>
+            </w:tcBorders>
+            <w:shd w:val="clear" w:color="auto" w:fill="FFFFFF"/>
+            <w:tcMar>
+              <w:top w:w="0" w:type="dxa"/>
+              <w:bottom w:w="0" w:type="dxa"/>
+              <w:left w:w="0" w:type="dxa"/>
+              <w:right w:w="0" w:type="dxa"/>
+            </w:tcMar>
+            <w:vAlign w:val="center"/>
+          </w:tcPr>
+          <w:p>
+            <w:pPr>
+              <w:pStyle w:val="Normal"/>
+              <w:jc w:val="left"/>
+              <w:pBdr>
+                <w:bottom w:val="none" w:sz="0" w:space="0" w:color="000000"/>
+                <w:top w:val="none" w:sz="0" w:space="0" w:color="000000"/>
+                <w:left w:val="none" w:sz="0" w:space="0" w:color="000000"/>
+                <w:right w:val="none" w:sz="0" w:space="0" w:color="000000"/>
+              </w:pBdr>
+              <w:spacing w:after="100" w:before="100" w:line="240"/>
+              <w:ind w:left="100" w:right="100" w:firstLine="0" w:firstLineChars="0"/>
+              <w:rPr>
+                <w:rFonts w:ascii="Helvetica" w:hAnsi="Helvetica" w:eastAsia="Helvetica" w:cs="Helvetica"/>
+                <w:i w:val="false"/>
+                <w:b w:val="false"/>
+                <w:u w:val="none"/>
+                <w:strike w:val="false"/>
+                <w:sz w:val="22"/>
+                <w:szCs w:val="22"/>
+                <w:color w:val="000000"/>
+              </w:rPr>
+            </w:pPr>
+            <w:r>
+              <w:rPr>
+                <w:rFonts w:ascii="Helvetica" w:hAnsi="Helvetica" w:eastAsia="Helvetica" w:cs="Helvetica"/>
+                <w:i w:val="false"/>
+                <w:b w:val="false"/>
+                <w:u w:val="none"/>
+                <w:strike w:val="false"/>
+                <w:sz w:val="22"/>
+                <w:szCs w:val="22"/>
+                <w:color w:val="000000"/>
+              </w:rPr>
+              <w:t xml:space="preserve">(-0.12, 0.09)</w:t>
+            </w:r>
+          </w:p>
+        </w:tc>
+        <w:tc>
+          <w:tcPr>
+            <w:tcBorders>
+              <w:bottom w:val="none" w:sz="0" w:space="0" w:color="000000"/>
+              <w:top w:val="none" w:sz="0" w:space="0" w:color="000000"/>
+              <w:left w:val="none" w:sz="0" w:space="0" w:color="000000"/>
+              <w:right w:val="none" w:sz="0" w:space="0" w:color="000000"/>
+            </w:tcBorders>
+            <w:shd w:val="clear" w:color="auto" w:fill="FFFFFF"/>
+            <w:tcMar>
+              <w:top w:w="0" w:type="dxa"/>
+              <w:bottom w:w="0" w:type="dxa"/>
+              <w:left w:w="0" w:type="dxa"/>
+              <w:right w:w="0" w:type="dxa"/>
+            </w:tcMar>
+            <w:vAlign w:val="center"/>
+          </w:tcPr>
+          <w:p>
+            <w:pPr>
+              <w:pStyle w:val="Normal"/>
+              <w:jc w:val="left"/>
+              <w:pBdr>
+                <w:bottom w:val="none" w:sz="0" w:space="0" w:color="000000"/>
+                <w:top w:val="none" w:sz="0" w:space="0" w:color="000000"/>
+                <w:left w:val="none" w:sz="0" w:space="0" w:color="000000"/>
+                <w:right w:val="none" w:sz="0" w:space="0" w:color="000000"/>
+              </w:pBdr>
+              <w:spacing w:after="100" w:before="100" w:line="240"/>
+              <w:ind w:left="100" w:right="100" w:firstLine="0" w:firstLineChars="0"/>
+              <w:rPr>
+                <w:rFonts w:ascii="Helvetica" w:hAnsi="Helvetica" w:eastAsia="Helvetica" w:cs="Helvetica"/>
+                <w:i w:val="false"/>
+                <w:b w:val="false"/>
+                <w:u w:val="none"/>
+                <w:strike w:val="false"/>
+                <w:sz w:val="22"/>
+                <w:szCs w:val="22"/>
+                <w:color w:val="000000"/>
+              </w:rPr>
+            </w:pPr>
+            <w:r>
+              <w:rPr>
+                <w:rFonts w:ascii="Helvetica" w:hAnsi="Helvetica" w:eastAsia="Helvetica" w:cs="Helvetica"/>
+                <w:i w:val="false"/>
+                <w:b w:val="false"/>
+                <w:u w:val="none"/>
+                <w:strike w:val="false"/>
+                <w:sz w:val="22"/>
+                <w:szCs w:val="22"/>
+                <w:color w:val="000000"/>
+              </w:rPr>
+              <w:t xml:space="preserve">-0.01</w:t>
+            </w:r>
+          </w:p>
+        </w:tc>
+        <w:tc>
+          <w:tcPr>
+            <w:tcBorders>
+              <w:bottom w:val="none" w:sz="0" w:space="0" w:color="000000"/>
+              <w:top w:val="none" w:sz="0" w:space="0" w:color="000000"/>
+              <w:left w:val="none" w:sz="0" w:space="0" w:color="000000"/>
+              <w:right w:val="none" w:sz="0" w:space="0" w:color="000000"/>
+            </w:tcBorders>
+            <w:shd w:val="clear" w:color="auto" w:fill="FFFFFF"/>
+            <w:tcMar>
+              <w:top w:w="0" w:type="dxa"/>
+              <w:bottom w:w="0" w:type="dxa"/>
+              <w:left w:w="0" w:type="dxa"/>
+              <w:right w:w="0" w:type="dxa"/>
+            </w:tcMar>
+            <w:vAlign w:val="center"/>
+          </w:tcPr>
+          <w:p>
+            <w:pPr>
+              <w:pStyle w:val="Normal"/>
+              <w:jc w:val="left"/>
+              <w:pBdr>
+                <w:bottom w:val="none" w:sz="0" w:space="0" w:color="000000"/>
+                <w:top w:val="none" w:sz="0" w:space="0" w:color="000000"/>
+                <w:left w:val="none" w:sz="0" w:space="0" w:color="000000"/>
+                <w:right w:val="none" w:sz="0" w:space="0" w:color="000000"/>
+              </w:pBdr>
+              <w:spacing w:after="100" w:before="100" w:line="240"/>
+              <w:ind w:left="100" w:right="100" w:firstLine="0" w:firstLineChars="0"/>
+              <w:rPr>
+                <w:rFonts w:ascii="Helvetica" w:hAnsi="Helvetica" w:eastAsia="Helvetica" w:cs="Helvetica"/>
+                <w:i w:val="false"/>
+                <w:b w:val="false"/>
+                <w:u w:val="none"/>
+                <w:strike w:val="false"/>
+                <w:sz w:val="22"/>
+                <w:szCs w:val="22"/>
+                <w:color w:val="000000"/>
+              </w:rPr>
+            </w:pPr>
+            <w:r>
+              <w:rPr>
+                <w:rFonts w:ascii="Helvetica" w:hAnsi="Helvetica" w:eastAsia="Helvetica" w:cs="Helvetica"/>
+                <w:i w:val="false"/>
+                <w:b w:val="false"/>
+                <w:u w:val="none"/>
+                <w:strike w:val="false"/>
+                <w:sz w:val="22"/>
+                <w:szCs w:val="22"/>
+                <w:color w:val="000000"/>
+              </w:rPr>
+              <w:t xml:space="preserve">(-0.12, 0.09)</w:t>
             </w:r>
           </w:p>
         </w:tc>
@@ -2280,193 +3664,60 @@
               </w:rPr>
               <w:t xml:space="preserve">-0.02</w:t>
             </w:r>
-            <w:r>
-              <w:rPr>
-                <w:rFonts w:ascii="Helvetica" w:hAnsi="Helvetica" w:eastAsia="Helvetica" w:cs="Helvetica"/>
-                <w:i w:val="false"/>
-                <w:b w:val="false"/>
-                <w:u w:val="none"/>
-                <w:strike w:val="false"/>
-                <w:sz w:val="22"/>
-                <w:szCs w:val="22"/>
-                <w:color w:val="000000"/>
-              </w:rPr>
-              <w:br/>
-            </w:r>
-            <w:r>
-              <w:rPr>
-                <w:rFonts w:ascii="Helvetica" w:hAnsi="Helvetica" w:eastAsia="Helvetica" w:cs="Helvetica"/>
-                <w:i w:val="false"/>
-                <w:b w:val="false"/>
-                <w:u w:val="none"/>
-                <w:strike w:val="false"/>
-                <w:sz w:val="22"/>
-                <w:szCs w:val="22"/>
-                <w:color w:val="000000"/>
-              </w:rPr>
-              <w:t xml:space="preserve">[-0.12, 0.09]</w:t>
-            </w:r>
-          </w:p>
-        </w:tc>
-        <w:tc>
-          <w:tcPr>
-            <w:tcBorders>
-              <w:bottom w:val="none" w:sz="0" w:space="0" w:color="000000"/>
-              <w:top w:val="none" w:sz="0" w:space="0" w:color="000000"/>
-              <w:left w:val="none" w:sz="0" w:space="0" w:color="000000"/>
-              <w:right w:val="none" w:sz="0" w:space="0" w:color="000000"/>
-            </w:tcBorders>
-            <w:shd w:val="clear" w:color="auto" w:fill="FFFFFF"/>
-            <w:tcMar>
-              <w:top w:w="0" w:type="dxa"/>
-              <w:bottom w:w="0" w:type="dxa"/>
-              <w:left w:w="0" w:type="dxa"/>
-              <w:right w:w="0" w:type="dxa"/>
-            </w:tcMar>
-            <w:vAlign w:val="center"/>
-          </w:tcPr>
-          <w:p>
-            <w:pPr>
-              <w:pStyle w:val="Normal"/>
-              <w:jc w:val="left"/>
-              <w:pBdr>
-                <w:bottom w:val="none" w:sz="0" w:space="0" w:color="000000"/>
-                <w:top w:val="none" w:sz="0" w:space="0" w:color="000000"/>
-                <w:left w:val="none" w:sz="0" w:space="0" w:color="000000"/>
-                <w:right w:val="none" w:sz="0" w:space="0" w:color="000000"/>
-              </w:pBdr>
-              <w:spacing w:after="100" w:before="100" w:line="240"/>
-              <w:ind w:left="100" w:right="100" w:firstLine="0" w:firstLineChars="0"/>
-              <w:rPr>
-                <w:rFonts w:ascii="Helvetica" w:hAnsi="Helvetica" w:eastAsia="Helvetica" w:cs="Helvetica"/>
-                <w:i w:val="false"/>
-                <w:b w:val="false"/>
-                <w:u w:val="none"/>
-                <w:strike w:val="false"/>
-                <w:sz w:val="22"/>
-                <w:szCs w:val="22"/>
-                <w:color w:val="000000"/>
-              </w:rPr>
-            </w:pPr>
-            <w:r>
-              <w:rPr>
-                <w:rFonts w:ascii="Helvetica" w:hAnsi="Helvetica" w:eastAsia="Helvetica" w:cs="Helvetica"/>
-                <w:i w:val="false"/>
-                <w:b w:val="false"/>
-                <w:u w:val="none"/>
-                <w:strike w:val="false"/>
-                <w:sz w:val="22"/>
-                <w:szCs w:val="22"/>
-                <w:color w:val="000000"/>
-              </w:rPr>
-              <w:t xml:space="preserve">-0.02</w:t>
-            </w:r>
-            <w:r>
-              <w:rPr>
-                <w:rFonts w:ascii="Helvetica" w:hAnsi="Helvetica" w:eastAsia="Helvetica" w:cs="Helvetica"/>
-                <w:i w:val="false"/>
-                <w:b w:val="false"/>
-                <w:u w:val="none"/>
-                <w:strike w:val="false"/>
-                <w:sz w:val="22"/>
-                <w:szCs w:val="22"/>
-                <w:color w:val="000000"/>
-              </w:rPr>
-              <w:br/>
-            </w:r>
-            <w:r>
-              <w:rPr>
-                <w:rFonts w:ascii="Helvetica" w:hAnsi="Helvetica" w:eastAsia="Helvetica" w:cs="Helvetica"/>
-                <w:i w:val="false"/>
-                <w:b w:val="false"/>
-                <w:u w:val="none"/>
-                <w:strike w:val="false"/>
-                <w:sz w:val="22"/>
-                <w:szCs w:val="22"/>
-                <w:color w:val="000000"/>
-              </w:rPr>
-              <w:t xml:space="preserve">[-0.12, 0.09]</w:t>
-            </w:r>
-          </w:p>
-        </w:tc>
-        <w:tc>
-          <w:tcPr>
-            <w:tcBorders>
-              <w:bottom w:val="none" w:sz="0" w:space="0" w:color="000000"/>
-              <w:top w:val="none" w:sz="0" w:space="0" w:color="000000"/>
-              <w:left w:val="none" w:sz="0" w:space="0" w:color="000000"/>
-              <w:right w:val="none" w:sz="0" w:space="0" w:color="000000"/>
-            </w:tcBorders>
-            <w:shd w:val="clear" w:color="auto" w:fill="FFFFFF"/>
-            <w:tcMar>
-              <w:top w:w="0" w:type="dxa"/>
-              <w:bottom w:w="0" w:type="dxa"/>
-              <w:left w:w="0" w:type="dxa"/>
-              <w:right w:w="0" w:type="dxa"/>
-            </w:tcMar>
-            <w:vAlign w:val="center"/>
-          </w:tcPr>
-          <w:p>
-            <w:pPr>
-              <w:pStyle w:val="Normal"/>
-              <w:jc w:val="left"/>
-              <w:pBdr>
-                <w:bottom w:val="none" w:sz="0" w:space="0" w:color="000000"/>
-                <w:top w:val="none" w:sz="0" w:space="0" w:color="000000"/>
-                <w:left w:val="none" w:sz="0" w:space="0" w:color="000000"/>
-                <w:right w:val="none" w:sz="0" w:space="0" w:color="000000"/>
-              </w:pBdr>
-              <w:spacing w:after="100" w:before="100" w:line="240"/>
-              <w:ind w:left="100" w:right="100" w:firstLine="0" w:firstLineChars="0"/>
-              <w:rPr>
-                <w:rFonts w:ascii="Helvetica" w:hAnsi="Helvetica" w:eastAsia="Helvetica" w:cs="Helvetica"/>
-                <w:i w:val="false"/>
-                <w:b w:val="false"/>
-                <w:u w:val="none"/>
-                <w:strike w:val="false"/>
-                <w:sz w:val="22"/>
-                <w:szCs w:val="22"/>
-                <w:color w:val="000000"/>
-              </w:rPr>
-            </w:pPr>
-            <w:r>
-              <w:rPr>
-                <w:rFonts w:ascii="Helvetica" w:hAnsi="Helvetica" w:eastAsia="Helvetica" w:cs="Helvetica"/>
-                <w:i w:val="false"/>
-                <w:b w:val="false"/>
-                <w:u w:val="none"/>
-                <w:strike w:val="false"/>
-                <w:sz w:val="22"/>
-                <w:szCs w:val="22"/>
-                <w:color w:val="000000"/>
-              </w:rPr>
-              <w:t xml:space="preserve">-0.02</w:t>
-            </w:r>
-            <w:r>
-              <w:rPr>
-                <w:rFonts w:ascii="Helvetica" w:hAnsi="Helvetica" w:eastAsia="Helvetica" w:cs="Helvetica"/>
-                <w:i w:val="false"/>
-                <w:b w:val="false"/>
-                <w:u w:val="none"/>
-                <w:strike w:val="false"/>
-                <w:sz w:val="22"/>
-                <w:szCs w:val="22"/>
-                <w:color w:val="000000"/>
-              </w:rPr>
-              <w:br/>
-            </w:r>
-            <w:r>
-              <w:rPr>
-                <w:rFonts w:ascii="Helvetica" w:hAnsi="Helvetica" w:eastAsia="Helvetica" w:cs="Helvetica"/>
-                <w:i w:val="false"/>
-                <w:b w:val="false"/>
-                <w:u w:val="none"/>
-                <w:strike w:val="false"/>
-                <w:sz w:val="22"/>
-                <w:szCs w:val="22"/>
-                <w:color w:val="000000"/>
-              </w:rPr>
-              <w:t xml:space="preserve">[-0.11, 0.07]</w:t>
+          </w:p>
+        </w:tc>
+        <w:tc>
+          <w:tcPr>
+            <w:tcBorders>
+              <w:bottom w:val="none" w:sz="0" w:space="0" w:color="000000"/>
+              <w:top w:val="none" w:sz="0" w:space="0" w:color="000000"/>
+              <w:left w:val="none" w:sz="0" w:space="0" w:color="000000"/>
+              <w:right w:val="none" w:sz="0" w:space="0" w:color="000000"/>
+            </w:tcBorders>
+            <w:shd w:val="clear" w:color="auto" w:fill="FFFFFF"/>
+            <w:tcMar>
+              <w:top w:w="0" w:type="dxa"/>
+              <w:bottom w:w="0" w:type="dxa"/>
+              <w:left w:w="0" w:type="dxa"/>
+              <w:right w:w="0" w:type="dxa"/>
+            </w:tcMar>
+            <w:vAlign w:val="center"/>
+          </w:tcPr>
+          <w:p>
+            <w:pPr>
+              <w:pStyle w:val="Normal"/>
+              <w:jc w:val="left"/>
+              <w:pBdr>
+                <w:bottom w:val="none" w:sz="0" w:space="0" w:color="000000"/>
+                <w:top w:val="none" w:sz="0" w:space="0" w:color="000000"/>
+                <w:left w:val="none" w:sz="0" w:space="0" w:color="000000"/>
+                <w:right w:val="none" w:sz="0" w:space="0" w:color="000000"/>
+              </w:pBdr>
+              <w:spacing w:after="100" w:before="100" w:line="240"/>
+              <w:ind w:left="100" w:right="100" w:firstLine="0" w:firstLineChars="0"/>
+              <w:rPr>
+                <w:rFonts w:ascii="Helvetica" w:hAnsi="Helvetica" w:eastAsia="Helvetica" w:cs="Helvetica"/>
+                <w:i w:val="false"/>
+                <w:b w:val="false"/>
+                <w:u w:val="none"/>
+                <w:strike w:val="false"/>
+                <w:sz w:val="22"/>
+                <w:szCs w:val="22"/>
+                <w:color w:val="000000"/>
+              </w:rPr>
+            </w:pPr>
+            <w:r>
+              <w:rPr>
+                <w:rFonts w:ascii="Helvetica" w:hAnsi="Helvetica" w:eastAsia="Helvetica" w:cs="Helvetica"/>
+                <w:i w:val="false"/>
+                <w:b w:val="false"/>
+                <w:u w:val="none"/>
+                <w:strike w:val="false"/>
+                <w:sz w:val="22"/>
+                <w:szCs w:val="22"/>
+                <w:color w:val="000000"/>
+              </w:rPr>
+              <w:t xml:space="preserve">(-0.11, 0.07)</w:t>
             </w:r>
           </w:p>
         </w:tc>
@@ -2639,112 +3890,170 @@
               </w:rPr>
               <w:t xml:space="preserve">0.06+</w:t>
             </w:r>
-            <w:r>
-              <w:rPr>
-                <w:rFonts w:ascii="Helvetica" w:hAnsi="Helvetica" w:eastAsia="Helvetica" w:cs="Helvetica"/>
-                <w:i w:val="false"/>
-                <w:b w:val="false"/>
-                <w:u w:val="none"/>
-                <w:strike w:val="false"/>
-                <w:sz w:val="22"/>
-                <w:szCs w:val="22"/>
-                <w:color w:val="000000"/>
-              </w:rPr>
-              <w:br/>
-            </w:r>
-            <w:r>
-              <w:rPr>
-                <w:rFonts w:ascii="Helvetica" w:hAnsi="Helvetica" w:eastAsia="Helvetica" w:cs="Helvetica"/>
-                <w:i w:val="false"/>
-                <w:b w:val="false"/>
-                <w:u w:val="none"/>
-                <w:strike w:val="false"/>
-                <w:sz w:val="22"/>
-                <w:szCs w:val="22"/>
-                <w:color w:val="000000"/>
-              </w:rPr>
-              <w:t xml:space="preserve">[-0.01, 0.12]</w:t>
-            </w:r>
-          </w:p>
-        </w:tc>
-        <w:tc>
-          <w:tcPr>
-            <w:tcBorders>
-              <w:bottom w:val="none" w:sz="0" w:space="0" w:color="000000"/>
-              <w:top w:val="none" w:sz="0" w:space="0" w:color="000000"/>
-              <w:left w:val="none" w:sz="0" w:space="0" w:color="000000"/>
-              <w:right w:val="none" w:sz="0" w:space="0" w:color="000000"/>
-            </w:tcBorders>
-            <w:shd w:val="clear" w:color="auto" w:fill="FFFFFF"/>
-            <w:tcMar>
-              <w:top w:w="0" w:type="dxa"/>
-              <w:bottom w:w="0" w:type="dxa"/>
-              <w:left w:w="0" w:type="dxa"/>
-              <w:right w:w="0" w:type="dxa"/>
-            </w:tcMar>
-            <w:vAlign w:val="center"/>
-          </w:tcPr>
-          <w:p>
-            <w:pPr>
-              <w:pStyle w:val="Normal"/>
-              <w:jc w:val="left"/>
-              <w:pBdr>
-                <w:bottom w:val="none" w:sz="0" w:space="0" w:color="000000"/>
-                <w:top w:val="none" w:sz="0" w:space="0" w:color="000000"/>
-                <w:left w:val="none" w:sz="0" w:space="0" w:color="000000"/>
-                <w:right w:val="none" w:sz="0" w:space="0" w:color="000000"/>
-              </w:pBdr>
-              <w:spacing w:after="100" w:before="100" w:line="240"/>
-              <w:ind w:left="100" w:right="100" w:firstLine="0" w:firstLineChars="0"/>
-              <w:rPr>
-                <w:rFonts w:ascii="Helvetica" w:hAnsi="Helvetica" w:eastAsia="Helvetica" w:cs="Helvetica"/>
-                <w:i w:val="false"/>
-                <w:b w:val="false"/>
-                <w:u w:val="none"/>
-                <w:strike w:val="false"/>
-                <w:sz w:val="22"/>
-                <w:szCs w:val="22"/>
-                <w:color w:val="000000"/>
-              </w:rPr>
-            </w:pPr>
-            <w:r>
-              <w:rPr>
-                <w:rFonts w:ascii="Helvetica" w:hAnsi="Helvetica" w:eastAsia="Helvetica" w:cs="Helvetica"/>
-                <w:i w:val="false"/>
-                <w:b w:val="false"/>
-                <w:u w:val="none"/>
-                <w:strike w:val="false"/>
-                <w:sz w:val="22"/>
-                <w:szCs w:val="22"/>
-                <w:color w:val="000000"/>
-              </w:rPr>
-              <w:t xml:space="preserve">0.03</w:t>
-            </w:r>
-            <w:r>
-              <w:rPr>
-                <w:rFonts w:ascii="Helvetica" w:hAnsi="Helvetica" w:eastAsia="Helvetica" w:cs="Helvetica"/>
-                <w:i w:val="false"/>
-                <w:b w:val="false"/>
-                <w:u w:val="none"/>
-                <w:strike w:val="false"/>
-                <w:sz w:val="22"/>
-                <w:szCs w:val="22"/>
-                <w:color w:val="000000"/>
-              </w:rPr>
-              <w:br/>
-            </w:r>
-            <w:r>
-              <w:rPr>
-                <w:rFonts w:ascii="Helvetica" w:hAnsi="Helvetica" w:eastAsia="Helvetica" w:cs="Helvetica"/>
-                <w:i w:val="false"/>
-                <w:b w:val="false"/>
-                <w:u w:val="none"/>
-                <w:strike w:val="false"/>
-                <w:sz w:val="22"/>
-                <w:szCs w:val="22"/>
-                <w:color w:val="000000"/>
-              </w:rPr>
-              <w:t xml:space="preserve">[-0.03, 0.10]</w:t>
+          </w:p>
+        </w:tc>
+        <w:tc>
+          <w:tcPr>
+            <w:tcBorders>
+              <w:bottom w:val="none" w:sz="0" w:space="0" w:color="000000"/>
+              <w:top w:val="none" w:sz="0" w:space="0" w:color="000000"/>
+              <w:left w:val="none" w:sz="0" w:space="0" w:color="000000"/>
+              <w:right w:val="none" w:sz="0" w:space="0" w:color="000000"/>
+            </w:tcBorders>
+            <w:shd w:val="clear" w:color="auto" w:fill="FFFFFF"/>
+            <w:tcMar>
+              <w:top w:w="0" w:type="dxa"/>
+              <w:bottom w:w="0" w:type="dxa"/>
+              <w:left w:w="0" w:type="dxa"/>
+              <w:right w:w="0" w:type="dxa"/>
+            </w:tcMar>
+            <w:vAlign w:val="center"/>
+          </w:tcPr>
+          <w:p>
+            <w:pPr>
+              <w:pStyle w:val="Normal"/>
+              <w:jc w:val="left"/>
+              <w:pBdr>
+                <w:bottom w:val="none" w:sz="0" w:space="0" w:color="000000"/>
+                <w:top w:val="none" w:sz="0" w:space="0" w:color="000000"/>
+                <w:left w:val="none" w:sz="0" w:space="0" w:color="000000"/>
+                <w:right w:val="none" w:sz="0" w:space="0" w:color="000000"/>
+              </w:pBdr>
+              <w:spacing w:after="100" w:before="100" w:line="240"/>
+              <w:ind w:left="100" w:right="100" w:firstLine="0" w:firstLineChars="0"/>
+              <w:rPr>
+                <w:rFonts w:ascii="Helvetica" w:hAnsi="Helvetica" w:eastAsia="Helvetica" w:cs="Helvetica"/>
+                <w:i w:val="false"/>
+                <w:b w:val="false"/>
+                <w:u w:val="none"/>
+                <w:strike w:val="false"/>
+                <w:sz w:val="22"/>
+                <w:szCs w:val="22"/>
+                <w:color w:val="000000"/>
+              </w:rPr>
+            </w:pPr>
+            <w:r>
+              <w:rPr>
+                <w:rFonts w:ascii="Helvetica" w:hAnsi="Helvetica" w:eastAsia="Helvetica" w:cs="Helvetica"/>
+                <w:i w:val="false"/>
+                <w:b w:val="false"/>
+                <w:u w:val="none"/>
+                <w:strike w:val="false"/>
+                <w:sz w:val="22"/>
+                <w:szCs w:val="22"/>
+                <w:color w:val="000000"/>
+              </w:rPr>
+              <w:t xml:space="preserve">(-0.01, 0.12)</w:t>
+            </w:r>
+          </w:p>
+        </w:tc>
+        <w:tc>
+          <w:tcPr>
+            <w:tcBorders>
+              <w:bottom w:val="none" w:sz="0" w:space="0" w:color="000000"/>
+              <w:top w:val="none" w:sz="0" w:space="0" w:color="000000"/>
+              <w:left w:val="none" w:sz="0" w:space="0" w:color="000000"/>
+              <w:right w:val="none" w:sz="0" w:space="0" w:color="000000"/>
+            </w:tcBorders>
+            <w:shd w:val="clear" w:color="auto" w:fill="FFFFFF"/>
+            <w:tcMar>
+              <w:top w:w="0" w:type="dxa"/>
+              <w:bottom w:w="0" w:type="dxa"/>
+              <w:left w:w="0" w:type="dxa"/>
+              <w:right w:w="0" w:type="dxa"/>
+            </w:tcMar>
+            <w:vAlign w:val="center"/>
+          </w:tcPr>
+          <w:p>
+            <w:pPr>
+              <w:pStyle w:val="Normal"/>
+              <w:jc w:val="left"/>
+              <w:pBdr>
+                <w:bottom w:val="none" w:sz="0" w:space="0" w:color="000000"/>
+                <w:top w:val="none" w:sz="0" w:space="0" w:color="000000"/>
+                <w:left w:val="none" w:sz="0" w:space="0" w:color="000000"/>
+                <w:right w:val="none" w:sz="0" w:space="0" w:color="000000"/>
+              </w:pBdr>
+              <w:spacing w:after="100" w:before="100" w:line="240"/>
+              <w:ind w:left="100" w:right="100" w:firstLine="0" w:firstLineChars="0"/>
+              <w:rPr>
+                <w:rFonts w:ascii="Helvetica" w:hAnsi="Helvetica" w:eastAsia="Helvetica" w:cs="Helvetica"/>
+                <w:i w:val="false"/>
+                <w:b w:val="false"/>
+                <w:u w:val="none"/>
+                <w:strike w:val="false"/>
+                <w:sz w:val="22"/>
+                <w:szCs w:val="22"/>
+                <w:color w:val="000000"/>
+              </w:rPr>
+            </w:pPr>
+            <w:r>
+              <w:rPr>
+                <w:rFonts w:ascii="Helvetica" w:hAnsi="Helvetica" w:eastAsia="Helvetica" w:cs="Helvetica"/>
+                <w:i w:val="false"/>
+                <w:b w:val="false"/>
+                <w:u w:val="none"/>
+                <w:strike w:val="false"/>
+                <w:sz w:val="22"/>
+                <w:szCs w:val="22"/>
+                <w:color w:val="000000"/>
+              </w:rPr>
+              <w:t xml:space="preserve">0.04</w:t>
+            </w:r>
+          </w:p>
+        </w:tc>
+        <w:tc>
+          <w:tcPr>
+            <w:tcBorders>
+              <w:bottom w:val="none" w:sz="0" w:space="0" w:color="000000"/>
+              <w:top w:val="none" w:sz="0" w:space="0" w:color="000000"/>
+              <w:left w:val="none" w:sz="0" w:space="0" w:color="000000"/>
+              <w:right w:val="none" w:sz="0" w:space="0" w:color="000000"/>
+            </w:tcBorders>
+            <w:shd w:val="clear" w:color="auto" w:fill="FFFFFF"/>
+            <w:tcMar>
+              <w:top w:w="0" w:type="dxa"/>
+              <w:bottom w:w="0" w:type="dxa"/>
+              <w:left w:w="0" w:type="dxa"/>
+              <w:right w:w="0" w:type="dxa"/>
+            </w:tcMar>
+            <w:vAlign w:val="center"/>
+          </w:tcPr>
+          <w:p>
+            <w:pPr>
+              <w:pStyle w:val="Normal"/>
+              <w:jc w:val="left"/>
+              <w:pBdr>
+                <w:bottom w:val="none" w:sz="0" w:space="0" w:color="000000"/>
+                <w:top w:val="none" w:sz="0" w:space="0" w:color="000000"/>
+                <w:left w:val="none" w:sz="0" w:space="0" w:color="000000"/>
+                <w:right w:val="none" w:sz="0" w:space="0" w:color="000000"/>
+              </w:pBdr>
+              <w:spacing w:after="100" w:before="100" w:line="240"/>
+              <w:ind w:left="100" w:right="100" w:firstLine="0" w:firstLineChars="0"/>
+              <w:rPr>
+                <w:rFonts w:ascii="Helvetica" w:hAnsi="Helvetica" w:eastAsia="Helvetica" w:cs="Helvetica"/>
+                <w:i w:val="false"/>
+                <w:b w:val="false"/>
+                <w:u w:val="none"/>
+                <w:strike w:val="false"/>
+                <w:sz w:val="22"/>
+                <w:szCs w:val="22"/>
+                <w:color w:val="000000"/>
+              </w:rPr>
+            </w:pPr>
+            <w:r>
+              <w:rPr>
+                <w:rFonts w:ascii="Helvetica" w:hAnsi="Helvetica" w:eastAsia="Helvetica" w:cs="Helvetica"/>
+                <w:i w:val="false"/>
+                <w:b w:val="false"/>
+                <w:u w:val="none"/>
+                <w:strike w:val="false"/>
+                <w:sz w:val="22"/>
+                <w:szCs w:val="22"/>
+                <w:color w:val="000000"/>
+              </w:rPr>
+              <w:t xml:space="preserve">(-0.03, 0.10)</w:t>
             </w:r>
           </w:p>
         </w:tc>
@@ -2801,31 +4110,60 @@
               </w:rPr>
               <w:t xml:space="preserve">0.05</w:t>
             </w:r>
-            <w:r>
-              <w:rPr>
-                <w:rFonts w:ascii="Helvetica" w:hAnsi="Helvetica" w:eastAsia="Helvetica" w:cs="Helvetica"/>
-                <w:i w:val="false"/>
-                <w:b w:val="false"/>
-                <w:u w:val="none"/>
-                <w:strike w:val="false"/>
-                <w:sz w:val="22"/>
-                <w:szCs w:val="22"/>
-                <w:color w:val="000000"/>
-              </w:rPr>
-              <w:br/>
-            </w:r>
-            <w:r>
-              <w:rPr>
-                <w:rFonts w:ascii="Helvetica" w:hAnsi="Helvetica" w:eastAsia="Helvetica" w:cs="Helvetica"/>
-                <w:i w:val="false"/>
-                <w:b w:val="false"/>
-                <w:u w:val="none"/>
-                <w:strike w:val="false"/>
-                <w:sz w:val="22"/>
-                <w:szCs w:val="22"/>
-                <w:color w:val="000000"/>
-              </w:rPr>
-              <w:t xml:space="preserve">[-0.02, 0.11]</w:t>
+          </w:p>
+        </w:tc>
+        <w:tc>
+          <w:tcPr>
+            <w:tcBorders>
+              <w:bottom w:val="none" w:sz="0" w:space="0" w:color="000000"/>
+              <w:top w:val="none" w:sz="0" w:space="0" w:color="000000"/>
+              <w:left w:val="none" w:sz="0" w:space="0" w:color="000000"/>
+              <w:right w:val="none" w:sz="0" w:space="0" w:color="000000"/>
+            </w:tcBorders>
+            <w:shd w:val="clear" w:color="auto" w:fill="FFFFFF"/>
+            <w:tcMar>
+              <w:top w:w="0" w:type="dxa"/>
+              <w:bottom w:w="0" w:type="dxa"/>
+              <w:left w:w="0" w:type="dxa"/>
+              <w:right w:w="0" w:type="dxa"/>
+            </w:tcMar>
+            <w:vAlign w:val="center"/>
+          </w:tcPr>
+          <w:p>
+            <w:pPr>
+              <w:pStyle w:val="Normal"/>
+              <w:jc w:val="left"/>
+              <w:pBdr>
+                <w:bottom w:val="none" w:sz="0" w:space="0" w:color="000000"/>
+                <w:top w:val="none" w:sz="0" w:space="0" w:color="000000"/>
+                <w:left w:val="none" w:sz="0" w:space="0" w:color="000000"/>
+                <w:right w:val="none" w:sz="0" w:space="0" w:color="000000"/>
+              </w:pBdr>
+              <w:spacing w:after="100" w:before="100" w:line="240"/>
+              <w:ind w:left="100" w:right="100" w:firstLine="0" w:firstLineChars="0"/>
+              <w:rPr>
+                <w:rFonts w:ascii="Helvetica" w:hAnsi="Helvetica" w:eastAsia="Helvetica" w:cs="Helvetica"/>
+                <w:i w:val="false"/>
+                <w:b w:val="false"/>
+                <w:u w:val="none"/>
+                <w:strike w:val="false"/>
+                <w:sz w:val="22"/>
+                <w:szCs w:val="22"/>
+                <w:color w:val="000000"/>
+              </w:rPr>
+            </w:pPr>
+            <w:r>
+              <w:rPr>
+                <w:rFonts w:ascii="Helvetica" w:hAnsi="Helvetica" w:eastAsia="Helvetica" w:cs="Helvetica"/>
+                <w:i w:val="false"/>
+                <w:b w:val="false"/>
+                <w:u w:val="none"/>
+                <w:strike w:val="false"/>
+                <w:sz w:val="22"/>
+                <w:szCs w:val="22"/>
+                <w:color w:val="000000"/>
+              </w:rPr>
+              <w:t xml:space="preserve">(-0.01, 0.12)</w:t>
             </w:r>
           </w:p>
         </w:tc>
@@ -2882,31 +4220,60 @@
               </w:rPr>
               <w:t xml:space="preserve">0.04</w:t>
             </w:r>
-            <w:r>
-              <w:rPr>
-                <w:rFonts w:ascii="Helvetica" w:hAnsi="Helvetica" w:eastAsia="Helvetica" w:cs="Helvetica"/>
-                <w:i w:val="false"/>
-                <w:b w:val="false"/>
-                <w:u w:val="none"/>
-                <w:strike w:val="false"/>
-                <w:sz w:val="22"/>
-                <w:szCs w:val="22"/>
-                <w:color w:val="000000"/>
-              </w:rPr>
-              <w:br/>
-            </w:r>
-            <w:r>
-              <w:rPr>
-                <w:rFonts w:ascii="Helvetica" w:hAnsi="Helvetica" w:eastAsia="Helvetica" w:cs="Helvetica"/>
-                <w:i w:val="false"/>
-                <w:b w:val="false"/>
-                <w:u w:val="none"/>
-                <w:strike w:val="false"/>
-                <w:sz w:val="22"/>
-                <w:szCs w:val="22"/>
-                <w:color w:val="000000"/>
-              </w:rPr>
-              <w:t xml:space="preserve">[-0.02, 0.11]</w:t>
+          </w:p>
+        </w:tc>
+        <w:tc>
+          <w:tcPr>
+            <w:tcBorders>
+              <w:bottom w:val="none" w:sz="0" w:space="0" w:color="000000"/>
+              <w:top w:val="none" w:sz="0" w:space="0" w:color="000000"/>
+              <w:left w:val="none" w:sz="0" w:space="0" w:color="000000"/>
+              <w:right w:val="none" w:sz="0" w:space="0" w:color="000000"/>
+            </w:tcBorders>
+            <w:shd w:val="clear" w:color="auto" w:fill="FFFFFF"/>
+            <w:tcMar>
+              <w:top w:w="0" w:type="dxa"/>
+              <w:bottom w:w="0" w:type="dxa"/>
+              <w:left w:w="0" w:type="dxa"/>
+              <w:right w:w="0" w:type="dxa"/>
+            </w:tcMar>
+            <w:vAlign w:val="center"/>
+          </w:tcPr>
+          <w:p>
+            <w:pPr>
+              <w:pStyle w:val="Normal"/>
+              <w:jc w:val="left"/>
+              <w:pBdr>
+                <w:bottom w:val="none" w:sz="0" w:space="0" w:color="000000"/>
+                <w:top w:val="none" w:sz="0" w:space="0" w:color="000000"/>
+                <w:left w:val="none" w:sz="0" w:space="0" w:color="000000"/>
+                <w:right w:val="none" w:sz="0" w:space="0" w:color="000000"/>
+              </w:pBdr>
+              <w:spacing w:after="100" w:before="100" w:line="240"/>
+              <w:ind w:left="100" w:right="100" w:firstLine="0" w:firstLineChars="0"/>
+              <w:rPr>
+                <w:rFonts w:ascii="Helvetica" w:hAnsi="Helvetica" w:eastAsia="Helvetica" w:cs="Helvetica"/>
+                <w:i w:val="false"/>
+                <w:b w:val="false"/>
+                <w:u w:val="none"/>
+                <w:strike w:val="false"/>
+                <w:sz w:val="22"/>
+                <w:szCs w:val="22"/>
+                <w:color w:val="000000"/>
+              </w:rPr>
+            </w:pPr>
+            <w:r>
+              <w:rPr>
+                <w:rFonts w:ascii="Helvetica" w:hAnsi="Helvetica" w:eastAsia="Helvetica" w:cs="Helvetica"/>
+                <w:i w:val="false"/>
+                <w:b w:val="false"/>
+                <w:u w:val="none"/>
+                <w:strike w:val="false"/>
+                <w:sz w:val="22"/>
+                <w:szCs w:val="22"/>
+                <w:color w:val="000000"/>
+              </w:rPr>
+              <w:t xml:space="preserve">(-0.02, 0.11)</w:t>
             </w:r>
           </w:p>
         </w:tc>
@@ -2963,31 +4330,60 @@
               </w:rPr>
               <w:t xml:space="preserve">0.00</w:t>
             </w:r>
-            <w:r>
-              <w:rPr>
-                <w:rFonts w:ascii="Helvetica" w:hAnsi="Helvetica" w:eastAsia="Helvetica" w:cs="Helvetica"/>
-                <w:i w:val="false"/>
-                <w:b w:val="false"/>
-                <w:u w:val="none"/>
-                <w:strike w:val="false"/>
-                <w:sz w:val="22"/>
-                <w:szCs w:val="22"/>
-                <w:color w:val="000000"/>
-              </w:rPr>
-              <w:br/>
-            </w:r>
-            <w:r>
-              <w:rPr>
-                <w:rFonts w:ascii="Helvetica" w:hAnsi="Helvetica" w:eastAsia="Helvetica" w:cs="Helvetica"/>
-                <w:i w:val="false"/>
-                <w:b w:val="false"/>
-                <w:u w:val="none"/>
-                <w:strike w:val="false"/>
-                <w:sz w:val="22"/>
-                <w:szCs w:val="22"/>
-                <w:color w:val="000000"/>
-              </w:rPr>
-              <w:t xml:space="preserve">[-0.06, 0.06]</w:t>
+          </w:p>
+        </w:tc>
+        <w:tc>
+          <w:tcPr>
+            <w:tcBorders>
+              <w:bottom w:val="none" w:sz="0" w:space="0" w:color="000000"/>
+              <w:top w:val="none" w:sz="0" w:space="0" w:color="000000"/>
+              <w:left w:val="none" w:sz="0" w:space="0" w:color="000000"/>
+              <w:right w:val="none" w:sz="0" w:space="0" w:color="000000"/>
+            </w:tcBorders>
+            <w:shd w:val="clear" w:color="auto" w:fill="FFFFFF"/>
+            <w:tcMar>
+              <w:top w:w="0" w:type="dxa"/>
+              <w:bottom w:w="0" w:type="dxa"/>
+              <w:left w:w="0" w:type="dxa"/>
+              <w:right w:w="0" w:type="dxa"/>
+            </w:tcMar>
+            <w:vAlign w:val="center"/>
+          </w:tcPr>
+          <w:p>
+            <w:pPr>
+              <w:pStyle w:val="Normal"/>
+              <w:jc w:val="left"/>
+              <w:pBdr>
+                <w:bottom w:val="none" w:sz="0" w:space="0" w:color="000000"/>
+                <w:top w:val="none" w:sz="0" w:space="0" w:color="000000"/>
+                <w:left w:val="none" w:sz="0" w:space="0" w:color="000000"/>
+                <w:right w:val="none" w:sz="0" w:space="0" w:color="000000"/>
+              </w:pBdr>
+              <w:spacing w:after="100" w:before="100" w:line="240"/>
+              <w:ind w:left="100" w:right="100" w:firstLine="0" w:firstLineChars="0"/>
+              <w:rPr>
+                <w:rFonts w:ascii="Helvetica" w:hAnsi="Helvetica" w:eastAsia="Helvetica" w:cs="Helvetica"/>
+                <w:i w:val="false"/>
+                <w:b w:val="false"/>
+                <w:u w:val="none"/>
+                <w:strike w:val="false"/>
+                <w:sz w:val="22"/>
+                <w:szCs w:val="22"/>
+                <w:color w:val="000000"/>
+              </w:rPr>
+            </w:pPr>
+            <w:r>
+              <w:rPr>
+                <w:rFonts w:ascii="Helvetica" w:hAnsi="Helvetica" w:eastAsia="Helvetica" w:cs="Helvetica"/>
+                <w:i w:val="false"/>
+                <w:b w:val="false"/>
+                <w:u w:val="none"/>
+                <w:strike w:val="false"/>
+                <w:sz w:val="22"/>
+                <w:szCs w:val="22"/>
+                <w:color w:val="000000"/>
+              </w:rPr>
+              <w:t xml:space="preserve">(-0.06, 0.06)</w:t>
             </w:r>
           </w:p>
         </w:tc>
@@ -3147,31 +4543,60 @@
               </w:rPr>
               <w:t xml:space="preserve">0.20***</w:t>
             </w:r>
-            <w:r>
-              <w:rPr>
-                <w:rFonts w:ascii="Helvetica" w:hAnsi="Helvetica" w:eastAsia="Helvetica" w:cs="Helvetica"/>
-                <w:i w:val="false"/>
-                <w:b w:val="false"/>
-                <w:u w:val="none"/>
-                <w:strike w:val="false"/>
-                <w:sz w:val="22"/>
-                <w:szCs w:val="22"/>
-                <w:color w:val="000000"/>
-              </w:rPr>
-              <w:br/>
-            </w:r>
-            <w:r>
-              <w:rPr>
-                <w:rFonts w:ascii="Helvetica" w:hAnsi="Helvetica" w:eastAsia="Helvetica" w:cs="Helvetica"/>
-                <w:i w:val="false"/>
-                <w:b w:val="false"/>
-                <w:u w:val="none"/>
-                <w:strike w:val="false"/>
-                <w:sz w:val="22"/>
-                <w:szCs w:val="22"/>
-                <w:color w:val="000000"/>
-              </w:rPr>
-              <w:t xml:space="preserve">[0.08, 0.32]</w:t>
+          </w:p>
+        </w:tc>
+        <w:tc>
+          <w:tcPr>
+            <w:tcBorders>
+              <w:bottom w:val="none" w:sz="0" w:space="0" w:color="000000"/>
+              <w:top w:val="none" w:sz="0" w:space="0" w:color="000000"/>
+              <w:left w:val="none" w:sz="0" w:space="0" w:color="000000"/>
+              <w:right w:val="none" w:sz="0" w:space="0" w:color="000000"/>
+            </w:tcBorders>
+            <w:shd w:val="clear" w:color="auto" w:fill="FFFFFF"/>
+            <w:tcMar>
+              <w:top w:w="0" w:type="dxa"/>
+              <w:bottom w:w="0" w:type="dxa"/>
+              <w:left w:w="0" w:type="dxa"/>
+              <w:right w:w="0" w:type="dxa"/>
+            </w:tcMar>
+            <w:vAlign w:val="center"/>
+          </w:tcPr>
+          <w:p>
+            <w:pPr>
+              <w:pStyle w:val="Normal"/>
+              <w:jc w:val="left"/>
+              <w:pBdr>
+                <w:bottom w:val="none" w:sz="0" w:space="0" w:color="000000"/>
+                <w:top w:val="none" w:sz="0" w:space="0" w:color="000000"/>
+                <w:left w:val="none" w:sz="0" w:space="0" w:color="000000"/>
+                <w:right w:val="none" w:sz="0" w:space="0" w:color="000000"/>
+              </w:pBdr>
+              <w:spacing w:after="100" w:before="100" w:line="240"/>
+              <w:ind w:left="100" w:right="100" w:firstLine="0" w:firstLineChars="0"/>
+              <w:rPr>
+                <w:rFonts w:ascii="Helvetica" w:hAnsi="Helvetica" w:eastAsia="Helvetica" w:cs="Helvetica"/>
+                <w:i w:val="false"/>
+                <w:b w:val="false"/>
+                <w:u w:val="none"/>
+                <w:strike w:val="false"/>
+                <w:sz w:val="22"/>
+                <w:szCs w:val="22"/>
+                <w:color w:val="000000"/>
+              </w:rPr>
+            </w:pPr>
+            <w:r>
+              <w:rPr>
+                <w:rFonts w:ascii="Helvetica" w:hAnsi="Helvetica" w:eastAsia="Helvetica" w:cs="Helvetica"/>
+                <w:i w:val="false"/>
+                <w:b w:val="false"/>
+                <w:u w:val="none"/>
+                <w:strike w:val="false"/>
+                <w:sz w:val="22"/>
+                <w:szCs w:val="22"/>
+                <w:color w:val="000000"/>
+              </w:rPr>
+              <w:t xml:space="preserve">(0.08, 0.32)</w:t>
             </w:r>
           </w:p>
         </w:tc>
@@ -3228,31 +4653,60 @@
               </w:rPr>
               <w:t xml:space="preserve">0.19**</w:t>
             </w:r>
-            <w:r>
-              <w:rPr>
-                <w:rFonts w:ascii="Helvetica" w:hAnsi="Helvetica" w:eastAsia="Helvetica" w:cs="Helvetica"/>
-                <w:i w:val="false"/>
-                <w:b w:val="false"/>
-                <w:u w:val="none"/>
-                <w:strike w:val="false"/>
-                <w:sz w:val="22"/>
-                <w:szCs w:val="22"/>
-                <w:color w:val="000000"/>
-              </w:rPr>
-              <w:br/>
-            </w:r>
-            <w:r>
-              <w:rPr>
-                <w:rFonts w:ascii="Helvetica" w:hAnsi="Helvetica" w:eastAsia="Helvetica" w:cs="Helvetica"/>
-                <w:i w:val="false"/>
-                <w:b w:val="false"/>
-                <w:u w:val="none"/>
-                <w:strike w:val="false"/>
-                <w:sz w:val="22"/>
-                <w:szCs w:val="22"/>
-                <w:color w:val="000000"/>
-              </w:rPr>
-              <w:t xml:space="preserve">[0.08, 0.30]</w:t>
+          </w:p>
+        </w:tc>
+        <w:tc>
+          <w:tcPr>
+            <w:tcBorders>
+              <w:bottom w:val="none" w:sz="0" w:space="0" w:color="000000"/>
+              <w:top w:val="none" w:sz="0" w:space="0" w:color="000000"/>
+              <w:left w:val="none" w:sz="0" w:space="0" w:color="000000"/>
+              <w:right w:val="none" w:sz="0" w:space="0" w:color="000000"/>
+            </w:tcBorders>
+            <w:shd w:val="clear" w:color="auto" w:fill="FFFFFF"/>
+            <w:tcMar>
+              <w:top w:w="0" w:type="dxa"/>
+              <w:bottom w:w="0" w:type="dxa"/>
+              <w:left w:w="0" w:type="dxa"/>
+              <w:right w:w="0" w:type="dxa"/>
+            </w:tcMar>
+            <w:vAlign w:val="center"/>
+          </w:tcPr>
+          <w:p>
+            <w:pPr>
+              <w:pStyle w:val="Normal"/>
+              <w:jc w:val="left"/>
+              <w:pBdr>
+                <w:bottom w:val="none" w:sz="0" w:space="0" w:color="000000"/>
+                <w:top w:val="none" w:sz="0" w:space="0" w:color="000000"/>
+                <w:left w:val="none" w:sz="0" w:space="0" w:color="000000"/>
+                <w:right w:val="none" w:sz="0" w:space="0" w:color="000000"/>
+              </w:pBdr>
+              <w:spacing w:after="100" w:before="100" w:line="240"/>
+              <w:ind w:left="100" w:right="100" w:firstLine="0" w:firstLineChars="0"/>
+              <w:rPr>
+                <w:rFonts w:ascii="Helvetica" w:hAnsi="Helvetica" w:eastAsia="Helvetica" w:cs="Helvetica"/>
+                <w:i w:val="false"/>
+                <w:b w:val="false"/>
+                <w:u w:val="none"/>
+                <w:strike w:val="false"/>
+                <w:sz w:val="22"/>
+                <w:szCs w:val="22"/>
+                <w:color w:val="000000"/>
+              </w:rPr>
+            </w:pPr>
+            <w:r>
+              <w:rPr>
+                <w:rFonts w:ascii="Helvetica" w:hAnsi="Helvetica" w:eastAsia="Helvetica" w:cs="Helvetica"/>
+                <w:i w:val="false"/>
+                <w:b w:val="false"/>
+                <w:u w:val="none"/>
+                <w:strike w:val="false"/>
+                <w:sz w:val="22"/>
+                <w:szCs w:val="22"/>
+                <w:color w:val="000000"/>
+              </w:rPr>
+              <w:t xml:space="preserve">(0.08, 0.30)</w:t>
             </w:r>
           </w:p>
         </w:tc>
@@ -3309,31 +4763,60 @@
               </w:rPr>
               <w:t xml:space="preserve">0.18**</w:t>
             </w:r>
-            <w:r>
-              <w:rPr>
-                <w:rFonts w:ascii="Helvetica" w:hAnsi="Helvetica" w:eastAsia="Helvetica" w:cs="Helvetica"/>
-                <w:i w:val="false"/>
-                <w:b w:val="false"/>
-                <w:u w:val="none"/>
-                <w:strike w:val="false"/>
-                <w:sz w:val="22"/>
-                <w:szCs w:val="22"/>
-                <w:color w:val="000000"/>
-              </w:rPr>
-              <w:br/>
-            </w:r>
-            <w:r>
-              <w:rPr>
-                <w:rFonts w:ascii="Helvetica" w:hAnsi="Helvetica" w:eastAsia="Helvetica" w:cs="Helvetica"/>
-                <w:i w:val="false"/>
-                <w:b w:val="false"/>
-                <w:u w:val="none"/>
-                <w:strike w:val="false"/>
-                <w:sz w:val="22"/>
-                <w:szCs w:val="22"/>
-                <w:color w:val="000000"/>
-              </w:rPr>
-              <w:t xml:space="preserve">[0.07, 0.29]</w:t>
+          </w:p>
+        </w:tc>
+        <w:tc>
+          <w:tcPr>
+            <w:tcBorders>
+              <w:bottom w:val="none" w:sz="0" w:space="0" w:color="000000"/>
+              <w:top w:val="none" w:sz="0" w:space="0" w:color="000000"/>
+              <w:left w:val="none" w:sz="0" w:space="0" w:color="000000"/>
+              <w:right w:val="none" w:sz="0" w:space="0" w:color="000000"/>
+            </w:tcBorders>
+            <w:shd w:val="clear" w:color="auto" w:fill="FFFFFF"/>
+            <w:tcMar>
+              <w:top w:w="0" w:type="dxa"/>
+              <w:bottom w:w="0" w:type="dxa"/>
+              <w:left w:w="0" w:type="dxa"/>
+              <w:right w:w="0" w:type="dxa"/>
+            </w:tcMar>
+            <w:vAlign w:val="center"/>
+          </w:tcPr>
+          <w:p>
+            <w:pPr>
+              <w:pStyle w:val="Normal"/>
+              <w:jc w:val="left"/>
+              <w:pBdr>
+                <w:bottom w:val="none" w:sz="0" w:space="0" w:color="000000"/>
+                <w:top w:val="none" w:sz="0" w:space="0" w:color="000000"/>
+                <w:left w:val="none" w:sz="0" w:space="0" w:color="000000"/>
+                <w:right w:val="none" w:sz="0" w:space="0" w:color="000000"/>
+              </w:pBdr>
+              <w:spacing w:after="100" w:before="100" w:line="240"/>
+              <w:ind w:left="100" w:right="100" w:firstLine="0" w:firstLineChars="0"/>
+              <w:rPr>
+                <w:rFonts w:ascii="Helvetica" w:hAnsi="Helvetica" w:eastAsia="Helvetica" w:cs="Helvetica"/>
+                <w:i w:val="false"/>
+                <w:b w:val="false"/>
+                <w:u w:val="none"/>
+                <w:strike w:val="false"/>
+                <w:sz w:val="22"/>
+                <w:szCs w:val="22"/>
+                <w:color w:val="000000"/>
+              </w:rPr>
+            </w:pPr>
+            <w:r>
+              <w:rPr>
+                <w:rFonts w:ascii="Helvetica" w:hAnsi="Helvetica" w:eastAsia="Helvetica" w:cs="Helvetica"/>
+                <w:i w:val="false"/>
+                <w:b w:val="false"/>
+                <w:u w:val="none"/>
+                <w:strike w:val="false"/>
+                <w:sz w:val="22"/>
+                <w:szCs w:val="22"/>
+                <w:color w:val="000000"/>
+              </w:rPr>
+              <w:t xml:space="preserve">(0.07, 0.29)</w:t>
             </w:r>
           </w:p>
         </w:tc>
@@ -3390,31 +4873,60 @@
               </w:rPr>
               <w:t xml:space="preserve">0.19**</w:t>
             </w:r>
-            <w:r>
-              <w:rPr>
-                <w:rFonts w:ascii="Helvetica" w:hAnsi="Helvetica" w:eastAsia="Helvetica" w:cs="Helvetica"/>
-                <w:i w:val="false"/>
-                <w:b w:val="false"/>
-                <w:u w:val="none"/>
-                <w:strike w:val="false"/>
-                <w:sz w:val="22"/>
-                <w:szCs w:val="22"/>
-                <w:color w:val="000000"/>
-              </w:rPr>
-              <w:br/>
-            </w:r>
-            <w:r>
-              <w:rPr>
-                <w:rFonts w:ascii="Helvetica" w:hAnsi="Helvetica" w:eastAsia="Helvetica" w:cs="Helvetica"/>
-                <w:i w:val="false"/>
-                <w:b w:val="false"/>
-                <w:u w:val="none"/>
-                <w:strike w:val="false"/>
-                <w:sz w:val="22"/>
-                <w:szCs w:val="22"/>
-                <w:color w:val="000000"/>
-              </w:rPr>
-              <w:t xml:space="preserve">[0.07, 0.30]</w:t>
+          </w:p>
+        </w:tc>
+        <w:tc>
+          <w:tcPr>
+            <w:tcBorders>
+              <w:bottom w:val="none" w:sz="0" w:space="0" w:color="000000"/>
+              <w:top w:val="none" w:sz="0" w:space="0" w:color="000000"/>
+              <w:left w:val="none" w:sz="0" w:space="0" w:color="000000"/>
+              <w:right w:val="none" w:sz="0" w:space="0" w:color="000000"/>
+            </w:tcBorders>
+            <w:shd w:val="clear" w:color="auto" w:fill="FFFFFF"/>
+            <w:tcMar>
+              <w:top w:w="0" w:type="dxa"/>
+              <w:bottom w:w="0" w:type="dxa"/>
+              <w:left w:w="0" w:type="dxa"/>
+              <w:right w:w="0" w:type="dxa"/>
+            </w:tcMar>
+            <w:vAlign w:val="center"/>
+          </w:tcPr>
+          <w:p>
+            <w:pPr>
+              <w:pStyle w:val="Normal"/>
+              <w:jc w:val="left"/>
+              <w:pBdr>
+                <w:bottom w:val="none" w:sz="0" w:space="0" w:color="000000"/>
+                <w:top w:val="none" w:sz="0" w:space="0" w:color="000000"/>
+                <w:left w:val="none" w:sz="0" w:space="0" w:color="000000"/>
+                <w:right w:val="none" w:sz="0" w:space="0" w:color="000000"/>
+              </w:pBdr>
+              <w:spacing w:after="100" w:before="100" w:line="240"/>
+              <w:ind w:left="100" w:right="100" w:firstLine="0" w:firstLineChars="0"/>
+              <w:rPr>
+                <w:rFonts w:ascii="Helvetica" w:hAnsi="Helvetica" w:eastAsia="Helvetica" w:cs="Helvetica"/>
+                <w:i w:val="false"/>
+                <w:b w:val="false"/>
+                <w:u w:val="none"/>
+                <w:strike w:val="false"/>
+                <w:sz w:val="22"/>
+                <w:szCs w:val="22"/>
+                <w:color w:val="000000"/>
+              </w:rPr>
+            </w:pPr>
+            <w:r>
+              <w:rPr>
+                <w:rFonts w:ascii="Helvetica" w:hAnsi="Helvetica" w:eastAsia="Helvetica" w:cs="Helvetica"/>
+                <w:i w:val="false"/>
+                <w:b w:val="false"/>
+                <w:u w:val="none"/>
+                <w:strike w:val="false"/>
+                <w:sz w:val="22"/>
+                <w:szCs w:val="22"/>
+                <w:color w:val="000000"/>
+              </w:rPr>
+              <w:t xml:space="preserve">(0.07, 0.30)</w:t>
             </w:r>
           </w:p>
         </w:tc>
@@ -3471,31 +4983,60 @@
               </w:rPr>
               <w:t xml:space="preserve">0.10+</w:t>
             </w:r>
-            <w:r>
-              <w:rPr>
-                <w:rFonts w:ascii="Helvetica" w:hAnsi="Helvetica" w:eastAsia="Helvetica" w:cs="Helvetica"/>
-                <w:i w:val="false"/>
-                <w:b w:val="false"/>
-                <w:u w:val="none"/>
-                <w:strike w:val="false"/>
-                <w:sz w:val="22"/>
-                <w:szCs w:val="22"/>
-                <w:color w:val="000000"/>
-              </w:rPr>
-              <w:br/>
-            </w:r>
-            <w:r>
-              <w:rPr>
-                <w:rFonts w:ascii="Helvetica" w:hAnsi="Helvetica" w:eastAsia="Helvetica" w:cs="Helvetica"/>
-                <w:i w:val="false"/>
-                <w:b w:val="false"/>
-                <w:u w:val="none"/>
-                <w:strike w:val="false"/>
-                <w:sz w:val="22"/>
-                <w:szCs w:val="22"/>
-                <w:color w:val="000000"/>
-              </w:rPr>
-              <w:t xml:space="preserve">[-0.00, 0.20]</w:t>
+          </w:p>
+        </w:tc>
+        <w:tc>
+          <w:tcPr>
+            <w:tcBorders>
+              <w:bottom w:val="none" w:sz="0" w:space="0" w:color="000000"/>
+              <w:top w:val="none" w:sz="0" w:space="0" w:color="000000"/>
+              <w:left w:val="none" w:sz="0" w:space="0" w:color="000000"/>
+              <w:right w:val="none" w:sz="0" w:space="0" w:color="000000"/>
+            </w:tcBorders>
+            <w:shd w:val="clear" w:color="auto" w:fill="FFFFFF"/>
+            <w:tcMar>
+              <w:top w:w="0" w:type="dxa"/>
+              <w:bottom w:w="0" w:type="dxa"/>
+              <w:left w:w="0" w:type="dxa"/>
+              <w:right w:w="0" w:type="dxa"/>
+            </w:tcMar>
+            <w:vAlign w:val="center"/>
+          </w:tcPr>
+          <w:p>
+            <w:pPr>
+              <w:pStyle w:val="Normal"/>
+              <w:jc w:val="left"/>
+              <w:pBdr>
+                <w:bottom w:val="none" w:sz="0" w:space="0" w:color="000000"/>
+                <w:top w:val="none" w:sz="0" w:space="0" w:color="000000"/>
+                <w:left w:val="none" w:sz="0" w:space="0" w:color="000000"/>
+                <w:right w:val="none" w:sz="0" w:space="0" w:color="000000"/>
+              </w:pBdr>
+              <w:spacing w:after="100" w:before="100" w:line="240"/>
+              <w:ind w:left="100" w:right="100" w:firstLine="0" w:firstLineChars="0"/>
+              <w:rPr>
+                <w:rFonts w:ascii="Helvetica" w:hAnsi="Helvetica" w:eastAsia="Helvetica" w:cs="Helvetica"/>
+                <w:i w:val="false"/>
+                <w:b w:val="false"/>
+                <w:u w:val="none"/>
+                <w:strike w:val="false"/>
+                <w:sz w:val="22"/>
+                <w:szCs w:val="22"/>
+                <w:color w:val="000000"/>
+              </w:rPr>
+            </w:pPr>
+            <w:r>
+              <w:rPr>
+                <w:rFonts w:ascii="Helvetica" w:hAnsi="Helvetica" w:eastAsia="Helvetica" w:cs="Helvetica"/>
+                <w:i w:val="false"/>
+                <w:b w:val="false"/>
+                <w:u w:val="none"/>
+                <w:strike w:val="false"/>
+                <w:sz w:val="22"/>
+                <w:szCs w:val="22"/>
+                <w:color w:val="000000"/>
+              </w:rPr>
+              <w:t xml:space="preserve">(-0.00, 0.21)</w:t>
             </w:r>
           </w:p>
         </w:tc>
@@ -3655,31 +5196,60 @@
               </w:rPr>
               <w:t xml:space="preserve">0.01</w:t>
             </w:r>
-            <w:r>
-              <w:rPr>
-                <w:rFonts w:ascii="Helvetica" w:hAnsi="Helvetica" w:eastAsia="Helvetica" w:cs="Helvetica"/>
-                <w:i w:val="false"/>
-                <w:b w:val="false"/>
-                <w:u w:val="none"/>
-                <w:strike w:val="false"/>
-                <w:sz w:val="22"/>
-                <w:szCs w:val="22"/>
-                <w:color w:val="000000"/>
-              </w:rPr>
-              <w:br/>
-            </w:r>
-            <w:r>
-              <w:rPr>
-                <w:rFonts w:ascii="Helvetica" w:hAnsi="Helvetica" w:eastAsia="Helvetica" w:cs="Helvetica"/>
-                <w:i w:val="false"/>
-                <w:b w:val="false"/>
-                <w:u w:val="none"/>
-                <w:strike w:val="false"/>
-                <w:sz w:val="22"/>
-                <w:szCs w:val="22"/>
-                <w:color w:val="000000"/>
-              </w:rPr>
-              <w:t xml:space="preserve">[-0.33, 0.35]</w:t>
+          </w:p>
+        </w:tc>
+        <w:tc>
+          <w:tcPr>
+            <w:tcBorders>
+              <w:bottom w:val="none" w:sz="0" w:space="0" w:color="000000"/>
+              <w:top w:val="none" w:sz="0" w:space="0" w:color="000000"/>
+              <w:left w:val="none" w:sz="0" w:space="0" w:color="000000"/>
+              <w:right w:val="none" w:sz="0" w:space="0" w:color="000000"/>
+            </w:tcBorders>
+            <w:shd w:val="clear" w:color="auto" w:fill="FFFFFF"/>
+            <w:tcMar>
+              <w:top w:w="0" w:type="dxa"/>
+              <w:bottom w:w="0" w:type="dxa"/>
+              <w:left w:w="0" w:type="dxa"/>
+              <w:right w:w="0" w:type="dxa"/>
+            </w:tcMar>
+            <w:vAlign w:val="center"/>
+          </w:tcPr>
+          <w:p>
+            <w:pPr>
+              <w:pStyle w:val="Normal"/>
+              <w:jc w:val="left"/>
+              <w:pBdr>
+                <w:bottom w:val="none" w:sz="0" w:space="0" w:color="000000"/>
+                <w:top w:val="none" w:sz="0" w:space="0" w:color="000000"/>
+                <w:left w:val="none" w:sz="0" w:space="0" w:color="000000"/>
+                <w:right w:val="none" w:sz="0" w:space="0" w:color="000000"/>
+              </w:pBdr>
+              <w:spacing w:after="100" w:before="100" w:line="240"/>
+              <w:ind w:left="100" w:right="100" w:firstLine="0" w:firstLineChars="0"/>
+              <w:rPr>
+                <w:rFonts w:ascii="Helvetica" w:hAnsi="Helvetica" w:eastAsia="Helvetica" w:cs="Helvetica"/>
+                <w:i w:val="false"/>
+                <w:b w:val="false"/>
+                <w:u w:val="none"/>
+                <w:strike w:val="false"/>
+                <w:sz w:val="22"/>
+                <w:szCs w:val="22"/>
+                <w:color w:val="000000"/>
+              </w:rPr>
+            </w:pPr>
+            <w:r>
+              <w:rPr>
+                <w:rFonts w:ascii="Helvetica" w:hAnsi="Helvetica" w:eastAsia="Helvetica" w:cs="Helvetica"/>
+                <w:i w:val="false"/>
+                <w:b w:val="false"/>
+                <w:u w:val="none"/>
+                <w:strike w:val="false"/>
+                <w:sz w:val="22"/>
+                <w:szCs w:val="22"/>
+                <w:color w:val="000000"/>
+              </w:rPr>
+              <w:t xml:space="preserve">(-0.33, 0.35)</w:t>
             </w:r>
           </w:p>
         </w:tc>
@@ -3736,31 +5306,60 @@
               </w:rPr>
               <w:t xml:space="preserve">-0.04</w:t>
             </w:r>
-            <w:r>
-              <w:rPr>
-                <w:rFonts w:ascii="Helvetica" w:hAnsi="Helvetica" w:eastAsia="Helvetica" w:cs="Helvetica"/>
-                <w:i w:val="false"/>
-                <w:b w:val="false"/>
-                <w:u w:val="none"/>
-                <w:strike w:val="false"/>
-                <w:sz w:val="22"/>
-                <w:szCs w:val="22"/>
-                <w:color w:val="000000"/>
-              </w:rPr>
-              <w:br/>
-            </w:r>
-            <w:r>
-              <w:rPr>
-                <w:rFonts w:ascii="Helvetica" w:hAnsi="Helvetica" w:eastAsia="Helvetica" w:cs="Helvetica"/>
-                <w:i w:val="false"/>
-                <w:b w:val="false"/>
-                <w:u w:val="none"/>
-                <w:strike w:val="false"/>
-                <w:sz w:val="22"/>
-                <w:szCs w:val="22"/>
-                <w:color w:val="000000"/>
-              </w:rPr>
-              <w:t xml:space="preserve">[-0.37, 0.29]</w:t>
+          </w:p>
+        </w:tc>
+        <w:tc>
+          <w:tcPr>
+            <w:tcBorders>
+              <w:bottom w:val="none" w:sz="0" w:space="0" w:color="000000"/>
+              <w:top w:val="none" w:sz="0" w:space="0" w:color="000000"/>
+              <w:left w:val="none" w:sz="0" w:space="0" w:color="000000"/>
+              <w:right w:val="none" w:sz="0" w:space="0" w:color="000000"/>
+            </w:tcBorders>
+            <w:shd w:val="clear" w:color="auto" w:fill="FFFFFF"/>
+            <w:tcMar>
+              <w:top w:w="0" w:type="dxa"/>
+              <w:bottom w:w="0" w:type="dxa"/>
+              <w:left w:w="0" w:type="dxa"/>
+              <w:right w:w="0" w:type="dxa"/>
+            </w:tcMar>
+            <w:vAlign w:val="center"/>
+          </w:tcPr>
+          <w:p>
+            <w:pPr>
+              <w:pStyle w:val="Normal"/>
+              <w:jc w:val="left"/>
+              <w:pBdr>
+                <w:bottom w:val="none" w:sz="0" w:space="0" w:color="000000"/>
+                <w:top w:val="none" w:sz="0" w:space="0" w:color="000000"/>
+                <w:left w:val="none" w:sz="0" w:space="0" w:color="000000"/>
+                <w:right w:val="none" w:sz="0" w:space="0" w:color="000000"/>
+              </w:pBdr>
+              <w:spacing w:after="100" w:before="100" w:line="240"/>
+              <w:ind w:left="100" w:right="100" w:firstLine="0" w:firstLineChars="0"/>
+              <w:rPr>
+                <w:rFonts w:ascii="Helvetica" w:hAnsi="Helvetica" w:eastAsia="Helvetica" w:cs="Helvetica"/>
+                <w:i w:val="false"/>
+                <w:b w:val="false"/>
+                <w:u w:val="none"/>
+                <w:strike w:val="false"/>
+                <w:sz w:val="22"/>
+                <w:szCs w:val="22"/>
+                <w:color w:val="000000"/>
+              </w:rPr>
+            </w:pPr>
+            <w:r>
+              <w:rPr>
+                <w:rFonts w:ascii="Helvetica" w:hAnsi="Helvetica" w:eastAsia="Helvetica" w:cs="Helvetica"/>
+                <w:i w:val="false"/>
+                <w:b w:val="false"/>
+                <w:u w:val="none"/>
+                <w:strike w:val="false"/>
+                <w:sz w:val="22"/>
+                <w:szCs w:val="22"/>
+                <w:color w:val="000000"/>
+              </w:rPr>
+              <w:t xml:space="preserve">(-0.37, 0.29)</w:t>
             </w:r>
           </w:p>
         </w:tc>
@@ -3817,31 +5416,60 @@
               </w:rPr>
               <w:t xml:space="preserve">-0.05</w:t>
             </w:r>
-            <w:r>
-              <w:rPr>
-                <w:rFonts w:ascii="Helvetica" w:hAnsi="Helvetica" w:eastAsia="Helvetica" w:cs="Helvetica"/>
-                <w:i w:val="false"/>
-                <w:b w:val="false"/>
-                <w:u w:val="none"/>
-                <w:strike w:val="false"/>
-                <w:sz w:val="22"/>
-                <w:szCs w:val="22"/>
-                <w:color w:val="000000"/>
-              </w:rPr>
-              <w:br/>
-            </w:r>
-            <w:r>
-              <w:rPr>
-                <w:rFonts w:ascii="Helvetica" w:hAnsi="Helvetica" w:eastAsia="Helvetica" w:cs="Helvetica"/>
-                <w:i w:val="false"/>
-                <w:b w:val="false"/>
-                <w:u w:val="none"/>
-                <w:strike w:val="false"/>
-                <w:sz w:val="22"/>
-                <w:szCs w:val="22"/>
-                <w:color w:val="000000"/>
-              </w:rPr>
-              <w:t xml:space="preserve">[-0.38, 0.28]</w:t>
+          </w:p>
+        </w:tc>
+        <w:tc>
+          <w:tcPr>
+            <w:tcBorders>
+              <w:bottom w:val="none" w:sz="0" w:space="0" w:color="000000"/>
+              <w:top w:val="none" w:sz="0" w:space="0" w:color="000000"/>
+              <w:left w:val="none" w:sz="0" w:space="0" w:color="000000"/>
+              <w:right w:val="none" w:sz="0" w:space="0" w:color="000000"/>
+            </w:tcBorders>
+            <w:shd w:val="clear" w:color="auto" w:fill="FFFFFF"/>
+            <w:tcMar>
+              <w:top w:w="0" w:type="dxa"/>
+              <w:bottom w:w="0" w:type="dxa"/>
+              <w:left w:w="0" w:type="dxa"/>
+              <w:right w:w="0" w:type="dxa"/>
+            </w:tcMar>
+            <w:vAlign w:val="center"/>
+          </w:tcPr>
+          <w:p>
+            <w:pPr>
+              <w:pStyle w:val="Normal"/>
+              <w:jc w:val="left"/>
+              <w:pBdr>
+                <w:bottom w:val="none" w:sz="0" w:space="0" w:color="000000"/>
+                <w:top w:val="none" w:sz="0" w:space="0" w:color="000000"/>
+                <w:left w:val="none" w:sz="0" w:space="0" w:color="000000"/>
+                <w:right w:val="none" w:sz="0" w:space="0" w:color="000000"/>
+              </w:pBdr>
+              <w:spacing w:after="100" w:before="100" w:line="240"/>
+              <w:ind w:left="100" w:right="100" w:firstLine="0" w:firstLineChars="0"/>
+              <w:rPr>
+                <w:rFonts w:ascii="Helvetica" w:hAnsi="Helvetica" w:eastAsia="Helvetica" w:cs="Helvetica"/>
+                <w:i w:val="false"/>
+                <w:b w:val="false"/>
+                <w:u w:val="none"/>
+                <w:strike w:val="false"/>
+                <w:sz w:val="22"/>
+                <w:szCs w:val="22"/>
+                <w:color w:val="000000"/>
+              </w:rPr>
+            </w:pPr>
+            <w:r>
+              <w:rPr>
+                <w:rFonts w:ascii="Helvetica" w:hAnsi="Helvetica" w:eastAsia="Helvetica" w:cs="Helvetica"/>
+                <w:i w:val="false"/>
+                <w:b w:val="false"/>
+                <w:u w:val="none"/>
+                <w:strike w:val="false"/>
+                <w:sz w:val="22"/>
+                <w:szCs w:val="22"/>
+                <w:color w:val="000000"/>
+              </w:rPr>
+              <w:t xml:space="preserve">(-0.38, 0.28)</w:t>
             </w:r>
           </w:p>
         </w:tc>
@@ -3898,31 +5526,60 @@
               </w:rPr>
               <w:t xml:space="preserve">-0.04</w:t>
             </w:r>
-            <w:r>
-              <w:rPr>
-                <w:rFonts w:ascii="Helvetica" w:hAnsi="Helvetica" w:eastAsia="Helvetica" w:cs="Helvetica"/>
-                <w:i w:val="false"/>
-                <w:b w:val="false"/>
-                <w:u w:val="none"/>
-                <w:strike w:val="false"/>
-                <w:sz w:val="22"/>
-                <w:szCs w:val="22"/>
-                <w:color w:val="000000"/>
-              </w:rPr>
-              <w:br/>
-            </w:r>
-            <w:r>
-              <w:rPr>
-                <w:rFonts w:ascii="Helvetica" w:hAnsi="Helvetica" w:eastAsia="Helvetica" w:cs="Helvetica"/>
-                <w:i w:val="false"/>
-                <w:b w:val="false"/>
-                <w:u w:val="none"/>
-                <w:strike w:val="false"/>
-                <w:sz w:val="22"/>
-                <w:szCs w:val="22"/>
-                <w:color w:val="000000"/>
-              </w:rPr>
-              <w:t xml:space="preserve">[-0.37, 0.29]</w:t>
+          </w:p>
+        </w:tc>
+        <w:tc>
+          <w:tcPr>
+            <w:tcBorders>
+              <w:bottom w:val="none" w:sz="0" w:space="0" w:color="000000"/>
+              <w:top w:val="none" w:sz="0" w:space="0" w:color="000000"/>
+              <w:left w:val="none" w:sz="0" w:space="0" w:color="000000"/>
+              <w:right w:val="none" w:sz="0" w:space="0" w:color="000000"/>
+            </w:tcBorders>
+            <w:shd w:val="clear" w:color="auto" w:fill="FFFFFF"/>
+            <w:tcMar>
+              <w:top w:w="0" w:type="dxa"/>
+              <w:bottom w:w="0" w:type="dxa"/>
+              <w:left w:w="0" w:type="dxa"/>
+              <w:right w:w="0" w:type="dxa"/>
+            </w:tcMar>
+            <w:vAlign w:val="center"/>
+          </w:tcPr>
+          <w:p>
+            <w:pPr>
+              <w:pStyle w:val="Normal"/>
+              <w:jc w:val="left"/>
+              <w:pBdr>
+                <w:bottom w:val="none" w:sz="0" w:space="0" w:color="000000"/>
+                <w:top w:val="none" w:sz="0" w:space="0" w:color="000000"/>
+                <w:left w:val="none" w:sz="0" w:space="0" w:color="000000"/>
+                <w:right w:val="none" w:sz="0" w:space="0" w:color="000000"/>
+              </w:pBdr>
+              <w:spacing w:after="100" w:before="100" w:line="240"/>
+              <w:ind w:left="100" w:right="100" w:firstLine="0" w:firstLineChars="0"/>
+              <w:rPr>
+                <w:rFonts w:ascii="Helvetica" w:hAnsi="Helvetica" w:eastAsia="Helvetica" w:cs="Helvetica"/>
+                <w:i w:val="false"/>
+                <w:b w:val="false"/>
+                <w:u w:val="none"/>
+                <w:strike w:val="false"/>
+                <w:sz w:val="22"/>
+                <w:szCs w:val="22"/>
+                <w:color w:val="000000"/>
+              </w:rPr>
+            </w:pPr>
+            <w:r>
+              <w:rPr>
+                <w:rFonts w:ascii="Helvetica" w:hAnsi="Helvetica" w:eastAsia="Helvetica" w:cs="Helvetica"/>
+                <w:i w:val="false"/>
+                <w:b w:val="false"/>
+                <w:u w:val="none"/>
+                <w:strike w:val="false"/>
+                <w:sz w:val="22"/>
+                <w:szCs w:val="22"/>
+                <w:color w:val="000000"/>
+              </w:rPr>
+              <w:t xml:space="preserve">(-0.37, 0.29)</w:t>
             </w:r>
           </w:p>
         </w:tc>
@@ -3979,31 +5636,60 @@
               </w:rPr>
               <w:t xml:space="preserve">-0.07</w:t>
             </w:r>
-            <w:r>
-              <w:rPr>
-                <w:rFonts w:ascii="Helvetica" w:hAnsi="Helvetica" w:eastAsia="Helvetica" w:cs="Helvetica"/>
-                <w:i w:val="false"/>
-                <w:b w:val="false"/>
-                <w:u w:val="none"/>
-                <w:strike w:val="false"/>
-                <w:sz w:val="22"/>
-                <w:szCs w:val="22"/>
-                <w:color w:val="000000"/>
-              </w:rPr>
-              <w:br/>
-            </w:r>
-            <w:r>
-              <w:rPr>
-                <w:rFonts w:ascii="Helvetica" w:hAnsi="Helvetica" w:eastAsia="Helvetica" w:cs="Helvetica"/>
-                <w:i w:val="false"/>
-                <w:b w:val="false"/>
-                <w:u w:val="none"/>
-                <w:strike w:val="false"/>
-                <w:sz w:val="22"/>
-                <w:szCs w:val="22"/>
-                <w:color w:val="000000"/>
-              </w:rPr>
-              <w:t xml:space="preserve">[-0.37, 0.23]</w:t>
+          </w:p>
+        </w:tc>
+        <w:tc>
+          <w:tcPr>
+            <w:tcBorders>
+              <w:bottom w:val="none" w:sz="0" w:space="0" w:color="000000"/>
+              <w:top w:val="none" w:sz="0" w:space="0" w:color="000000"/>
+              <w:left w:val="none" w:sz="0" w:space="0" w:color="000000"/>
+              <w:right w:val="none" w:sz="0" w:space="0" w:color="000000"/>
+            </w:tcBorders>
+            <w:shd w:val="clear" w:color="auto" w:fill="FFFFFF"/>
+            <w:tcMar>
+              <w:top w:w="0" w:type="dxa"/>
+              <w:bottom w:w="0" w:type="dxa"/>
+              <w:left w:w="0" w:type="dxa"/>
+              <w:right w:w="0" w:type="dxa"/>
+            </w:tcMar>
+            <w:vAlign w:val="center"/>
+          </w:tcPr>
+          <w:p>
+            <w:pPr>
+              <w:pStyle w:val="Normal"/>
+              <w:jc w:val="left"/>
+              <w:pBdr>
+                <w:bottom w:val="none" w:sz="0" w:space="0" w:color="000000"/>
+                <w:top w:val="none" w:sz="0" w:space="0" w:color="000000"/>
+                <w:left w:val="none" w:sz="0" w:space="0" w:color="000000"/>
+                <w:right w:val="none" w:sz="0" w:space="0" w:color="000000"/>
+              </w:pBdr>
+              <w:spacing w:after="100" w:before="100" w:line="240"/>
+              <w:ind w:left="100" w:right="100" w:firstLine="0" w:firstLineChars="0"/>
+              <w:rPr>
+                <w:rFonts w:ascii="Helvetica" w:hAnsi="Helvetica" w:eastAsia="Helvetica" w:cs="Helvetica"/>
+                <w:i w:val="false"/>
+                <w:b w:val="false"/>
+                <w:u w:val="none"/>
+                <w:strike w:val="false"/>
+                <w:sz w:val="22"/>
+                <w:szCs w:val="22"/>
+                <w:color w:val="000000"/>
+              </w:rPr>
+            </w:pPr>
+            <w:r>
+              <w:rPr>
+                <w:rFonts w:ascii="Helvetica" w:hAnsi="Helvetica" w:eastAsia="Helvetica" w:cs="Helvetica"/>
+                <w:i w:val="false"/>
+                <w:b w:val="false"/>
+                <w:u w:val="none"/>
+                <w:strike w:val="false"/>
+                <w:sz w:val="22"/>
+                <w:szCs w:val="22"/>
+                <w:color w:val="000000"/>
+              </w:rPr>
+              <w:t xml:space="preserve">(-0.37, 0.23)</w:t>
             </w:r>
           </w:p>
         </w:tc>
@@ -4163,32 +5849,6 @@
               </w:rPr>
               <w:t xml:space="preserve">-0.09</w:t>
             </w:r>
-            <w:r>
-              <w:rPr>
-                <w:rFonts w:ascii="Helvetica" w:hAnsi="Helvetica" w:eastAsia="Helvetica" w:cs="Helvetica"/>
-                <w:i w:val="false"/>
-                <w:b w:val="false"/>
-                <w:u w:val="none"/>
-                <w:strike w:val="false"/>
-                <w:sz w:val="22"/>
-                <w:szCs w:val="22"/>
-                <w:color w:val="000000"/>
-              </w:rPr>
-              <w:br/>
-            </w:r>
-            <w:r>
-              <w:rPr>
-                <w:rFonts w:ascii="Helvetica" w:hAnsi="Helvetica" w:eastAsia="Helvetica" w:cs="Helvetica"/>
-                <w:i w:val="false"/>
-                <w:b w:val="false"/>
-                <w:u w:val="none"/>
-                <w:strike w:val="false"/>
-                <w:sz w:val="22"/>
-                <w:szCs w:val="22"/>
-                <w:color w:val="000000"/>
-              </w:rPr>
-              <w:t xml:space="preserve">[-0.30, 0.13]</w:t>
-            </w:r>
           </w:p>
         </w:tc>
         <w:tc>
@@ -4242,34 +5902,63 @@
                 <w:szCs w:val="22"/>
                 <w:color w:val="000000"/>
               </w:rPr>
+              <w:t xml:space="preserve">(-0.30, 0.13)</w:t>
+            </w:r>
+          </w:p>
+        </w:tc>
+        <w:tc>
+          <w:tcPr>
+            <w:tcBorders>
+              <w:bottom w:val="single" w:sz="12" w:space="0" w:color="666666"/>
+              <w:top w:val="none" w:sz="0" w:space="0" w:color="000000"/>
+              <w:left w:val="none" w:sz="0" w:space="0" w:color="000000"/>
+              <w:right w:val="none" w:sz="0" w:space="0" w:color="000000"/>
+            </w:tcBorders>
+            <w:shd w:val="clear" w:color="auto" w:fill="FFFFFF"/>
+            <w:tcMar>
+              <w:top w:w="0" w:type="dxa"/>
+              <w:bottom w:w="0" w:type="dxa"/>
+              <w:left w:w="0" w:type="dxa"/>
+              <w:right w:w="0" w:type="dxa"/>
+            </w:tcMar>
+            <w:vAlign w:val="center"/>
+          </w:tcPr>
+          <w:p>
+            <w:pPr>
+              <w:pStyle w:val="Normal"/>
+              <w:jc w:val="left"/>
+              <w:pBdr>
+                <w:bottom w:val="none" w:sz="0" w:space="0" w:color="000000"/>
+                <w:top w:val="none" w:sz="0" w:space="0" w:color="000000"/>
+                <w:left w:val="none" w:sz="0" w:space="0" w:color="000000"/>
+                <w:right w:val="none" w:sz="0" w:space="0" w:color="000000"/>
+              </w:pBdr>
+              <w:spacing w:after="100" w:before="100" w:line="240"/>
+              <w:ind w:left="100" w:right="100" w:firstLine="0" w:firstLineChars="0"/>
+              <w:rPr>
+                <w:rFonts w:ascii="Helvetica" w:hAnsi="Helvetica" w:eastAsia="Helvetica" w:cs="Helvetica"/>
+                <w:i w:val="false"/>
+                <w:b w:val="false"/>
+                <w:u w:val="none"/>
+                <w:strike w:val="false"/>
+                <w:sz w:val="22"/>
+                <w:szCs w:val="22"/>
+                <w:color w:val="000000"/>
+              </w:rPr>
+            </w:pPr>
+            <w:r>
+              <w:rPr>
+                <w:rFonts w:ascii="Helvetica" w:hAnsi="Helvetica" w:eastAsia="Helvetica" w:cs="Helvetica"/>
+                <w:i w:val="false"/>
+                <w:b w:val="false"/>
+                <w:u w:val="none"/>
+                <w:strike w:val="false"/>
+                <w:sz w:val="22"/>
+                <w:szCs w:val="22"/>
+                <w:color w:val="000000"/>
+              </w:rPr>
               <w:t xml:space="preserve">-0.11</w:t>
             </w:r>
-            <w:r>
-              <w:rPr>
-                <w:rFonts w:ascii="Helvetica" w:hAnsi="Helvetica" w:eastAsia="Helvetica" w:cs="Helvetica"/>
-                <w:i w:val="false"/>
-                <w:b w:val="false"/>
-                <w:u w:val="none"/>
-                <w:strike w:val="false"/>
-                <w:sz w:val="22"/>
-                <w:szCs w:val="22"/>
-                <w:color w:val="000000"/>
-              </w:rPr>
-              <w:br/>
-            </w:r>
-            <w:r>
-              <w:rPr>
-                <w:rFonts w:ascii="Helvetica" w:hAnsi="Helvetica" w:eastAsia="Helvetica" w:cs="Helvetica"/>
-                <w:i w:val="false"/>
-                <w:b w:val="false"/>
-                <w:u w:val="none"/>
-                <w:strike w:val="false"/>
-                <w:sz w:val="22"/>
-                <w:szCs w:val="22"/>
-                <w:color w:val="000000"/>
-              </w:rPr>
-              <w:t xml:space="preserve">[-0.32, 0.10]</w:t>
-            </w:r>
           </w:p>
         </w:tc>
         <w:tc>
@@ -4323,34 +6012,63 @@
                 <w:szCs w:val="22"/>
                 <w:color w:val="000000"/>
               </w:rPr>
+              <w:t xml:space="preserve">(-0.31, 0.10)</w:t>
+            </w:r>
+          </w:p>
+        </w:tc>
+        <w:tc>
+          <w:tcPr>
+            <w:tcBorders>
+              <w:bottom w:val="single" w:sz="12" w:space="0" w:color="666666"/>
+              <w:top w:val="none" w:sz="0" w:space="0" w:color="000000"/>
+              <w:left w:val="none" w:sz="0" w:space="0" w:color="000000"/>
+              <w:right w:val="none" w:sz="0" w:space="0" w:color="000000"/>
+            </w:tcBorders>
+            <w:shd w:val="clear" w:color="auto" w:fill="FFFFFF"/>
+            <w:tcMar>
+              <w:top w:w="0" w:type="dxa"/>
+              <w:bottom w:w="0" w:type="dxa"/>
+              <w:left w:w="0" w:type="dxa"/>
+              <w:right w:w="0" w:type="dxa"/>
+            </w:tcMar>
+            <w:vAlign w:val="center"/>
+          </w:tcPr>
+          <w:p>
+            <w:pPr>
+              <w:pStyle w:val="Normal"/>
+              <w:jc w:val="left"/>
+              <w:pBdr>
+                <w:bottom w:val="none" w:sz="0" w:space="0" w:color="000000"/>
+                <w:top w:val="none" w:sz="0" w:space="0" w:color="000000"/>
+                <w:left w:val="none" w:sz="0" w:space="0" w:color="000000"/>
+                <w:right w:val="none" w:sz="0" w:space="0" w:color="000000"/>
+              </w:pBdr>
+              <w:spacing w:after="100" w:before="100" w:line="240"/>
+              <w:ind w:left="100" w:right="100" w:firstLine="0" w:firstLineChars="0"/>
+              <w:rPr>
+                <w:rFonts w:ascii="Helvetica" w:hAnsi="Helvetica" w:eastAsia="Helvetica" w:cs="Helvetica"/>
+                <w:i w:val="false"/>
+                <w:b w:val="false"/>
+                <w:u w:val="none"/>
+                <w:strike w:val="false"/>
+                <w:sz w:val="22"/>
+                <w:szCs w:val="22"/>
+                <w:color w:val="000000"/>
+              </w:rPr>
+            </w:pPr>
+            <w:r>
+              <w:rPr>
+                <w:rFonts w:ascii="Helvetica" w:hAnsi="Helvetica" w:eastAsia="Helvetica" w:cs="Helvetica"/>
+                <w:i w:val="false"/>
+                <w:b w:val="false"/>
+                <w:u w:val="none"/>
+                <w:strike w:val="false"/>
+                <w:sz w:val="22"/>
+                <w:szCs w:val="22"/>
+                <w:color w:val="000000"/>
+              </w:rPr>
               <w:t xml:space="preserve">-0.11</w:t>
             </w:r>
-            <w:r>
-              <w:rPr>
-                <w:rFonts w:ascii="Helvetica" w:hAnsi="Helvetica" w:eastAsia="Helvetica" w:cs="Helvetica"/>
-                <w:i w:val="false"/>
-                <w:b w:val="false"/>
-                <w:u w:val="none"/>
-                <w:strike w:val="false"/>
-                <w:sz w:val="22"/>
-                <w:szCs w:val="22"/>
-                <w:color w:val="000000"/>
-              </w:rPr>
-              <w:br/>
-            </w:r>
-            <w:r>
-              <w:rPr>
-                <w:rFonts w:ascii="Helvetica" w:hAnsi="Helvetica" w:eastAsia="Helvetica" w:cs="Helvetica"/>
-                <w:i w:val="false"/>
-                <w:b w:val="false"/>
-                <w:u w:val="none"/>
-                <w:strike w:val="false"/>
-                <w:sz w:val="22"/>
-                <w:szCs w:val="22"/>
-                <w:color w:val="000000"/>
-              </w:rPr>
-              <w:t xml:space="preserve">[-0.32, 0.10]</w:t>
-            </w:r>
           </w:p>
         </w:tc>
         <w:tc>
@@ -4404,34 +6122,63 @@
                 <w:szCs w:val="22"/>
                 <w:color w:val="000000"/>
               </w:rPr>
+              <w:t xml:space="preserve">(-0.32, 0.10)</w:t>
+            </w:r>
+          </w:p>
+        </w:tc>
+        <w:tc>
+          <w:tcPr>
+            <w:tcBorders>
+              <w:bottom w:val="single" w:sz="12" w:space="0" w:color="666666"/>
+              <w:top w:val="none" w:sz="0" w:space="0" w:color="000000"/>
+              <w:left w:val="none" w:sz="0" w:space="0" w:color="000000"/>
+              <w:right w:val="none" w:sz="0" w:space="0" w:color="000000"/>
+            </w:tcBorders>
+            <w:shd w:val="clear" w:color="auto" w:fill="FFFFFF"/>
+            <w:tcMar>
+              <w:top w:w="0" w:type="dxa"/>
+              <w:bottom w:w="0" w:type="dxa"/>
+              <w:left w:w="0" w:type="dxa"/>
+              <w:right w:w="0" w:type="dxa"/>
+            </w:tcMar>
+            <w:vAlign w:val="center"/>
+          </w:tcPr>
+          <w:p>
+            <w:pPr>
+              <w:pStyle w:val="Normal"/>
+              <w:jc w:val="left"/>
+              <w:pBdr>
+                <w:bottom w:val="none" w:sz="0" w:space="0" w:color="000000"/>
+                <w:top w:val="none" w:sz="0" w:space="0" w:color="000000"/>
+                <w:left w:val="none" w:sz="0" w:space="0" w:color="000000"/>
+                <w:right w:val="none" w:sz="0" w:space="0" w:color="000000"/>
+              </w:pBdr>
+              <w:spacing w:after="100" w:before="100" w:line="240"/>
+              <w:ind w:left="100" w:right="100" w:firstLine="0" w:firstLineChars="0"/>
+              <w:rPr>
+                <w:rFonts w:ascii="Helvetica" w:hAnsi="Helvetica" w:eastAsia="Helvetica" w:cs="Helvetica"/>
+                <w:i w:val="false"/>
+                <w:b w:val="false"/>
+                <w:u w:val="none"/>
+                <w:strike w:val="false"/>
+                <w:sz w:val="22"/>
+                <w:szCs w:val="22"/>
+                <w:color w:val="000000"/>
+              </w:rPr>
+            </w:pPr>
+            <w:r>
+              <w:rPr>
+                <w:rFonts w:ascii="Helvetica" w:hAnsi="Helvetica" w:eastAsia="Helvetica" w:cs="Helvetica"/>
+                <w:i w:val="false"/>
+                <w:b w:val="false"/>
+                <w:u w:val="none"/>
+                <w:strike w:val="false"/>
+                <w:sz w:val="22"/>
+                <w:szCs w:val="22"/>
+                <w:color w:val="000000"/>
+              </w:rPr>
               <w:t xml:space="preserve">-0.11</w:t>
             </w:r>
-            <w:r>
-              <w:rPr>
-                <w:rFonts w:ascii="Helvetica" w:hAnsi="Helvetica" w:eastAsia="Helvetica" w:cs="Helvetica"/>
-                <w:i w:val="false"/>
-                <w:b w:val="false"/>
-                <w:u w:val="none"/>
-                <w:strike w:val="false"/>
-                <w:sz w:val="22"/>
-                <w:szCs w:val="22"/>
-                <w:color w:val="000000"/>
-              </w:rPr>
-              <w:br/>
-            </w:r>
-            <w:r>
-              <w:rPr>
-                <w:rFonts w:ascii="Helvetica" w:hAnsi="Helvetica" w:eastAsia="Helvetica" w:cs="Helvetica"/>
-                <w:i w:val="false"/>
-                <w:b w:val="false"/>
-                <w:u w:val="none"/>
-                <w:strike w:val="false"/>
-                <w:sz w:val="22"/>
-                <w:szCs w:val="22"/>
-                <w:color w:val="000000"/>
-              </w:rPr>
-              <w:t xml:space="preserve">[-0.32, 0.10]</w:t>
-            </w:r>
           </w:p>
         </w:tc>
         <w:tc>
@@ -4485,33 +6232,117 @@
                 <w:szCs w:val="22"/>
                 <w:color w:val="000000"/>
               </w:rPr>
+              <w:t xml:space="preserve">(-0.32, 0.10)</w:t>
+            </w:r>
+          </w:p>
+        </w:tc>
+        <w:tc>
+          <w:tcPr>
+            <w:tcBorders>
+              <w:bottom w:val="single" w:sz="12" w:space="0" w:color="666666"/>
+              <w:top w:val="none" w:sz="0" w:space="0" w:color="000000"/>
+              <w:left w:val="none" w:sz="0" w:space="0" w:color="000000"/>
+              <w:right w:val="none" w:sz="0" w:space="0" w:color="000000"/>
+            </w:tcBorders>
+            <w:shd w:val="clear" w:color="auto" w:fill="FFFFFF"/>
+            <w:tcMar>
+              <w:top w:w="0" w:type="dxa"/>
+              <w:bottom w:w="0" w:type="dxa"/>
+              <w:left w:w="0" w:type="dxa"/>
+              <w:right w:w="0" w:type="dxa"/>
+            </w:tcMar>
+            <w:vAlign w:val="center"/>
+          </w:tcPr>
+          <w:p>
+            <w:pPr>
+              <w:pStyle w:val="Normal"/>
+              <w:jc w:val="left"/>
+              <w:pBdr>
+                <w:bottom w:val="none" w:sz="0" w:space="0" w:color="000000"/>
+                <w:top w:val="none" w:sz="0" w:space="0" w:color="000000"/>
+                <w:left w:val="none" w:sz="0" w:space="0" w:color="000000"/>
+                <w:right w:val="none" w:sz="0" w:space="0" w:color="000000"/>
+              </w:pBdr>
+              <w:spacing w:after="100" w:before="100" w:line="240"/>
+              <w:ind w:left="100" w:right="100" w:firstLine="0" w:firstLineChars="0"/>
+              <w:rPr>
+                <w:rFonts w:ascii="Helvetica" w:hAnsi="Helvetica" w:eastAsia="Helvetica" w:cs="Helvetica"/>
+                <w:i w:val="false"/>
+                <w:b w:val="false"/>
+                <w:u w:val="none"/>
+                <w:strike w:val="false"/>
+                <w:sz w:val="22"/>
+                <w:szCs w:val="22"/>
+                <w:color w:val="000000"/>
+              </w:rPr>
+            </w:pPr>
+            <w:r>
+              <w:rPr>
+                <w:rFonts w:ascii="Helvetica" w:hAnsi="Helvetica" w:eastAsia="Helvetica" w:cs="Helvetica"/>
+                <w:i w:val="false"/>
+                <w:b w:val="false"/>
+                <w:u w:val="none"/>
+                <w:strike w:val="false"/>
+                <w:sz w:val="22"/>
+                <w:szCs w:val="22"/>
+                <w:color w:val="000000"/>
+              </w:rPr>
               <w:t xml:space="preserve">-0.14</w:t>
             </w:r>
-            <w:r>
-              <w:rPr>
-                <w:rFonts w:ascii="Helvetica" w:hAnsi="Helvetica" w:eastAsia="Helvetica" w:cs="Helvetica"/>
-                <w:i w:val="false"/>
-                <w:b w:val="false"/>
-                <w:u w:val="none"/>
-                <w:strike w:val="false"/>
-                <w:sz w:val="22"/>
-                <w:szCs w:val="22"/>
-                <w:color w:val="000000"/>
-              </w:rPr>
-              <w:br/>
-            </w:r>
-            <w:r>
-              <w:rPr>
-                <w:rFonts w:ascii="Helvetica" w:hAnsi="Helvetica" w:eastAsia="Helvetica" w:cs="Helvetica"/>
-                <w:i w:val="false"/>
-                <w:b w:val="false"/>
-                <w:u w:val="none"/>
-                <w:strike w:val="false"/>
-                <w:sz w:val="22"/>
-                <w:szCs w:val="22"/>
-                <w:color w:val="000000"/>
-              </w:rPr>
-              <w:t xml:space="preserve">[-0.33, 0.05]</w:t>
+          </w:p>
+        </w:tc>
+        <w:tc>
+          <w:tcPr>
+            <w:tcBorders>
+              <w:bottom w:val="single" w:sz="12" w:space="0" w:color="666666"/>
+              <w:top w:val="none" w:sz="0" w:space="0" w:color="000000"/>
+              <w:left w:val="none" w:sz="0" w:space="0" w:color="000000"/>
+              <w:right w:val="none" w:sz="0" w:space="0" w:color="000000"/>
+            </w:tcBorders>
+            <w:shd w:val="clear" w:color="auto" w:fill="FFFFFF"/>
+            <w:tcMar>
+              <w:top w:w="0" w:type="dxa"/>
+              <w:bottom w:w="0" w:type="dxa"/>
+              <w:left w:w="0" w:type="dxa"/>
+              <w:right w:w="0" w:type="dxa"/>
+            </w:tcMar>
+            <w:vAlign w:val="center"/>
+          </w:tcPr>
+          <w:p>
+            <w:pPr>
+              <w:pStyle w:val="Normal"/>
+              <w:jc w:val="left"/>
+              <w:pBdr>
+                <w:bottom w:val="none" w:sz="0" w:space="0" w:color="000000"/>
+                <w:top w:val="none" w:sz="0" w:space="0" w:color="000000"/>
+                <w:left w:val="none" w:sz="0" w:space="0" w:color="000000"/>
+                <w:right w:val="none" w:sz="0" w:space="0" w:color="000000"/>
+              </w:pBdr>
+              <w:spacing w:after="100" w:before="100" w:line="240"/>
+              <w:ind w:left="100" w:right="100" w:firstLine="0" w:firstLineChars="0"/>
+              <w:rPr>
+                <w:rFonts w:ascii="Helvetica" w:hAnsi="Helvetica" w:eastAsia="Helvetica" w:cs="Helvetica"/>
+                <w:i w:val="false"/>
+                <w:b w:val="false"/>
+                <w:u w:val="none"/>
+                <w:strike w:val="false"/>
+                <w:sz w:val="22"/>
+                <w:szCs w:val="22"/>
+                <w:color w:val="000000"/>
+              </w:rPr>
+            </w:pPr>
+            <w:r>
+              <w:rPr>
+                <w:rFonts w:ascii="Helvetica" w:hAnsi="Helvetica" w:eastAsia="Helvetica" w:cs="Helvetica"/>
+                <w:i w:val="false"/>
+                <w:b w:val="false"/>
+                <w:u w:val="none"/>
+                <w:strike w:val="false"/>
+                <w:sz w:val="22"/>
+                <w:szCs w:val="22"/>
+                <w:color w:val="000000"/>
+              </w:rPr>
+              <w:t xml:space="preserve">(-0.33, 0.05)</w:t>
             </w:r>
           </w:p>
         </w:tc>
@@ -4522,7 +6353,7 @@
         </w:trPr>
         <w:tc>
           <w:tcPr>
-            <w:gridSpan w:val="7"/>
+            <w:gridSpan w:val="12"/>
             <w:tcBorders>
               <w:bottom w:val="none" w:sz="0" w:space="0" w:color="FFFFFF"/>
               <w:top w:val="single" w:sz="12" w:space="0" w:color="666666"/>
@@ -4561,6 +6392,32 @@
                 <w:color w:val="000000"/>
               </w:rPr>
             </w:pPr>
+            <w:r>
+              <w:rPr>
+                <w:rFonts w:ascii="Helvetica" w:hAnsi="Helvetica" w:eastAsia="Helvetica" w:cs="Helvetica"/>
+                <w:i w:val="false"/>
+                <w:b w:val="false"/>
+                <w:u w:val="none"/>
+                <w:strike w:val="false"/>
+                <w:sz w:val="22"/>
+                <w:szCs w:val="22"/>
+                <w:color w:val="000000"/>
+              </w:rPr>
+              <w:t xml:space="preserve">CI = Confidence Interval</w:t>
+            </w:r>
+            <w:r>
+              <w:rPr>
+                <w:rFonts w:ascii="Helvetica" w:hAnsi="Helvetica" w:eastAsia="Helvetica" w:cs="Helvetica"/>
+                <w:i w:val="false"/>
+                <w:b w:val="false"/>
+                <w:u w:val="none"/>
+                <w:strike w:val="false"/>
+                <w:sz w:val="22"/>
+                <w:szCs w:val="22"/>
+                <w:color w:val="000000"/>
+              </w:rPr>
+              <w:br/>
+            </w:r>
             <w:r>
               <w:rPr>
                 <w:rFonts w:ascii="Helvetica" w:hAnsi="Helvetica" w:eastAsia="Helvetica" w:cs="Helvetica"/>

</xml_diff>